<commit_message>
feat: file types, delivery_date, approvers, service note fixes
- purchase_files: add file_type field (КП/Служебная/Протокол/Счёт/Приказ/УПД/Договор/Акт/Прочее)
- upload dialog: select type before upload; chip badge on each file with inline type edit
- purchases: add delivery_date and responsible_person fields
- subsidy_approvers: new table + CRUD router for per-subsidy approver config
- documents: approval_sheet uses dynamic approvers loop; service_note fixed (no role, no duplicate basis)
- approval_sheet: basis = "Позиция плана-графика {{registry_number}}"
- service_note: only initiator FIO shown, no role
- CreateOrderView: purchase_basis field removed (basis = registry_number now)

Co-Authored-By: Claude Sonnet 4.6 <noreply@anthropic.com>
</commit_message>
<xml_diff>
--- a/backend/templates/approval_sheet.docx
+++ b/backend/templates/approval_sheet.docx
@@ -1,6 +1,6 @@
 
 <file path=word/document.xml><?xml version="1.0" encoding="utf-8"?>
-<w:document xmlns:wpc="http://schemas.microsoft.com/office/word/2010/wordprocessingCanvas" xmlns:cx="http://schemas.microsoft.com/office/drawing/2014/chartex" xmlns:cx1="http://schemas.microsoft.com/office/drawing/2015/9/8/chartex" xmlns:cx2="http://schemas.microsoft.com/office/drawing/2015/10/21/chartex" xmlns:cx3="http://schemas.microsoft.com/office/drawing/2016/5/9/chartex" xmlns:cx4="http://schemas.microsoft.com/office/drawing/2016/5/10/chartex" xmlns:cx5="http://schemas.microsoft.com/office/drawing/2016/5/11/chartex" xmlns:cx6="http://schemas.microsoft.com/office/drawing/2016/5/12/chartex" xmlns:cx7="http://schemas.microsoft.com/office/drawing/2016/5/13/chartex" xmlns:cx8="http://schemas.microsoft.com/office/drawing/2016/5/14/chartex" xmlns:mc="http://schemas.openxmlformats.org/markup-compatibility/2006" xmlns:aink="http://schemas.microsoft.com/office/drawing/2016/ink" xmlns:am3d="http://schemas.microsoft.com/office/drawing/2017/model3d" xmlns:o="urn:schemas-microsoft-com:office:office" xmlns:oel="http://schemas.microsoft.com/office/2019/extlst" xmlns:r="http://schemas.openxmlformats.org/officeDocument/2006/relationships" xmlns:m="http://schemas.openxmlformats.org/officeDocument/2006/math" xmlns:v="urn:schemas-microsoft-com:vml" xmlns:wp14="http://schemas.microsoft.com/office/word/2010/wordprocessingDrawing" xmlns:wp="http://schemas.openxmlformats.org/drawingml/2006/wordprocessingDrawing" xmlns:w10="urn:schemas-microsoft-com:office:word" xmlns:w="http://schemas.openxmlformats.org/wordprocessingml/2006/main" xmlns:w14="http://schemas.microsoft.com/office/word/2010/wordml" xmlns:w15="http://schemas.microsoft.com/office/word/2012/wordml" xmlns:w16cex="http://schemas.microsoft.com/office/word/2018/wordml/cex" xmlns:w16cid="http://schemas.microsoft.com/office/word/2016/wordml/cid" xmlns:w16="http://schemas.microsoft.com/office/word/2018/wordml" xmlns:w16du="http://schemas.microsoft.com/office/word/2023/wordml/word16du" xmlns:w16sdtdh="http://schemas.microsoft.com/office/word/2020/wordml/sdtdatahash" xmlns:w16sdtfl="http://schemas.microsoft.com/office/word/2024/wordml/sdtformatlock" xmlns:w16se="http://schemas.microsoft.com/office/word/2015/wordml/symex" xmlns:wpg="http://schemas.microsoft.com/office/word/2010/wordprocessingGroup" xmlns:wpi="http://schemas.microsoft.com/office/word/2010/wordprocessingInk" xmlns:wne="http://schemas.microsoft.com/office/word/2006/wordml" xmlns:wps="http://schemas.microsoft.com/office/word/2010/wordprocessingShape" mc:Ignorable="w14 w15 w16se w16cid w16 w16cex w16sdtdh w16sdtfl w16du wp14">
+<w:document xmlns:wpc="http://schemas.microsoft.com/office/word/2010/wordprocessingCanvas" xmlns:cx="http://schemas.microsoft.com/office/drawing/2014/chartex" xmlns:cx1="http://schemas.microsoft.com/office/drawing/2015/9/8/chartex" xmlns:cx2="http://schemas.microsoft.com/office/drawing/2015/10/21/chartex" xmlns:cx3="http://schemas.microsoft.com/office/drawing/2016/5/9/chartex" xmlns:cx4="http://schemas.microsoft.com/office/drawing/2016/5/10/chartex" xmlns:cx5="http://schemas.microsoft.com/office/drawing/2016/5/11/chartex" xmlns:cx6="http://schemas.microsoft.com/office/drawing/2016/5/12/chartex" xmlns:cx7="http://schemas.microsoft.com/office/drawing/2016/5/13/chartex" xmlns:cx8="http://schemas.microsoft.com/office/drawing/2016/5/14/chartex" xmlns:mc="http://schemas.openxmlformats.org/markup-compatibility/2006" xmlns:aink="http://schemas.microsoft.com/office/drawing/2016/ink" xmlns:am3d="http://schemas.microsoft.com/office/drawing/2017/model3d" xmlns:o="urn:schemas-microsoft-com:office:office" xmlns:oel="http://schemas.microsoft.com/office/2019/extlst" xmlns:r="http://schemas.openxmlformats.org/officeDocument/2006/relationships" xmlns:m="http://schemas.openxmlformats.org/officeDocument/2006/math" xmlns:v="urn:schemas-microsoft-com:vml" xmlns:wp14="http://schemas.microsoft.com/office/word/2010/wordprocessingDrawing" xmlns:wp="http://schemas.openxmlformats.org/drawingml/2006/wordprocessingDrawing" xmlns:w10="urn:schemas-microsoft-com:office:word" xmlns:w="http://schemas.openxmlformats.org/wordprocessingml/2006/main" xmlns:w14="http://schemas.microsoft.com/office/word/2010/wordml" xmlns:w15="http://schemas.microsoft.com/office/word/2012/wordml" xmlns:w16cex="http://schemas.microsoft.com/office/word/2018/wordml/cex" xmlns:w16cid="http://schemas.microsoft.com/office/word/2016/wordml/cid" xmlns:w16="http://schemas.microsoft.com/office/word/2018/wordml" xmlns:w16sdtdh="http://schemas.microsoft.com/office/word/2020/wordml/sdtdatahash" xmlns:w16se="http://schemas.microsoft.com/office/word/2015/wordml/symex" xmlns:wpg="http://schemas.microsoft.com/office/word/2010/wordprocessingGroup" xmlns:wpi="http://schemas.microsoft.com/office/word/2010/wordprocessingInk" xmlns:wne="http://schemas.microsoft.com/office/word/2006/wordml" xmlns:wps="http://schemas.microsoft.com/office/word/2010/wordprocessingShape" mc:Ignorable="w14 w15 w16se w16cid w16 w16cex w16sdtdh wp14">
   <w:body>
     <w:tbl>
       <w:tblPr>
@@ -597,7 +597,7 @@
                 <w:bCs/>
                 <w:sz w:val="26"/>
                 <w:szCs w:val="26"/>
-                <w:lang w:eastAsia="en-US"/>
+                <w:lang w:val="en-US" w:eastAsia="en-US"/>
               </w:rPr>
             </w:pPr>
             <w:r>
@@ -609,8 +609,9 @@
                 <w:szCs w:val="26"/>
                 <w:lang w:eastAsia="en-US"/>
               </w:rPr>
-              <w:t xml:space="preserve">                           от {{today}}</w:t>
-            </w:r>
+              <w:t xml:space="preserve">                           от {{</w:t>
+            </w:r>
+            <w:proofErr w:type="spellStart"/>
             <w:r>
               <w:rPr>
                 <w:rFonts w:eastAsia="TimesNewRomanPSMT"/>
@@ -620,7 +621,9 @@
                 <w:szCs w:val="26"/>
                 <w:lang w:eastAsia="en-US"/>
               </w:rPr>
-            </w:r>
+              <w:t>today</w:t>
+            </w:r>
+            <w:proofErr w:type="spellEnd"/>
             <w:r>
               <w:rPr>
                 <w:rFonts w:eastAsia="TimesNewRomanPSMT"/>
@@ -630,6 +633,7 @@
                 <w:szCs w:val="26"/>
                 <w:lang w:eastAsia="en-US"/>
               </w:rPr>
+              <w:t>}</w:t>
             </w:r>
             <w:r>
               <w:rPr>
@@ -638,114 +642,9 @@
                 <w:bCs/>
                 <w:sz w:val="26"/>
                 <w:szCs w:val="26"/>
-                <w:lang w:eastAsia="en-US"/>
-              </w:rPr>
-            </w:r>
-            <w:r>
-              <w:rPr>
-                <w:rFonts w:eastAsia="TimesNewRomanPSMT"/>
-                <w:b/>
-                <w:bCs/>
-                <w:sz w:val="26"/>
-                <w:szCs w:val="26"/>
-                <w:lang w:eastAsia="en-US"/>
-              </w:rPr>
-            </w:r>
-            <w:r>
-              <w:rPr>
-                <w:rFonts w:eastAsia="TimesNewRomanPSMT"/>
-                <w:b/>
-                <w:bCs/>
-                <w:sz w:val="26"/>
-                <w:szCs w:val="26"/>
-                <w:lang w:eastAsia="en-US"/>
-              </w:rPr>
-            </w:r>
-            <w:r>
-              <w:rPr>
-                <w:rFonts w:eastAsia="TimesNewRomanPSMT"/>
-                <w:b/>
-                <w:bCs/>
-                <w:sz w:val="26"/>
-                <w:szCs w:val="26"/>
-                <w:lang w:eastAsia="en-US"/>
-              </w:rPr>
-            </w:r>
-            <w:sdt>
-              <w:sdtPr>
-                <w:rPr>
-                  <w:rFonts w:eastAsia="TimesNewRomanPSMT"/>
-                  <w:b/>
-                  <w:bCs/>
-                  <w:sz w:val="26"/>
-                  <w:szCs w:val="26"/>
-                  <w:lang w:eastAsia="en-US"/>
-                </w:rPr>
-                <w:alias w:val="Месяца"/>
-                <w:tag w:val="Месяца"/>
-                <w:id w:val="1059824071"/>
-                <w:placeholder>
-                  <w:docPart w:val="DefaultPlaceholder_-1854013438"/>
-                </w:placeholder>
-                <w:dropDownList>
-                  <w:listItem w:value="Выберите элемент."/>
-                  <w:listItem w:displayText="января" w:value="января"/>
-                  <w:listItem w:displayText="февраля" w:value="февраля"/>
-                  <w:listItem w:displayText="марта" w:value="марта"/>
-                  <w:listItem w:displayText="апреля" w:value="апреля"/>
-                  <w:listItem w:displayText="мая" w:value="мая"/>
-                  <w:listItem w:displayText="июня" w:value="июня"/>
-                  <w:listItem w:displayText="июля" w:value="июля"/>
-                  <w:listItem w:displayText="августа" w:value="августа"/>
-                  <w:listItem w:displayText="сентября" w:value="сентября"/>
-                  <w:listItem w:displayText="октября" w:value="октября"/>
-                  <w:listItem w:displayText="ноября" w:value="ноября"/>
-                  <w:listItem w:displayText="декабря" w:value="декабря"/>
-                </w:dropDownList>
-              </w:sdtPr>
-              <w:sdtContent>
-                <w:r>
-                  <w:rPr>
-                    <w:rFonts w:eastAsia="TimesNewRomanPSMT"/>
-                    <w:b/>
-                    <w:bCs/>
-                    <w:sz w:val="26"/>
-                    <w:szCs w:val="26"/>
-                    <w:lang w:eastAsia="en-US"/>
-                  </w:rPr>
-                  <w:t>ноября</w:t>
-                </w:r>
-              </w:sdtContent>
-            </w:sdt>
-            <w:r>
-              <w:rPr>
-                <w:rFonts w:eastAsia="TimesNewRomanPSMT"/>
-                <w:b/>
-                <w:bCs/>
-                <w:sz w:val="26"/>
-                <w:szCs w:val="26"/>
-                <w:lang w:eastAsia="en-US"/>
-              </w:rPr>
-            </w:r>
-            <w:r>
-              <w:rPr>
-                <w:rFonts w:eastAsia="TimesNewRomanPSMT"/>
-                <w:b/>
-                <w:bCs/>
-                <w:sz w:val="26"/>
-                <w:szCs w:val="26"/>
-                <w:lang w:eastAsia="en-US"/>
-              </w:rPr>
-            </w:r>
-            <w:r>
-              <w:rPr>
-                <w:rFonts w:eastAsia="TimesNewRomanPSMT"/>
-                <w:b/>
-                <w:bCs/>
-                <w:sz w:val="26"/>
-                <w:szCs w:val="26"/>
-                <w:lang w:eastAsia="en-US"/>
-              </w:rPr>
+                <w:lang w:val="en-US" w:eastAsia="en-US"/>
+              </w:rPr>
+              <w:t>}</w:t>
             </w:r>
           </w:p>
         </w:tc>
@@ -776,21 +675,23 @@
           <w:b/>
           <w:bCs/>
         </w:rPr>
-        <w:t>Предмет договора: {{item_names}}</w:t>
+        <w:t>Предмет договора: {{</w:t>
       </w:r>
+      <w:proofErr w:type="spellStart"/>
       <w:r>
         <w:rPr>
-          <w:noProof/>
-          <w:u w:val="single"/>
-          <w:lang w:eastAsia="ru-RU"/>
+          <w:b/>
+          <w:bCs/>
         </w:rPr>
+        <w:t>item_names</w:t>
       </w:r>
+      <w:proofErr w:type="spellEnd"/>
       <w:r>
         <w:rPr>
-          <w:noProof/>
-          <w:u w:val="single"/>
-          <w:lang w:eastAsia="ru-RU"/>
+          <w:b/>
+          <w:bCs/>
         </w:rPr>
+        <w:t>}}</w:t>
       </w:r>
     </w:p>
     <w:p>
@@ -807,48 +708,24 @@
           <w:b/>
           <w:bCs/>
         </w:rPr>
-        <w:t>Способ определения поставщика: {{purchase_method}}</w:t>
+        <w:t>Способ определения поставщика: {{</w:t>
       </w:r>
+      <w:proofErr w:type="spellStart"/>
       <w:r>
         <w:rPr>
           <w:b/>
           <w:bCs/>
         </w:rPr>
+        <w:t>purchase_method</w:t>
       </w:r>
+      <w:proofErr w:type="spellEnd"/>
       <w:r>
         <w:rPr>
           <w:b/>
           <w:bCs/>
         </w:rPr>
+        <w:t>}}</w:t>
       </w:r>
-      <w:r/>
-      <w:sdt>
-        <w:sdtPr>
-          <w:rPr>
-            <w:u w:val="single"/>
-          </w:rPr>
-          <w:alias w:val="Определения поставщика"/>
-          <w:tag w:val="Определения поставщика"/>
-          <w:id w:val="674535211"/>
-          <w:placeholder>
-            <w:docPart w:val="DefaultPlaceholder_-1854013438"/>
-          </w:placeholder>
-          <w:dropDownList>
-            <w:listItem w:value="Выберите элемент."/>
-            <w:listItem w:displayText="Конкурентная закупка" w:value="Конкурентная закупка"/>
-            <w:listItem w:displayText="Ед. поставщик" w:value="Ед. поставщик"/>
-            <w:listItem w:displayText="Ед. поставщик ( производитель)" w:value="Ед. поставщик ( производитель)"/>
-          </w:dropDownList>
-        </w:sdtPr>
-        <w:sdtContent>
-          <w:r>
-            <w:rPr>
-              <w:u w:val="single"/>
-            </w:rPr>
-            <w:t>Ед. поставщик</w:t>
-          </w:r>
-        </w:sdtContent>
-      </w:sdt>
     </w:p>
     <w:p>
       <w:pPr>
@@ -868,12 +745,6 @@
           <w:bCs/>
         </w:rPr>
         <w:t>Контрагент: {{contractor_name}}</w:t>
-      </w:r>
-      <w:r/>
-      <w:r>
-        <w:rPr>
-          <w:u w:val="single"/>
-        </w:rPr>
       </w:r>
     </w:p>
     <w:p>
@@ -896,19 +767,6 @@
         </w:rPr>
         <w:t>ИНН контрагента: {{contractor_inn}}</w:t>
       </w:r>
-      <w:r>
-        <w:rPr>
-          <w:b/>
-          <w:bCs/>
-        </w:rPr>
-      </w:r>
-      <w:r>
-        <w:rPr>
-          <w:iCs/>
-          <w:color w:val="000000"/>
-          <w:u w:val="single"/>
-        </w:rPr>
-      </w:r>
     </w:p>
     <w:p>
       <w:pPr>
@@ -929,46 +787,6 @@
         </w:rPr>
         <w:t>Цена договора: {{contract_price}}, без НДС. НМЦК: {{total_nmck}}</w:t>
       </w:r>
-      <w:r>
-        <w:rPr>
-          <w:b/>
-          <w:bCs/>
-        </w:rPr>
-      </w:r>
-      <w:r>
-        <w:rPr>
-          <w:b/>
-          <w:bCs/>
-        </w:rPr>
-      </w:r>
-      <w:r>
-        <w:rPr>
-          <w:b/>
-          <w:bCs/>
-        </w:rPr>
-      </w:r>
-      <w:r>
-        <w:rPr>
-          <w:b/>
-          <w:bCs/>
-        </w:rPr>
-      </w:r>
-      <w:r>
-        <w:rPr>
-          <w:b/>
-          <w:bCs/>
-        </w:rPr>
-      </w:r>
-      <w:r>
-        <w:rPr>
-          <w:u w:val="single"/>
-        </w:rPr>
-      </w:r>
-      <w:r>
-        <w:rPr>
-          <w:u w:val="single"/>
-        </w:rPr>
-      </w:r>
     </w:p>
     <w:p>
       <w:pPr>
@@ -987,38 +805,24 @@
           <w:b/>
           <w:bCs/>
         </w:rPr>
-        <w:t>Источник финансирования: {{subsidy_name}}</w:t>
+        <w:t>Источник финансирования: {{</w:t>
       </w:r>
-      <w:sdt>
-        <w:sdtPr>
-          <w:rPr>
-            <w:u w:val="single"/>
-          </w:rPr>
-          <w:alias w:val="Субсидии"/>
-          <w:tag w:val="Субсидии"/>
-          <w:id w:val="-2066172253"/>
-          <w:placeholder>
-            <w:docPart w:val="DefaultPlaceholder_-1854013438"/>
-          </w:placeholder>
-          <w:dropDownList>
-            <w:listItem w:value="Выберите элемент."/>
-            <w:listItem w:displayText="Субсидия Росмолодежь" w:value="Субсидия Росмолодежь"/>
-            <w:listItem w:displayText="Грант ФПГ Донецк" w:value="Грант ФПГ Донецк"/>
-            <w:listItem w:displayText="Грант ФПГ Луганск" w:value="Грант ФПГ Луганск"/>
-            <w:listItem w:displayText="Субсдия Минпросвет" w:value="Субсдия Минпросвет"/>
-            <w:listItem w:displayText="Субсидия Минтруд" w:value="Субсидия Минтруд"/>
-            <w:listItem w:displayText="Грант ФПГ Запорожье" w:value="Грант ФПГ Запорожье"/>
-          </w:dropDownList>
-        </w:sdtPr>
-        <w:sdtContent>
-          <w:r>
-            <w:rPr>
-              <w:u w:val="single"/>
-            </w:rPr>
-            <w:t>Субсдия Минпросвет</w:t>
-          </w:r>
-        </w:sdtContent>
-      </w:sdt>
+      <w:proofErr w:type="spellStart"/>
+      <w:r>
+        <w:rPr>
+          <w:b/>
+          <w:bCs/>
+        </w:rPr>
+        <w:t>subsidy_name</w:t>
+      </w:r>
+      <w:proofErr w:type="spellEnd"/>
+      <w:r>
+        <w:rPr>
+          <w:b/>
+          <w:bCs/>
+        </w:rPr>
+        <w:t>}}</w:t>
+      </w:r>
     </w:p>
     <w:p>
       <w:pPr>
@@ -1038,30 +842,7 @@
           <w:b/>
           <w:bCs/>
         </w:rPr>
-        <w:t>Основание: реестровый номер {{registry_number}}, договор № {{contract_number}} от {{contract_date}}</w:t>
-      </w:r>
-      <w:r>
-        <w:rPr>
-          <w:b/>
-          <w:bCs/>
-        </w:rPr>
-      </w:r>
-      <w:r>
-        <w:rPr>
-          <w:b/>
-          <w:bCs/>
-        </w:rPr>
-      </w:r>
-      <w:r>
-        <w:rPr>
-          <w:b/>
-          <w:bCs/>
-        </w:rPr>
-      </w:r>
-      <w:r>
-        <w:rPr>
-          <w:u w:val="single"/>
-        </w:rPr>
+        <w:t>Основание: Позиция плана-графика {{registry_number}}, договор № {{contract_number}} от {{contract_date}}</w:t>
       </w:r>
     </w:p>
     <w:p>
@@ -1203,24 +984,8 @@
             <w:vAlign w:val="center"/>
           </w:tcPr>
           <w:p>
-            <w:pPr>
-              <w:tabs>
-                <w:tab w:val="left" w:pos="8222"/>
-              </w:tabs>
-              <w:spacing w:line="276" w:lineRule="auto"/>
-              <w:ind w:right="-177"/>
-              <w:jc w:val="center"/>
-              <w:rPr>
-                <w:b/>
-                <w:bCs/>
-              </w:rPr>
-            </w:pPr>
-            <w:r>
-              <w:rPr>
-                <w:b/>
-                <w:bCs/>
-              </w:rPr>
-              <w:t>1</w:t>
+            <w:r>
+              <w:t xml:space="preserve">{%tr for a in approvers %}</w:t>
             </w:r>
           </w:p>
         </w:tc>
@@ -1230,52 +995,8 @@
             <w:vAlign w:val="center"/>
           </w:tcPr>
           <w:p>
-            <w:pPr>
-              <w:tabs>
-                <w:tab w:val="left" w:pos="8222"/>
-              </w:tabs>
-              <w:spacing w:line="276" w:lineRule="auto"/>
-              <w:ind w:right="-177"/>
-              <w:jc w:val="center"/>
-              <w:rPr>
-                <w:b/>
-                <w:bCs/>
-              </w:rPr>
-            </w:pPr>
-            <w:r>
-              <w:rPr>
-                <w:b/>
-                <w:bCs/>
-              </w:rPr>
-              <w:t>Первый заместитель руководителя</w:t>
-            </w:r>
-          </w:p>
-          <w:p>
-            <w:pPr>
-              <w:tabs>
-                <w:tab w:val="left" w:pos="8222"/>
-              </w:tabs>
-              <w:spacing w:line="276" w:lineRule="auto"/>
-              <w:ind w:right="-177"/>
-              <w:jc w:val="center"/>
-              <w:rPr>
-                <w:b/>
-                <w:bCs/>
-              </w:rPr>
-            </w:pPr>
-            <w:proofErr w:type="spellStart"/>
-            <w:r>
-              <w:rPr>
-                <w:u w:val="single"/>
-              </w:rPr>
-              <w:t>Маркодеева</w:t>
-            </w:r>
-            <w:proofErr w:type="spellEnd"/>
-            <w:r>
-              <w:rPr>
-                <w:u w:val="single"/>
-              </w:rPr>
-              <w:t xml:space="preserve"> А.О.</w:t>
+            <w:r>
+              <w:t xml:space="preserve"/>
             </w:r>
           </w:p>
         </w:tc>
@@ -1284,18 +1005,9 @@
             <w:tcW w:w="1843" w:type="dxa"/>
           </w:tcPr>
           <w:p>
-            <w:pPr>
-              <w:tabs>
-                <w:tab w:val="left" w:pos="8222"/>
-              </w:tabs>
-              <w:spacing w:line="276" w:lineRule="auto"/>
-              <w:ind w:right="-177"/>
-              <w:jc w:val="center"/>
-              <w:rPr>
-                <w:b/>
-                <w:bCs/>
-              </w:rPr>
-            </w:pPr>
+            <w:r>
+              <w:t xml:space="preserve"/>
+            </w:r>
           </w:p>
         </w:tc>
         <w:tc>
@@ -1303,703 +1015,8 @@
             <w:tcW w:w="4961" w:type="dxa"/>
           </w:tcPr>
           <w:p>
-            <w:pPr>
-              <w:tabs>
-                <w:tab w:val="left" w:pos="8222"/>
-              </w:tabs>
-              <w:spacing w:line="276" w:lineRule="auto"/>
-              <w:ind w:right="-177"/>
-              <w:jc w:val="center"/>
-              <w:rPr>
-                <w:b/>
-                <w:bCs/>
-              </w:rPr>
-            </w:pPr>
-          </w:p>
-        </w:tc>
-      </w:tr>
-      <w:tr>
-        <w:trPr>
-          <w:trHeight w:val="783"/>
-        </w:trPr>
-        <w:tc>
-          <w:tcPr>
-            <w:tcW w:w="568" w:type="dxa"/>
-            <w:vAlign w:val="center"/>
-          </w:tcPr>
-          <w:p>
-            <w:pPr>
-              <w:tabs>
-                <w:tab w:val="left" w:pos="8222"/>
-              </w:tabs>
-              <w:spacing w:line="276" w:lineRule="auto"/>
-              <w:ind w:right="-177"/>
-              <w:jc w:val="center"/>
-              <w:rPr>
-                <w:b/>
-                <w:bCs/>
-              </w:rPr>
-            </w:pPr>
-            <w:r>
-              <w:rPr>
-                <w:b/>
-                <w:bCs/>
-              </w:rPr>
-              <w:t>2</w:t>
-            </w:r>
-          </w:p>
-        </w:tc>
-        <w:tc>
-          <w:tcPr>
-            <w:tcW w:w="3260" w:type="dxa"/>
-            <w:vAlign w:val="center"/>
-          </w:tcPr>
-          <w:p>
-            <w:pPr>
-              <w:tabs>
-                <w:tab w:val="left" w:pos="8222"/>
-              </w:tabs>
-              <w:spacing w:line="276" w:lineRule="auto"/>
-              <w:ind w:right="-177"/>
-              <w:jc w:val="center"/>
-              <w:rPr>
-                <w:b/>
-                <w:bCs/>
-              </w:rPr>
-            </w:pPr>
-            <w:r>
-              <w:rPr>
-                <w:b/>
-                <w:bCs/>
-              </w:rPr>
-              <w:t>Куратор проекта</w:t>
-            </w:r>
-          </w:p>
-          <w:sdt>
-            <w:sdtPr>
-              <w:rPr>
-                <w:u w:val="single"/>
-              </w:rPr>
-              <w:alias w:val="Куратор проекта"/>
-              <w:tag w:val="Куратор проекта"/>
-              <w:id w:val="448287933"/>
-              <w:placeholder>
-                <w:docPart w:val="BB2234AC01A84EF6B6CE2A14EBA6134A"/>
-              </w:placeholder>
-              <w:dropDownList>
-                <w:listItem w:value="Выберите элемент."/>
-                <w:listItem w:displayText="Юрченкова А.Е." w:value="Юрченкова А.Е."/>
-                <w:listItem w:displayText="Маркодеева А.О." w:value="Маркодеева А.О."/>
-                <w:listItem w:displayText="Маркина Е.Д." w:value="Маркина Е.Д."/>
-                <w:listItem w:displayText="Андреев А.Е." w:value="Андреев А.Е."/>
-                <w:listItem w:displayText="Солодилова Е.Г." w:value="Солодилова Е.Г."/>
-              </w:dropDownList>
-            </w:sdtPr>
-            <w:sdtContent>
-              <w:p>
-                <w:pPr>
-                  <w:tabs>
-                    <w:tab w:val="left" w:pos="8222"/>
-                  </w:tabs>
-                  <w:spacing w:line="276" w:lineRule="auto"/>
-                  <w:ind w:right="-177"/>
-                  <w:jc w:val="center"/>
-                  <w:rPr>
-                    <w:b/>
-                    <w:bCs/>
-                  </w:rPr>
-                </w:pPr>
-                <w:r>
-                  <w:rPr>
-                    <w:u w:val="single"/>
-                  </w:rPr>
-                  <w:t>Солодилова Е.Г.</w:t>
-                </w:r>
-              </w:p>
-            </w:sdtContent>
-          </w:sdt>
-        </w:tc>
-        <w:tc>
-          <w:tcPr>
-            <w:tcW w:w="1843" w:type="dxa"/>
-          </w:tcPr>
-          <w:p>
-            <w:pPr>
-              <w:tabs>
-                <w:tab w:val="left" w:pos="8222"/>
-              </w:tabs>
-              <w:spacing w:line="276" w:lineRule="auto"/>
-              <w:ind w:right="-177"/>
-              <w:jc w:val="center"/>
-              <w:rPr>
-                <w:b/>
-                <w:bCs/>
-              </w:rPr>
-            </w:pPr>
-          </w:p>
-        </w:tc>
-        <w:tc>
-          <w:tcPr>
-            <w:tcW w:w="4961" w:type="dxa"/>
-          </w:tcPr>
-          <w:p>
-            <w:pPr>
-              <w:tabs>
-                <w:tab w:val="left" w:pos="8222"/>
-              </w:tabs>
-              <w:spacing w:line="276" w:lineRule="auto"/>
-              <w:ind w:right="-177"/>
-              <w:jc w:val="center"/>
-              <w:rPr>
-                <w:b/>
-                <w:bCs/>
-              </w:rPr>
-            </w:pPr>
-          </w:p>
-        </w:tc>
-      </w:tr>
-      <w:tr>
-        <w:trPr>
-          <w:trHeight w:val="1091"/>
-        </w:trPr>
-        <w:tc>
-          <w:tcPr>
-            <w:tcW w:w="568" w:type="dxa"/>
-            <w:vAlign w:val="center"/>
-          </w:tcPr>
-          <w:p>
-            <w:pPr>
-              <w:tabs>
-                <w:tab w:val="left" w:pos="8222"/>
-              </w:tabs>
-              <w:spacing w:line="276" w:lineRule="auto"/>
-              <w:ind w:right="-177"/>
-              <w:jc w:val="center"/>
-              <w:rPr>
-                <w:b/>
-                <w:bCs/>
-              </w:rPr>
-            </w:pPr>
-            <w:r>
-              <w:rPr>
-                <w:b/>
-                <w:bCs/>
-              </w:rPr>
-              <w:t>3</w:t>
-            </w:r>
-          </w:p>
-        </w:tc>
-        <w:tc>
-          <w:tcPr>
-            <w:tcW w:w="3260" w:type="dxa"/>
-            <w:vAlign w:val="center"/>
-          </w:tcPr>
-          <w:p>
-            <w:pPr>
-              <w:tabs>
-                <w:tab w:val="left" w:pos="8222"/>
-              </w:tabs>
-              <w:spacing w:line="276" w:lineRule="auto"/>
-              <w:ind w:right="-177"/>
-              <w:jc w:val="center"/>
-              <w:rPr>
-                <w:b/>
-                <w:bCs/>
-              </w:rPr>
-            </w:pPr>
-            <w:r>
-              <w:rPr>
-                <w:b/>
-                <w:bCs/>
-              </w:rPr>
-              <w:t>Ответственный</w:t>
-            </w:r>
-          </w:p>
-          <w:p>
-            <w:pPr>
-              <w:tabs>
-                <w:tab w:val="left" w:pos="8222"/>
-              </w:tabs>
-              <w:spacing w:line="276" w:lineRule="auto"/>
-              <w:ind w:right="-177"/>
-              <w:jc w:val="center"/>
-              <w:rPr>
-                <w:b/>
-                <w:bCs/>
-              </w:rPr>
-            </w:pPr>
-            <w:r>
-              <w:rPr>
-                <w:b/>
-                <w:bCs/>
-              </w:rPr>
-              <w:t>Исполнитель</w:t>
-            </w:r>
-          </w:p>
-          <w:tbl>
-            <w:tblPr>
-              <w:tblW w:w="0" w:type="auto"/>
-              <w:tblInd w:w="592" w:type="dxa"/>
-              <w:tblBorders>
-                <w:top w:val="single" w:sz="4" w:space="0" w:color="auto"/>
-                <w:left w:val="single" w:sz="4" w:space="0" w:color="auto"/>
-                <w:bottom w:val="single" w:sz="4" w:space="0" w:color="auto"/>
-                <w:right w:val="single" w:sz="4" w:space="0" w:color="auto"/>
-                <w:insideH w:val="single" w:sz="4" w:space="0" w:color="auto"/>
-                <w:insideV w:val="single" w:sz="4" w:space="0" w:color="auto"/>
-              </w:tblBorders>
-              <w:tblLook w:val="0000" w:firstRow="0" w:lastRow="0" w:firstColumn="0" w:lastColumn="0" w:noHBand="0" w:noVBand="0"/>
-            </w:tblPr>
-            <w:tblGrid>
-              <w:gridCol w:w="1920"/>
-            </w:tblGrid>
-            <w:tr>
-              <w:trPr>
-                <w:trHeight w:val="330"/>
-              </w:trPr>
-              <w:tc>
-                <w:tcPr>
-                  <w:tcW w:w="1920" w:type="dxa"/>
-                  <w:tcBorders>
-                    <w:top w:val="nil"/>
-                    <w:left w:val="nil"/>
-                    <w:bottom w:val="single" w:sz="4" w:space="0" w:color="auto"/>
-                    <w:right w:val="nil"/>
-                  </w:tcBorders>
-                </w:tcPr>
-                <w:p>
-                  <w:pPr>
-                    <w:tabs>
-                      <w:tab w:val="left" w:pos="8222"/>
-                    </w:tabs>
-                    <w:spacing w:line="276" w:lineRule="auto"/>
-                    <w:ind w:right="-177"/>
-                    <w:jc w:val="center"/>
-                  </w:pPr>
-                  <w:proofErr w:type="spellStart"/>
-                  <w:r>
-                    <w:t>Любарец</w:t>
-                  </w:r>
-                  <w:proofErr w:type="spellEnd"/>
-                  <w:r>
-                    <w:t xml:space="preserve"> Е.Д.</w:t>
-                  </w:r>
-                </w:p>
-              </w:tc>
-            </w:tr>
-          </w:tbl>
-          <w:p>
-            <w:pPr>
-              <w:tabs>
-                <w:tab w:val="left" w:pos="8222"/>
-              </w:tabs>
-              <w:spacing w:line="276" w:lineRule="auto"/>
-              <w:ind w:right="-177"/>
-              <w:jc w:val="center"/>
-              <w:rPr>
-                <w:b/>
-                <w:bCs/>
-              </w:rPr>
-            </w:pPr>
-          </w:p>
-        </w:tc>
-        <w:tc>
-          <w:tcPr>
-            <w:tcW w:w="1843" w:type="dxa"/>
-          </w:tcPr>
-          <w:p>
-            <w:pPr>
-              <w:tabs>
-                <w:tab w:val="left" w:pos="8222"/>
-              </w:tabs>
-              <w:spacing w:line="276" w:lineRule="auto"/>
-              <w:ind w:right="-177"/>
-              <w:jc w:val="center"/>
-              <w:rPr>
-                <w:b/>
-                <w:bCs/>
-              </w:rPr>
-            </w:pPr>
-          </w:p>
-        </w:tc>
-        <w:tc>
-          <w:tcPr>
-            <w:tcW w:w="4961" w:type="dxa"/>
-          </w:tcPr>
-          <w:p>
-            <w:pPr>
-              <w:tabs>
-                <w:tab w:val="left" w:pos="8222"/>
-              </w:tabs>
-              <w:spacing w:line="276" w:lineRule="auto"/>
-              <w:ind w:right="-177"/>
-              <w:jc w:val="center"/>
-            </w:pPr>
-          </w:p>
-        </w:tc>
-      </w:tr>
-      <w:tr>
-        <w:trPr>
-          <w:trHeight w:val="1149"/>
-        </w:trPr>
-        <w:tc>
-          <w:tcPr>
-            <w:tcW w:w="568" w:type="dxa"/>
-            <w:vAlign w:val="center"/>
-          </w:tcPr>
-          <w:p>
-            <w:pPr>
-              <w:tabs>
-                <w:tab w:val="left" w:pos="8222"/>
-              </w:tabs>
-              <w:spacing w:line="276" w:lineRule="auto"/>
-              <w:ind w:right="-177"/>
-              <w:jc w:val="center"/>
-              <w:rPr>
-                <w:b/>
-                <w:bCs/>
-              </w:rPr>
-            </w:pPr>
-            <w:r>
-              <w:rPr>
-                <w:b/>
-                <w:bCs/>
-              </w:rPr>
-              <w:t>4</w:t>
-            </w:r>
-          </w:p>
-        </w:tc>
-        <w:tc>
-          <w:tcPr>
-            <w:tcW w:w="3260" w:type="dxa"/>
-            <w:vAlign w:val="center"/>
-          </w:tcPr>
-          <w:p>
-            <w:pPr>
-              <w:tabs>
-                <w:tab w:val="left" w:pos="8222"/>
-              </w:tabs>
-              <w:spacing w:line="276" w:lineRule="auto"/>
-              <w:ind w:right="-177"/>
-              <w:jc w:val="center"/>
-              <w:rPr>
-                <w:b/>
-                <w:bCs/>
-              </w:rPr>
-            </w:pPr>
-            <w:r>
-              <w:rPr>
-                <w:b/>
-                <w:bCs/>
-              </w:rPr>
-              <w:t>Юрист</w:t>
-            </w:r>
-          </w:p>
-          <w:p>
-            <w:pPr>
-              <w:tabs>
-                <w:tab w:val="left" w:pos="8222"/>
-              </w:tabs>
-              <w:spacing w:line="276" w:lineRule="auto"/>
-              <w:ind w:right="-177"/>
-              <w:jc w:val="center"/>
-              <w:rPr>
-                <w:b/>
-                <w:bCs/>
-              </w:rPr>
-            </w:pPr>
-            <w:r>
-              <w:rPr>
-                <w:u w:val="single"/>
-              </w:rPr>
-              <w:t>Борисов А.А.</w:t>
-            </w:r>
-          </w:p>
-        </w:tc>
-        <w:tc>
-          <w:tcPr>
-            <w:tcW w:w="1843" w:type="dxa"/>
-          </w:tcPr>
-          <w:p>
-            <w:pPr>
-              <w:tabs>
-                <w:tab w:val="left" w:pos="8222"/>
-              </w:tabs>
-              <w:spacing w:line="276" w:lineRule="auto"/>
-              <w:ind w:right="-177"/>
-              <w:jc w:val="center"/>
-              <w:rPr>
-                <w:b/>
-                <w:bCs/>
-              </w:rPr>
-            </w:pPr>
-          </w:p>
-        </w:tc>
-        <w:tc>
-          <w:tcPr>
-            <w:tcW w:w="4961" w:type="dxa"/>
-          </w:tcPr>
-          <w:p>
-            <w:pPr>
-              <w:tabs>
-                <w:tab w:val="left" w:pos="8222"/>
-              </w:tabs>
-              <w:spacing w:line="276" w:lineRule="auto"/>
-              <w:ind w:right="-177"/>
-              <w:jc w:val="center"/>
-            </w:pPr>
-          </w:p>
-        </w:tc>
-      </w:tr>
-      <w:tr>
-        <w:trPr>
-          <w:trHeight w:val="841"/>
-        </w:trPr>
-        <w:tc>
-          <w:tcPr>
-            <w:tcW w:w="568" w:type="dxa"/>
-            <w:vAlign w:val="center"/>
-          </w:tcPr>
-          <w:p>
-            <w:pPr>
-              <w:tabs>
-                <w:tab w:val="left" w:pos="8222"/>
-              </w:tabs>
-              <w:spacing w:line="276" w:lineRule="auto"/>
-              <w:ind w:right="-177"/>
-              <w:jc w:val="center"/>
-              <w:rPr>
-                <w:b/>
-                <w:bCs/>
-              </w:rPr>
-            </w:pPr>
-            <w:r>
-              <w:rPr>
-                <w:b/>
-                <w:bCs/>
-              </w:rPr>
-              <w:t>5</w:t>
-            </w:r>
-          </w:p>
-        </w:tc>
-        <w:tc>
-          <w:tcPr>
-            <w:tcW w:w="3260" w:type="dxa"/>
-            <w:vAlign w:val="center"/>
-          </w:tcPr>
-          <w:p>
-            <w:pPr>
-              <w:tabs>
-                <w:tab w:val="left" w:pos="8222"/>
-              </w:tabs>
-              <w:spacing w:line="276" w:lineRule="auto"/>
-              <w:ind w:right="-177"/>
-              <w:jc w:val="center"/>
-              <w:rPr>
-                <w:b/>
-                <w:bCs/>
-              </w:rPr>
-            </w:pPr>
-            <w:r>
-              <w:rPr>
-                <w:b/>
-                <w:bCs/>
-              </w:rPr>
-              <w:t>Главный бухгалтер</w:t>
-            </w:r>
-          </w:p>
-          <w:p>
-            <w:pPr>
-              <w:tabs>
-                <w:tab w:val="left" w:pos="8222"/>
-              </w:tabs>
-              <w:spacing w:line="276" w:lineRule="auto"/>
-              <w:ind w:right="-177"/>
-              <w:jc w:val="center"/>
-              <w:rPr>
-                <w:b/>
-                <w:bCs/>
-              </w:rPr>
-            </w:pPr>
-            <w:r>
-              <w:rPr>
-                <w:u w:val="single"/>
-              </w:rPr>
-              <w:t>Иванова И В.</w:t>
-            </w:r>
-          </w:p>
-        </w:tc>
-        <w:tc>
-          <w:tcPr>
-            <w:tcW w:w="1843" w:type="dxa"/>
-          </w:tcPr>
-          <w:p>
-            <w:pPr>
-              <w:tabs>
-                <w:tab w:val="left" w:pos="8222"/>
-              </w:tabs>
-              <w:spacing w:line="276" w:lineRule="auto"/>
-              <w:ind w:right="-177"/>
-              <w:jc w:val="center"/>
-              <w:rPr>
-                <w:b/>
-                <w:bCs/>
-              </w:rPr>
-            </w:pPr>
-          </w:p>
-        </w:tc>
-        <w:tc>
-          <w:tcPr>
-            <w:tcW w:w="4961" w:type="dxa"/>
-          </w:tcPr>
-          <w:p>
-            <w:pPr>
-              <w:tabs>
-                <w:tab w:val="left" w:pos="8222"/>
-              </w:tabs>
-              <w:spacing w:line="276" w:lineRule="auto"/>
-              <w:ind w:right="-177"/>
-              <w:jc w:val="center"/>
-            </w:pPr>
-            <w:r>
-              <w:t xml:space="preserve">_______________ статья расходования </w:t>
-            </w:r>
-          </w:p>
-        </w:tc>
-      </w:tr>
-      <w:tr>
-        <w:trPr>
-          <w:trHeight w:val="1344"/>
-        </w:trPr>
-        <w:tc>
-          <w:tcPr>
-            <w:tcW w:w="568" w:type="dxa"/>
-            <w:vAlign w:val="center"/>
-          </w:tcPr>
-          <w:p>
-            <w:pPr>
-              <w:tabs>
-                <w:tab w:val="left" w:pos="8222"/>
-              </w:tabs>
-              <w:spacing w:line="276" w:lineRule="auto"/>
-              <w:ind w:right="-177"/>
-              <w:jc w:val="center"/>
-              <w:rPr>
-                <w:b/>
-                <w:bCs/>
-              </w:rPr>
-            </w:pPr>
-            <w:r>
-              <w:rPr>
-                <w:b/>
-                <w:bCs/>
-              </w:rPr>
-              <w:t>6</w:t>
-            </w:r>
-          </w:p>
-        </w:tc>
-        <w:tc>
-          <w:tcPr>
-            <w:tcW w:w="3260" w:type="dxa"/>
-            <w:vAlign w:val="center"/>
-          </w:tcPr>
-          <w:p>
-            <w:pPr>
-              <w:tabs>
-                <w:tab w:val="left" w:pos="8222"/>
-              </w:tabs>
-              <w:spacing w:line="276" w:lineRule="auto"/>
-              <w:ind w:right="-177"/>
-              <w:jc w:val="center"/>
-              <w:rPr>
-                <w:b/>
-                <w:bCs/>
-              </w:rPr>
-            </w:pPr>
-            <w:r>
-              <w:rPr>
-                <w:b/>
-                <w:bCs/>
-              </w:rPr>
-              <w:t>Начальник отдела</w:t>
-            </w:r>
-          </w:p>
-          <w:p>
-            <w:pPr>
-              <w:tabs>
-                <w:tab w:val="left" w:pos="8222"/>
-              </w:tabs>
-              <w:spacing w:line="276" w:lineRule="auto"/>
-              <w:ind w:right="-177"/>
-              <w:jc w:val="center"/>
-              <w:rPr>
-                <w:b/>
-                <w:bCs/>
-              </w:rPr>
-            </w:pPr>
-            <w:r>
-              <w:rPr>
-                <w:b/>
-                <w:bCs/>
-              </w:rPr>
-              <w:t>МТО</w:t>
-            </w:r>
-          </w:p>
-          <w:p>
-            <w:pPr>
-              <w:tabs>
-                <w:tab w:val="left" w:pos="8222"/>
-              </w:tabs>
-              <w:spacing w:line="276" w:lineRule="auto"/>
-              <w:ind w:right="-177"/>
-              <w:jc w:val="center"/>
-              <w:rPr>
-                <w:b/>
-                <w:bCs/>
-              </w:rPr>
-            </w:pPr>
-            <w:r>
-              <w:rPr>
-                <w:u w:val="single"/>
-              </w:rPr>
-              <w:t>Цыганов И.А.</w:t>
-            </w:r>
-          </w:p>
-        </w:tc>
-        <w:tc>
-          <w:tcPr>
-            <w:tcW w:w="1843" w:type="dxa"/>
-          </w:tcPr>
-          <w:p>
-            <w:pPr>
-              <w:tabs>
-                <w:tab w:val="left" w:pos="8222"/>
-              </w:tabs>
-              <w:spacing w:line="276" w:lineRule="auto"/>
-              <w:ind w:right="-177"/>
-              <w:jc w:val="center"/>
-              <w:rPr>
-                <w:b/>
-                <w:bCs/>
-              </w:rPr>
-            </w:pPr>
-          </w:p>
-        </w:tc>
-        <w:tc>
-          <w:tcPr>
-            <w:tcW w:w="4961" w:type="dxa"/>
-          </w:tcPr>
-          <w:p>
-            <w:pPr>
-              <w:tabs>
-                <w:tab w:val="left" w:pos="8222"/>
-              </w:tabs>
-              <w:spacing w:line="276" w:lineRule="auto"/>
-              <w:ind w:right="-177"/>
-              <w:jc w:val="center"/>
-            </w:pPr>
-            <w:r>
-              <w:t>_______________ статья расходования</w:t>
+            <w:r>
+              <w:t xml:space="preserve"/>
             </w:r>
           </w:p>
         </w:tc>
@@ -2011,24 +1028,8 @@
             <w:vAlign w:val="center"/>
           </w:tcPr>
           <w:p>
-            <w:pPr>
-              <w:tabs>
-                <w:tab w:val="left" w:pos="8222"/>
-              </w:tabs>
-              <w:spacing w:line="276" w:lineRule="auto"/>
-              <w:ind w:right="-177"/>
-              <w:jc w:val="center"/>
-              <w:rPr>
-                <w:b/>
-                <w:bCs/>
-              </w:rPr>
-            </w:pPr>
-            <w:r>
-              <w:rPr>
-                <w:b/>
-                <w:bCs/>
-              </w:rPr>
-              <w:t>7</w:t>
+            <w:r>
+              <w:t xml:space="preserve">{{ a.num }}</w:t>
             </w:r>
           </w:p>
         </w:tc>
@@ -2038,64 +1039,9 @@
             <w:vAlign w:val="center"/>
           </w:tcPr>
           <w:p>
-            <w:pPr>
-              <w:tabs>
-                <w:tab w:val="left" w:pos="8222"/>
-              </w:tabs>
-              <w:spacing w:line="276" w:lineRule="auto"/>
-              <w:ind w:right="-177"/>
-              <w:jc w:val="center"/>
-              <w:rPr>
-                <w:b/>
-                <w:bCs/>
-              </w:rPr>
-            </w:pPr>
-            <w:r>
-              <w:rPr>
-                <w:b/>
-                <w:bCs/>
-              </w:rPr>
-              <w:t xml:space="preserve">Заместитель руководителя по </w:t>
-            </w:r>
-            <w:r>
-              <w:rPr>
-                <w:b/>
-                <w:bCs/>
-              </w:rPr>
-              <w:t>ФХД</w:t>
-            </w:r>
-          </w:p>
-          <w:p>
-            <w:pPr>
-              <w:tabs>
-                <w:tab w:val="left" w:pos="8222"/>
-              </w:tabs>
-              <w:spacing w:line="276" w:lineRule="auto"/>
-              <w:ind w:right="-177"/>
-              <w:jc w:val="center"/>
-              <w:rPr>
-                <w:b/>
-                <w:bCs/>
-              </w:rPr>
-            </w:pPr>
-            <w:r>
-              <w:rPr>
-                <w:b/>
-                <w:bCs/>
-              </w:rPr>
-              <w:t xml:space="preserve"> </w:t>
-            </w:r>
-            <w:r>
-              <w:rPr>
-                <w:u w:val="single"/>
-              </w:rPr>
-              <w:t>Новичкова О</w:t>
-            </w:r>
-            <w:r>
-              <w:rPr>
-                <w:u w:val="single"/>
-              </w:rPr>
-              <w:t>.А.</w:t>
+            <w:r>
+              <w:t xml:space="preserve">{{ a.role_name }}
+{{ a.full_name }}</w:t>
             </w:r>
           </w:p>
         </w:tc>
@@ -2104,18 +1050,9 @@
             <w:tcW w:w="1843" w:type="dxa"/>
           </w:tcPr>
           <w:p>
-            <w:pPr>
-              <w:tabs>
-                <w:tab w:val="left" w:pos="8222"/>
-              </w:tabs>
-              <w:spacing w:line="276" w:lineRule="auto"/>
-              <w:ind w:right="-177"/>
-              <w:jc w:val="center"/>
-              <w:rPr>
-                <w:b/>
-                <w:bCs/>
-              </w:rPr>
-            </w:pPr>
+            <w:r>
+              <w:t xml:space="preserve"/>
+            </w:r>
           </w:p>
         </w:tc>
         <w:tc>
@@ -2123,18 +1060,53 @@
             <w:tcW w:w="4961" w:type="dxa"/>
           </w:tcPr>
           <w:p>
-            <w:pPr>
-              <w:tabs>
-                <w:tab w:val="left" w:pos="8222"/>
-              </w:tabs>
-              <w:spacing w:line="276" w:lineRule="auto"/>
-              <w:ind w:right="-177"/>
-              <w:jc w:val="center"/>
-              <w:rPr>
-                <w:b/>
-                <w:bCs/>
-              </w:rPr>
-            </w:pPr>
+            <w:r>
+              <w:t xml:space="preserve">{{ a.note }}</w:t>
+            </w:r>
+          </w:p>
+        </w:tc>
+      </w:tr>
+      <w:tr>
+        <w:tc>
+          <w:tcPr>
+            <w:tcW w:w="568" w:type="dxa"/>
+            <w:vAlign w:val="center"/>
+          </w:tcPr>
+          <w:p>
+            <w:r>
+              <w:t xml:space="preserve">{%tr endfor %}</w:t>
+            </w:r>
+          </w:p>
+        </w:tc>
+        <w:tc>
+          <w:tcPr>
+            <w:tcW w:w="3260" w:type="dxa"/>
+            <w:vAlign w:val="center"/>
+          </w:tcPr>
+          <w:p>
+            <w:r>
+              <w:t xml:space="preserve"/>
+            </w:r>
+          </w:p>
+        </w:tc>
+        <w:tc>
+          <w:tcPr>
+            <w:tcW w:w="1843" w:type="dxa"/>
+          </w:tcPr>
+          <w:p>
+            <w:r>
+              <w:t xml:space="preserve"/>
+            </w:r>
+          </w:p>
+        </w:tc>
+        <w:tc>
+          <w:tcPr>
+            <w:tcW w:w="4961" w:type="dxa"/>
+          </w:tcPr>
+          <w:p>
+            <w:r>
+              <w:t xml:space="preserve"/>
+            </w:r>
           </w:p>
         </w:tc>
       </w:tr>
@@ -2194,7 +1166,7 @@
 </file>
 
 <file path=word/endnotes.xml><?xml version="1.0" encoding="utf-8"?>
-<w:endnotes xmlns:wpc="http://schemas.microsoft.com/office/word/2010/wordprocessingCanvas" xmlns:cx="http://schemas.microsoft.com/office/drawing/2014/chartex" xmlns:cx1="http://schemas.microsoft.com/office/drawing/2015/9/8/chartex" xmlns:cx2="http://schemas.microsoft.com/office/drawing/2015/10/21/chartex" xmlns:cx3="http://schemas.microsoft.com/office/drawing/2016/5/9/chartex" xmlns:cx4="http://schemas.microsoft.com/office/drawing/2016/5/10/chartex" xmlns:cx5="http://schemas.microsoft.com/office/drawing/2016/5/11/chartex" xmlns:cx6="http://schemas.microsoft.com/office/drawing/2016/5/12/chartex" xmlns:cx7="http://schemas.microsoft.com/office/drawing/2016/5/13/chartex" xmlns:cx8="http://schemas.microsoft.com/office/drawing/2016/5/14/chartex" xmlns:mc="http://schemas.openxmlformats.org/markup-compatibility/2006" xmlns:aink="http://schemas.microsoft.com/office/drawing/2016/ink" xmlns:am3d="http://schemas.microsoft.com/office/drawing/2017/model3d" xmlns:o="urn:schemas-microsoft-com:office:office" xmlns:oel="http://schemas.microsoft.com/office/2019/extlst" xmlns:r="http://schemas.openxmlformats.org/officeDocument/2006/relationships" xmlns:m="http://schemas.openxmlformats.org/officeDocument/2006/math" xmlns:v="urn:schemas-microsoft-com:vml" xmlns:wp14="http://schemas.microsoft.com/office/word/2010/wordprocessingDrawing" xmlns:wp="http://schemas.openxmlformats.org/drawingml/2006/wordprocessingDrawing" xmlns:w10="urn:schemas-microsoft-com:office:word" xmlns:w="http://schemas.openxmlformats.org/wordprocessingml/2006/main" xmlns:w14="http://schemas.microsoft.com/office/word/2010/wordml" xmlns:w15="http://schemas.microsoft.com/office/word/2012/wordml" xmlns:w16cex="http://schemas.microsoft.com/office/word/2018/wordml/cex" xmlns:w16cid="http://schemas.microsoft.com/office/word/2016/wordml/cid" xmlns:w16="http://schemas.microsoft.com/office/word/2018/wordml" xmlns:w16du="http://schemas.microsoft.com/office/word/2023/wordml/word16du" xmlns:w16sdtdh="http://schemas.microsoft.com/office/word/2020/wordml/sdtdatahash" xmlns:w16sdtfl="http://schemas.microsoft.com/office/word/2024/wordml/sdtformatlock" xmlns:w16se="http://schemas.microsoft.com/office/word/2015/wordml/symex" xmlns:wpg="http://schemas.microsoft.com/office/word/2010/wordprocessingGroup" xmlns:wpi="http://schemas.microsoft.com/office/word/2010/wordprocessingInk" xmlns:wne="http://schemas.microsoft.com/office/word/2006/wordml" xmlns:wps="http://schemas.microsoft.com/office/word/2010/wordprocessingShape" mc:Ignorable="w14 w15 w16se w16cid w16 w16cex w16sdtdh w16sdtfl w16du wp14">
+<w:endnotes xmlns:wpc="http://schemas.microsoft.com/office/word/2010/wordprocessingCanvas" xmlns:cx="http://schemas.microsoft.com/office/drawing/2014/chartex" xmlns:cx1="http://schemas.microsoft.com/office/drawing/2015/9/8/chartex" xmlns:cx2="http://schemas.microsoft.com/office/drawing/2015/10/21/chartex" xmlns:cx3="http://schemas.microsoft.com/office/drawing/2016/5/9/chartex" xmlns:cx4="http://schemas.microsoft.com/office/drawing/2016/5/10/chartex" xmlns:cx5="http://schemas.microsoft.com/office/drawing/2016/5/11/chartex" xmlns:cx6="http://schemas.microsoft.com/office/drawing/2016/5/12/chartex" xmlns:cx7="http://schemas.microsoft.com/office/drawing/2016/5/13/chartex" xmlns:cx8="http://schemas.microsoft.com/office/drawing/2016/5/14/chartex" xmlns:mc="http://schemas.openxmlformats.org/markup-compatibility/2006" xmlns:aink="http://schemas.microsoft.com/office/drawing/2016/ink" xmlns:am3d="http://schemas.microsoft.com/office/drawing/2017/model3d" xmlns:o="urn:schemas-microsoft-com:office:office" xmlns:oel="http://schemas.microsoft.com/office/2019/extlst" xmlns:r="http://schemas.openxmlformats.org/officeDocument/2006/relationships" xmlns:m="http://schemas.openxmlformats.org/officeDocument/2006/math" xmlns:v="urn:schemas-microsoft-com:vml" xmlns:wp14="http://schemas.microsoft.com/office/word/2010/wordprocessingDrawing" xmlns:wp="http://schemas.openxmlformats.org/drawingml/2006/wordprocessingDrawing" xmlns:w10="urn:schemas-microsoft-com:office:word" xmlns:w="http://schemas.openxmlformats.org/wordprocessingml/2006/main" xmlns:w14="http://schemas.microsoft.com/office/word/2010/wordml" xmlns:w15="http://schemas.microsoft.com/office/word/2012/wordml" xmlns:w16cex="http://schemas.microsoft.com/office/word/2018/wordml/cex" xmlns:w16cid="http://schemas.microsoft.com/office/word/2016/wordml/cid" xmlns:w16="http://schemas.microsoft.com/office/word/2018/wordml" xmlns:w16sdtdh="http://schemas.microsoft.com/office/word/2020/wordml/sdtdatahash" xmlns:w16se="http://schemas.microsoft.com/office/word/2015/wordml/symex" xmlns:wpg="http://schemas.microsoft.com/office/word/2010/wordprocessingGroup" xmlns:wpi="http://schemas.microsoft.com/office/word/2010/wordprocessingInk" xmlns:wne="http://schemas.microsoft.com/office/word/2006/wordml" xmlns:wps="http://schemas.microsoft.com/office/word/2010/wordprocessingShape" mc:Ignorable="w14 w15 w16se w16cid w16 w16cex w16sdtdh wp14">
   <w:endnote w:type="separator" w:id="-1">
     <w:p>
       <w:r>
@@ -2213,7 +1185,7 @@
 </file>
 
 <file path=word/footnotes.xml><?xml version="1.0" encoding="utf-8"?>
-<w:footnotes xmlns:wpc="http://schemas.microsoft.com/office/word/2010/wordprocessingCanvas" xmlns:cx="http://schemas.microsoft.com/office/drawing/2014/chartex" xmlns:cx1="http://schemas.microsoft.com/office/drawing/2015/9/8/chartex" xmlns:cx2="http://schemas.microsoft.com/office/drawing/2015/10/21/chartex" xmlns:cx3="http://schemas.microsoft.com/office/drawing/2016/5/9/chartex" xmlns:cx4="http://schemas.microsoft.com/office/drawing/2016/5/10/chartex" xmlns:cx5="http://schemas.microsoft.com/office/drawing/2016/5/11/chartex" xmlns:cx6="http://schemas.microsoft.com/office/drawing/2016/5/12/chartex" xmlns:cx7="http://schemas.microsoft.com/office/drawing/2016/5/13/chartex" xmlns:cx8="http://schemas.microsoft.com/office/drawing/2016/5/14/chartex" xmlns:mc="http://schemas.openxmlformats.org/markup-compatibility/2006" xmlns:aink="http://schemas.microsoft.com/office/drawing/2016/ink" xmlns:am3d="http://schemas.microsoft.com/office/drawing/2017/model3d" xmlns:o="urn:schemas-microsoft-com:office:office" xmlns:oel="http://schemas.microsoft.com/office/2019/extlst" xmlns:r="http://schemas.openxmlformats.org/officeDocument/2006/relationships" xmlns:m="http://schemas.openxmlformats.org/officeDocument/2006/math" xmlns:v="urn:schemas-microsoft-com:vml" xmlns:wp14="http://schemas.microsoft.com/office/word/2010/wordprocessingDrawing" xmlns:wp="http://schemas.openxmlformats.org/drawingml/2006/wordprocessingDrawing" xmlns:w10="urn:schemas-microsoft-com:office:word" xmlns:w="http://schemas.openxmlformats.org/wordprocessingml/2006/main" xmlns:w14="http://schemas.microsoft.com/office/word/2010/wordml" xmlns:w15="http://schemas.microsoft.com/office/word/2012/wordml" xmlns:w16cex="http://schemas.microsoft.com/office/word/2018/wordml/cex" xmlns:w16cid="http://schemas.microsoft.com/office/word/2016/wordml/cid" xmlns:w16="http://schemas.microsoft.com/office/word/2018/wordml" xmlns:w16du="http://schemas.microsoft.com/office/word/2023/wordml/word16du" xmlns:w16sdtdh="http://schemas.microsoft.com/office/word/2020/wordml/sdtdatahash" xmlns:w16sdtfl="http://schemas.microsoft.com/office/word/2024/wordml/sdtformatlock" xmlns:w16se="http://schemas.microsoft.com/office/word/2015/wordml/symex" xmlns:wpg="http://schemas.microsoft.com/office/word/2010/wordprocessingGroup" xmlns:wpi="http://schemas.microsoft.com/office/word/2010/wordprocessingInk" xmlns:wne="http://schemas.microsoft.com/office/word/2006/wordml" xmlns:wps="http://schemas.microsoft.com/office/word/2010/wordprocessingShape" mc:Ignorable="w14 w15 w16se w16cid w16 w16cex w16sdtdh w16sdtfl w16du wp14">
+<w:footnotes xmlns:wpc="http://schemas.microsoft.com/office/word/2010/wordprocessingCanvas" xmlns:cx="http://schemas.microsoft.com/office/drawing/2014/chartex" xmlns:cx1="http://schemas.microsoft.com/office/drawing/2015/9/8/chartex" xmlns:cx2="http://schemas.microsoft.com/office/drawing/2015/10/21/chartex" xmlns:cx3="http://schemas.microsoft.com/office/drawing/2016/5/9/chartex" xmlns:cx4="http://schemas.microsoft.com/office/drawing/2016/5/10/chartex" xmlns:cx5="http://schemas.microsoft.com/office/drawing/2016/5/11/chartex" xmlns:cx6="http://schemas.microsoft.com/office/drawing/2016/5/12/chartex" xmlns:cx7="http://schemas.microsoft.com/office/drawing/2016/5/13/chartex" xmlns:cx8="http://schemas.microsoft.com/office/drawing/2016/5/14/chartex" xmlns:mc="http://schemas.openxmlformats.org/markup-compatibility/2006" xmlns:aink="http://schemas.microsoft.com/office/drawing/2016/ink" xmlns:am3d="http://schemas.microsoft.com/office/drawing/2017/model3d" xmlns:o="urn:schemas-microsoft-com:office:office" xmlns:oel="http://schemas.microsoft.com/office/2019/extlst" xmlns:r="http://schemas.openxmlformats.org/officeDocument/2006/relationships" xmlns:m="http://schemas.openxmlformats.org/officeDocument/2006/math" xmlns:v="urn:schemas-microsoft-com:vml" xmlns:wp14="http://schemas.microsoft.com/office/word/2010/wordprocessingDrawing" xmlns:wp="http://schemas.openxmlformats.org/drawingml/2006/wordprocessingDrawing" xmlns:w10="urn:schemas-microsoft-com:office:word" xmlns:w="http://schemas.openxmlformats.org/wordprocessingml/2006/main" xmlns:w14="http://schemas.microsoft.com/office/word/2010/wordml" xmlns:w15="http://schemas.microsoft.com/office/word/2012/wordml" xmlns:w16cex="http://schemas.microsoft.com/office/word/2018/wordml/cex" xmlns:w16cid="http://schemas.microsoft.com/office/word/2016/wordml/cid" xmlns:w16="http://schemas.microsoft.com/office/word/2018/wordml" xmlns:w16sdtdh="http://schemas.microsoft.com/office/word/2020/wordml/sdtdatahash" xmlns:w16se="http://schemas.microsoft.com/office/word/2015/wordml/symex" xmlns:wpg="http://schemas.microsoft.com/office/word/2010/wordprocessingGroup" xmlns:wpi="http://schemas.microsoft.com/office/word/2010/wordprocessingInk" xmlns:wne="http://schemas.microsoft.com/office/word/2006/wordml" xmlns:wps="http://schemas.microsoft.com/office/word/2010/wordprocessingShape" mc:Ignorable="w14 w15 w16se w16cid w16 w16cex w16sdtdh wp14">
   <w:footnote w:type="separator" w:id="-1">
     <w:p>
       <w:r>
@@ -2232,7 +1204,7 @@
 </file>
 
 <file path=word/header1.xml><?xml version="1.0" encoding="utf-8"?>
-<w:hdr xmlns:wpc="http://schemas.microsoft.com/office/word/2010/wordprocessingCanvas" xmlns:cx="http://schemas.microsoft.com/office/drawing/2014/chartex" xmlns:cx1="http://schemas.microsoft.com/office/drawing/2015/9/8/chartex" xmlns:cx2="http://schemas.microsoft.com/office/drawing/2015/10/21/chartex" xmlns:cx3="http://schemas.microsoft.com/office/drawing/2016/5/9/chartex" xmlns:cx4="http://schemas.microsoft.com/office/drawing/2016/5/10/chartex" xmlns:cx5="http://schemas.microsoft.com/office/drawing/2016/5/11/chartex" xmlns:cx6="http://schemas.microsoft.com/office/drawing/2016/5/12/chartex" xmlns:cx7="http://schemas.microsoft.com/office/drawing/2016/5/13/chartex" xmlns:cx8="http://schemas.microsoft.com/office/drawing/2016/5/14/chartex" xmlns:mc="http://schemas.openxmlformats.org/markup-compatibility/2006" xmlns:aink="http://schemas.microsoft.com/office/drawing/2016/ink" xmlns:am3d="http://schemas.microsoft.com/office/drawing/2017/model3d" xmlns:o="urn:schemas-microsoft-com:office:office" xmlns:oel="http://schemas.microsoft.com/office/2019/extlst" xmlns:r="http://schemas.openxmlformats.org/officeDocument/2006/relationships" xmlns:m="http://schemas.openxmlformats.org/officeDocument/2006/math" xmlns:v="urn:schemas-microsoft-com:vml" xmlns:wp14="http://schemas.microsoft.com/office/word/2010/wordprocessingDrawing" xmlns:wp="http://schemas.openxmlformats.org/drawingml/2006/wordprocessingDrawing" xmlns:w10="urn:schemas-microsoft-com:office:word" xmlns:w="http://schemas.openxmlformats.org/wordprocessingml/2006/main" xmlns:w14="http://schemas.microsoft.com/office/word/2010/wordml" xmlns:w15="http://schemas.microsoft.com/office/word/2012/wordml" xmlns:w16cex="http://schemas.microsoft.com/office/word/2018/wordml/cex" xmlns:w16cid="http://schemas.microsoft.com/office/word/2016/wordml/cid" xmlns:w16="http://schemas.microsoft.com/office/word/2018/wordml" xmlns:w16du="http://schemas.microsoft.com/office/word/2023/wordml/word16du" xmlns:w16sdtdh="http://schemas.microsoft.com/office/word/2020/wordml/sdtdatahash" xmlns:w16sdtfl="http://schemas.microsoft.com/office/word/2024/wordml/sdtformatlock" xmlns:w16se="http://schemas.microsoft.com/office/word/2015/wordml/symex" xmlns:wpg="http://schemas.microsoft.com/office/word/2010/wordprocessingGroup" xmlns:wpi="http://schemas.microsoft.com/office/word/2010/wordprocessingInk" xmlns:wne="http://schemas.microsoft.com/office/word/2006/wordml" xmlns:wps="http://schemas.microsoft.com/office/word/2010/wordprocessingShape" mc:Ignorable="w14 w15 w16se w16cid w16 w16cex w16sdtdh w16sdtfl w16du wp14">
+<w:hdr xmlns:wpc="http://schemas.microsoft.com/office/word/2010/wordprocessingCanvas" xmlns:cx="http://schemas.microsoft.com/office/drawing/2014/chartex" xmlns:cx1="http://schemas.microsoft.com/office/drawing/2015/9/8/chartex" xmlns:cx2="http://schemas.microsoft.com/office/drawing/2015/10/21/chartex" xmlns:cx3="http://schemas.microsoft.com/office/drawing/2016/5/9/chartex" xmlns:cx4="http://schemas.microsoft.com/office/drawing/2016/5/10/chartex" xmlns:cx5="http://schemas.microsoft.com/office/drawing/2016/5/11/chartex" xmlns:cx6="http://schemas.microsoft.com/office/drawing/2016/5/12/chartex" xmlns:cx7="http://schemas.microsoft.com/office/drawing/2016/5/13/chartex" xmlns:cx8="http://schemas.microsoft.com/office/drawing/2016/5/14/chartex" xmlns:mc="http://schemas.openxmlformats.org/markup-compatibility/2006" xmlns:aink="http://schemas.microsoft.com/office/drawing/2016/ink" xmlns:am3d="http://schemas.microsoft.com/office/drawing/2017/model3d" xmlns:o="urn:schemas-microsoft-com:office:office" xmlns:oel="http://schemas.microsoft.com/office/2019/extlst" xmlns:r="http://schemas.openxmlformats.org/officeDocument/2006/relationships" xmlns:m="http://schemas.openxmlformats.org/officeDocument/2006/math" xmlns:v="urn:schemas-microsoft-com:vml" xmlns:wp14="http://schemas.microsoft.com/office/word/2010/wordprocessingDrawing" xmlns:wp="http://schemas.openxmlformats.org/drawingml/2006/wordprocessingDrawing" xmlns:w10="urn:schemas-microsoft-com:office:word" xmlns:w="http://schemas.openxmlformats.org/wordprocessingml/2006/main" xmlns:w14="http://schemas.microsoft.com/office/word/2010/wordml" xmlns:w15="http://schemas.microsoft.com/office/word/2012/wordml" xmlns:w16cex="http://schemas.microsoft.com/office/word/2018/wordml/cex" xmlns:w16cid="http://schemas.microsoft.com/office/word/2016/wordml/cid" xmlns:w16="http://schemas.microsoft.com/office/word/2018/wordml" xmlns:w16sdtdh="http://schemas.microsoft.com/office/word/2020/wordml/sdtdatahash" xmlns:w16se="http://schemas.microsoft.com/office/word/2015/wordml/symex" xmlns:wpg="http://schemas.microsoft.com/office/word/2010/wordprocessingGroup" xmlns:wpi="http://schemas.microsoft.com/office/word/2010/wordprocessingInk" xmlns:wne="http://schemas.microsoft.com/office/word/2006/wordml" xmlns:wps="http://schemas.microsoft.com/office/word/2010/wordprocessingShape" mc:Ignorable="w14 w15 w16se w16cid w16 w16cex w16sdtdh wp14">
   <w:sdt>
     <w:sdtPr>
       <w:id w:val="1226567953"/>
@@ -2277,7 +1249,7 @@
 </file>
 
 <file path=word/numbering.xml><?xml version="1.0" encoding="utf-8"?>
-<w:numbering xmlns:wpc="http://schemas.microsoft.com/office/word/2010/wordprocessingCanvas" xmlns:cx="http://schemas.microsoft.com/office/drawing/2014/chartex" xmlns:cx1="http://schemas.microsoft.com/office/drawing/2015/9/8/chartex" xmlns:cx2="http://schemas.microsoft.com/office/drawing/2015/10/21/chartex" xmlns:cx3="http://schemas.microsoft.com/office/drawing/2016/5/9/chartex" xmlns:cx4="http://schemas.microsoft.com/office/drawing/2016/5/10/chartex" xmlns:cx5="http://schemas.microsoft.com/office/drawing/2016/5/11/chartex" xmlns:cx6="http://schemas.microsoft.com/office/drawing/2016/5/12/chartex" xmlns:cx7="http://schemas.microsoft.com/office/drawing/2016/5/13/chartex" xmlns:cx8="http://schemas.microsoft.com/office/drawing/2016/5/14/chartex" xmlns:mc="http://schemas.openxmlformats.org/markup-compatibility/2006" xmlns:aink="http://schemas.microsoft.com/office/drawing/2016/ink" xmlns:am3d="http://schemas.microsoft.com/office/drawing/2017/model3d" xmlns:o="urn:schemas-microsoft-com:office:office" xmlns:oel="http://schemas.microsoft.com/office/2019/extlst" xmlns:r="http://schemas.openxmlformats.org/officeDocument/2006/relationships" xmlns:m="http://schemas.openxmlformats.org/officeDocument/2006/math" xmlns:v="urn:schemas-microsoft-com:vml" xmlns:wp14="http://schemas.microsoft.com/office/word/2010/wordprocessingDrawing" xmlns:wp="http://schemas.openxmlformats.org/drawingml/2006/wordprocessingDrawing" xmlns:w10="urn:schemas-microsoft-com:office:word" xmlns:w="http://schemas.openxmlformats.org/wordprocessingml/2006/main" xmlns:w14="http://schemas.microsoft.com/office/word/2010/wordml" xmlns:w15="http://schemas.microsoft.com/office/word/2012/wordml" xmlns:w16cex="http://schemas.microsoft.com/office/word/2018/wordml/cex" xmlns:w16cid="http://schemas.microsoft.com/office/word/2016/wordml/cid" xmlns:w16="http://schemas.microsoft.com/office/word/2018/wordml" xmlns:w16du="http://schemas.microsoft.com/office/word/2023/wordml/word16du" xmlns:w16sdtdh="http://schemas.microsoft.com/office/word/2020/wordml/sdtdatahash" xmlns:w16sdtfl="http://schemas.microsoft.com/office/word/2024/wordml/sdtformatlock" xmlns:w16se="http://schemas.microsoft.com/office/word/2015/wordml/symex" xmlns:wpg="http://schemas.microsoft.com/office/word/2010/wordprocessingGroup" xmlns:wpi="http://schemas.microsoft.com/office/word/2010/wordprocessingInk" xmlns:wne="http://schemas.microsoft.com/office/word/2006/wordml" xmlns:wps="http://schemas.microsoft.com/office/word/2010/wordprocessingShape" mc:Ignorable="w14 w15 w16se w16cid w16 w16cex w16sdtdh w16sdtfl w16du wp14">
+<w:numbering xmlns:wpc="http://schemas.microsoft.com/office/word/2010/wordprocessingCanvas" xmlns:cx="http://schemas.microsoft.com/office/drawing/2014/chartex" xmlns:cx1="http://schemas.microsoft.com/office/drawing/2015/9/8/chartex" xmlns:cx2="http://schemas.microsoft.com/office/drawing/2015/10/21/chartex" xmlns:cx3="http://schemas.microsoft.com/office/drawing/2016/5/9/chartex" xmlns:cx4="http://schemas.microsoft.com/office/drawing/2016/5/10/chartex" xmlns:cx5="http://schemas.microsoft.com/office/drawing/2016/5/11/chartex" xmlns:cx6="http://schemas.microsoft.com/office/drawing/2016/5/12/chartex" xmlns:cx7="http://schemas.microsoft.com/office/drawing/2016/5/13/chartex" xmlns:cx8="http://schemas.microsoft.com/office/drawing/2016/5/14/chartex" xmlns:mc="http://schemas.openxmlformats.org/markup-compatibility/2006" xmlns:aink="http://schemas.microsoft.com/office/drawing/2016/ink" xmlns:am3d="http://schemas.microsoft.com/office/drawing/2017/model3d" xmlns:o="urn:schemas-microsoft-com:office:office" xmlns:oel="http://schemas.microsoft.com/office/2019/extlst" xmlns:r="http://schemas.openxmlformats.org/officeDocument/2006/relationships" xmlns:m="http://schemas.openxmlformats.org/officeDocument/2006/math" xmlns:v="urn:schemas-microsoft-com:vml" xmlns:wp14="http://schemas.microsoft.com/office/word/2010/wordprocessingDrawing" xmlns:wp="http://schemas.openxmlformats.org/drawingml/2006/wordprocessingDrawing" xmlns:w10="urn:schemas-microsoft-com:office:word" xmlns:w="http://schemas.openxmlformats.org/wordprocessingml/2006/main" xmlns:w14="http://schemas.microsoft.com/office/word/2010/wordml" xmlns:w15="http://schemas.microsoft.com/office/word/2012/wordml" xmlns:w16cex="http://schemas.microsoft.com/office/word/2018/wordml/cex" xmlns:w16cid="http://schemas.microsoft.com/office/word/2016/wordml/cid" xmlns:w16="http://schemas.microsoft.com/office/word/2018/wordml" xmlns:w16sdtdh="http://schemas.microsoft.com/office/word/2020/wordml/sdtdatahash" xmlns:w16se="http://schemas.microsoft.com/office/word/2015/wordml/symex" xmlns:wpg="http://schemas.microsoft.com/office/word/2010/wordprocessingGroup" xmlns:wpi="http://schemas.microsoft.com/office/word/2010/wordprocessingInk" xmlns:wne="http://schemas.microsoft.com/office/word/2006/wordml" xmlns:wps="http://schemas.microsoft.com/office/word/2010/wordprocessingShape" mc:Ignorable="w14 w15 w16se w16cid w16 w16cex w16sdtdh wp14">
   <w:abstractNum w:abstractNumId="0" w15:restartNumberingAfterBreak="0">
     <w:nsid w:val="0C2A4E2B"/>
     <w:multiLevelType w:val="hybridMultilevel"/>
@@ -3262,7 +2234,7 @@
 </file>
 
 <file path=word/people.xml><?xml version="1.0" encoding="utf-8"?>
-<w15:people xmlns:wpc="http://schemas.microsoft.com/office/word/2010/wordprocessingCanvas" xmlns:cx="http://schemas.microsoft.com/office/drawing/2014/chartex" xmlns:cx1="http://schemas.microsoft.com/office/drawing/2015/9/8/chartex" xmlns:cx2="http://schemas.microsoft.com/office/drawing/2015/10/21/chartex" xmlns:cx3="http://schemas.microsoft.com/office/drawing/2016/5/9/chartex" xmlns:cx4="http://schemas.microsoft.com/office/drawing/2016/5/10/chartex" xmlns:cx5="http://schemas.microsoft.com/office/drawing/2016/5/11/chartex" xmlns:cx6="http://schemas.microsoft.com/office/drawing/2016/5/12/chartex" xmlns:cx7="http://schemas.microsoft.com/office/drawing/2016/5/13/chartex" xmlns:cx8="http://schemas.microsoft.com/office/drawing/2016/5/14/chartex" xmlns:mc="http://schemas.openxmlformats.org/markup-compatibility/2006" xmlns:aink="http://schemas.microsoft.com/office/drawing/2016/ink" xmlns:am3d="http://schemas.microsoft.com/office/drawing/2017/model3d" xmlns:o="urn:schemas-microsoft-com:office:office" xmlns:oel="http://schemas.microsoft.com/office/2019/extlst" xmlns:r="http://schemas.openxmlformats.org/officeDocument/2006/relationships" xmlns:m="http://schemas.openxmlformats.org/officeDocument/2006/math" xmlns:v="urn:schemas-microsoft-com:vml" xmlns:wp14="http://schemas.microsoft.com/office/word/2010/wordprocessingDrawing" xmlns:wp="http://schemas.openxmlformats.org/drawingml/2006/wordprocessingDrawing" xmlns:w10="urn:schemas-microsoft-com:office:word" xmlns:w="http://schemas.openxmlformats.org/wordprocessingml/2006/main" xmlns:w14="http://schemas.microsoft.com/office/word/2010/wordml" xmlns:w15="http://schemas.microsoft.com/office/word/2012/wordml" xmlns:w16cex="http://schemas.microsoft.com/office/word/2018/wordml/cex" xmlns:w16cid="http://schemas.microsoft.com/office/word/2016/wordml/cid" xmlns:w16="http://schemas.microsoft.com/office/word/2018/wordml" xmlns:w16du="http://schemas.microsoft.com/office/word/2023/wordml/word16du" xmlns:w16sdtdh="http://schemas.microsoft.com/office/word/2020/wordml/sdtdatahash" xmlns:w16sdtfl="http://schemas.microsoft.com/office/word/2024/wordml/sdtformatlock" xmlns:w16se="http://schemas.microsoft.com/office/word/2015/wordml/symex" xmlns:wpg="http://schemas.microsoft.com/office/word/2010/wordprocessingGroup" xmlns:wpi="http://schemas.microsoft.com/office/word/2010/wordprocessingInk" xmlns:wne="http://schemas.microsoft.com/office/word/2006/wordml" xmlns:wps="http://schemas.microsoft.com/office/word/2010/wordprocessingShape" mc:Ignorable="w14 w15 w16se w16cid w16 w16cex w16sdtdh w16sdtfl w16du wp14">
+<w15:people xmlns:wpc="http://schemas.microsoft.com/office/word/2010/wordprocessingCanvas" xmlns:cx="http://schemas.microsoft.com/office/drawing/2014/chartex" xmlns:cx1="http://schemas.microsoft.com/office/drawing/2015/9/8/chartex" xmlns:cx2="http://schemas.microsoft.com/office/drawing/2015/10/21/chartex" xmlns:cx3="http://schemas.microsoft.com/office/drawing/2016/5/9/chartex" xmlns:cx4="http://schemas.microsoft.com/office/drawing/2016/5/10/chartex" xmlns:cx5="http://schemas.microsoft.com/office/drawing/2016/5/11/chartex" xmlns:cx6="http://schemas.microsoft.com/office/drawing/2016/5/12/chartex" xmlns:cx7="http://schemas.microsoft.com/office/drawing/2016/5/13/chartex" xmlns:cx8="http://schemas.microsoft.com/office/drawing/2016/5/14/chartex" xmlns:mc="http://schemas.openxmlformats.org/markup-compatibility/2006" xmlns:aink="http://schemas.microsoft.com/office/drawing/2016/ink" xmlns:am3d="http://schemas.microsoft.com/office/drawing/2017/model3d" xmlns:o="urn:schemas-microsoft-com:office:office" xmlns:oel="http://schemas.microsoft.com/office/2019/extlst" xmlns:r="http://schemas.openxmlformats.org/officeDocument/2006/relationships" xmlns:m="http://schemas.openxmlformats.org/officeDocument/2006/math" xmlns:v="urn:schemas-microsoft-com:vml" xmlns:wp14="http://schemas.microsoft.com/office/word/2010/wordprocessingDrawing" xmlns:wp="http://schemas.openxmlformats.org/drawingml/2006/wordprocessingDrawing" xmlns:w10="urn:schemas-microsoft-com:office:word" xmlns:w="http://schemas.openxmlformats.org/wordprocessingml/2006/main" xmlns:w14="http://schemas.microsoft.com/office/word/2010/wordml" xmlns:w15="http://schemas.microsoft.com/office/word/2012/wordml" xmlns:w16cex="http://schemas.microsoft.com/office/word/2018/wordml/cex" xmlns:w16cid="http://schemas.microsoft.com/office/word/2016/wordml/cid" xmlns:w16="http://schemas.microsoft.com/office/word/2018/wordml" xmlns:w16sdtdh="http://schemas.microsoft.com/office/word/2020/wordml/sdtdatahash" xmlns:w16se="http://schemas.microsoft.com/office/word/2015/wordml/symex" xmlns:wpg="http://schemas.microsoft.com/office/word/2010/wordprocessingGroup" xmlns:wpi="http://schemas.microsoft.com/office/word/2010/wordprocessingInk" xmlns:wne="http://schemas.microsoft.com/office/word/2006/wordml" xmlns:wps="http://schemas.microsoft.com/office/word/2010/wordprocessingShape" mc:Ignorable="w14 w15 w16se w16cid w16 w16cex w16sdtdh wp14">
   <w15:person w15:author="Пользователь">
     <w15:presenceInfo w15:providerId="None" w15:userId="Пользователь"/>
   </w15:person>
@@ -3270,7 +2242,7 @@
 </file>
 
 <file path=word/styles.xml><?xml version="1.0" encoding="utf-8"?>
-<w:styles xmlns:mc="http://schemas.openxmlformats.org/markup-compatibility/2006" xmlns:r="http://schemas.openxmlformats.org/officeDocument/2006/relationships" xmlns:w="http://schemas.openxmlformats.org/wordprocessingml/2006/main" xmlns:w14="http://schemas.microsoft.com/office/word/2010/wordml" xmlns:w15="http://schemas.microsoft.com/office/word/2012/wordml" xmlns:w16cex="http://schemas.microsoft.com/office/word/2018/wordml/cex" xmlns:w16cid="http://schemas.microsoft.com/office/word/2016/wordml/cid" xmlns:w16="http://schemas.microsoft.com/office/word/2018/wordml" xmlns:w16du="http://schemas.microsoft.com/office/word/2023/wordml/word16du" xmlns:w16sdtdh="http://schemas.microsoft.com/office/word/2020/wordml/sdtdatahash" xmlns:w16sdtfl="http://schemas.microsoft.com/office/word/2024/wordml/sdtformatlock" xmlns:w16se="http://schemas.microsoft.com/office/word/2015/wordml/symex" mc:Ignorable="w14 w15 w16se w16cid w16 w16cex w16sdtdh w16sdtfl w16du">
+<w:styles xmlns:mc="http://schemas.openxmlformats.org/markup-compatibility/2006" xmlns:r="http://schemas.openxmlformats.org/officeDocument/2006/relationships" xmlns:w="http://schemas.openxmlformats.org/wordprocessingml/2006/main" xmlns:w14="http://schemas.microsoft.com/office/word/2010/wordml" xmlns:w15="http://schemas.microsoft.com/office/word/2012/wordml" xmlns:w16cex="http://schemas.microsoft.com/office/word/2018/wordml/cex" xmlns:w16cid="http://schemas.microsoft.com/office/word/2016/wordml/cid" xmlns:w16="http://schemas.microsoft.com/office/word/2018/wordml" xmlns:w16sdtdh="http://schemas.microsoft.com/office/word/2020/wordml/sdtdatahash" xmlns:w16se="http://schemas.microsoft.com/office/word/2015/wordml/symex" mc:Ignorable="w14 w15 w16se w16cid w16 w16cex w16sdtdh">
   <w:docDefaults>
     <w:rPrDefault>
       <w:rPr>
@@ -3914,40 +2886,8 @@
 </file>
 
 <file path=word/glossary/document.xml><?xml version="1.0" encoding="utf-8"?>
-<w:glossaryDocument xmlns:wpc="http://schemas.microsoft.com/office/word/2010/wordprocessingCanvas" xmlns:cx="http://schemas.microsoft.com/office/drawing/2014/chartex" xmlns:cx1="http://schemas.microsoft.com/office/drawing/2015/9/8/chartex" xmlns:cx2="http://schemas.microsoft.com/office/drawing/2015/10/21/chartex" xmlns:cx3="http://schemas.microsoft.com/office/drawing/2016/5/9/chartex" xmlns:cx4="http://schemas.microsoft.com/office/drawing/2016/5/10/chartex" xmlns:cx5="http://schemas.microsoft.com/office/drawing/2016/5/11/chartex" xmlns:cx6="http://schemas.microsoft.com/office/drawing/2016/5/12/chartex" xmlns:cx7="http://schemas.microsoft.com/office/drawing/2016/5/13/chartex" xmlns:cx8="http://schemas.microsoft.com/office/drawing/2016/5/14/chartex" xmlns:mc="http://schemas.openxmlformats.org/markup-compatibility/2006" xmlns:aink="http://schemas.microsoft.com/office/drawing/2016/ink" xmlns:am3d="http://schemas.microsoft.com/office/drawing/2017/model3d" xmlns:o="urn:schemas-microsoft-com:office:office" xmlns:oel="http://schemas.microsoft.com/office/2019/extlst" xmlns:r="http://schemas.openxmlformats.org/officeDocument/2006/relationships" xmlns:m="http://schemas.openxmlformats.org/officeDocument/2006/math" xmlns:v="urn:schemas-microsoft-com:vml" xmlns:wp14="http://schemas.microsoft.com/office/word/2010/wordprocessingDrawing" xmlns:wp="http://schemas.openxmlformats.org/drawingml/2006/wordprocessingDrawing" xmlns:w10="urn:schemas-microsoft-com:office:word" xmlns:w="http://schemas.openxmlformats.org/wordprocessingml/2006/main" xmlns:w14="http://schemas.microsoft.com/office/word/2010/wordml" xmlns:w15="http://schemas.microsoft.com/office/word/2012/wordml" xmlns:w16cex="http://schemas.microsoft.com/office/word/2018/wordml/cex" xmlns:w16cid="http://schemas.microsoft.com/office/word/2016/wordml/cid" xmlns:w16="http://schemas.microsoft.com/office/word/2018/wordml" xmlns:w16du="http://schemas.microsoft.com/office/word/2023/wordml/word16du" xmlns:w16sdtdh="http://schemas.microsoft.com/office/word/2020/wordml/sdtdatahash" xmlns:w16sdtfl="http://schemas.microsoft.com/office/word/2024/wordml/sdtformatlock" xmlns:w16se="http://schemas.microsoft.com/office/word/2015/wordml/symex" xmlns:wpg="http://schemas.microsoft.com/office/word/2010/wordprocessingGroup" xmlns:wpi="http://schemas.microsoft.com/office/word/2010/wordprocessingInk" xmlns:wne="http://schemas.microsoft.com/office/word/2006/wordml" xmlns:wps="http://schemas.microsoft.com/office/word/2010/wordprocessingShape" mc:Ignorable="w14 w15 w16se w16cid w16 w16cex w16sdtdh w16sdtfl w16du wp14">
+<w:glossaryDocument xmlns:wpc="http://schemas.microsoft.com/office/word/2010/wordprocessingCanvas" xmlns:cx="http://schemas.microsoft.com/office/drawing/2014/chartex" xmlns:cx1="http://schemas.microsoft.com/office/drawing/2015/9/8/chartex" xmlns:cx2="http://schemas.microsoft.com/office/drawing/2015/10/21/chartex" xmlns:cx3="http://schemas.microsoft.com/office/drawing/2016/5/9/chartex" xmlns:cx4="http://schemas.microsoft.com/office/drawing/2016/5/10/chartex" xmlns:cx5="http://schemas.microsoft.com/office/drawing/2016/5/11/chartex" xmlns:cx6="http://schemas.microsoft.com/office/drawing/2016/5/12/chartex" xmlns:cx7="http://schemas.microsoft.com/office/drawing/2016/5/13/chartex" xmlns:cx8="http://schemas.microsoft.com/office/drawing/2016/5/14/chartex" xmlns:mc="http://schemas.openxmlformats.org/markup-compatibility/2006" xmlns:aink="http://schemas.microsoft.com/office/drawing/2016/ink" xmlns:am3d="http://schemas.microsoft.com/office/drawing/2017/model3d" xmlns:o="urn:schemas-microsoft-com:office:office" xmlns:oel="http://schemas.microsoft.com/office/2019/extlst" xmlns:r="http://schemas.openxmlformats.org/officeDocument/2006/relationships" xmlns:m="http://schemas.openxmlformats.org/officeDocument/2006/math" xmlns:v="urn:schemas-microsoft-com:vml" xmlns:wp14="http://schemas.microsoft.com/office/word/2010/wordprocessingDrawing" xmlns:wp="http://schemas.openxmlformats.org/drawingml/2006/wordprocessingDrawing" xmlns:w10="urn:schemas-microsoft-com:office:word" xmlns:w="http://schemas.openxmlformats.org/wordprocessingml/2006/main" xmlns:w14="http://schemas.microsoft.com/office/word/2010/wordml" xmlns:w15="http://schemas.microsoft.com/office/word/2012/wordml" xmlns:w16cex="http://schemas.microsoft.com/office/word/2018/wordml/cex" xmlns:w16cid="http://schemas.microsoft.com/office/word/2016/wordml/cid" xmlns:w16="http://schemas.microsoft.com/office/word/2018/wordml" xmlns:w16sdtdh="http://schemas.microsoft.com/office/word/2020/wordml/sdtdatahash" xmlns:w16se="http://schemas.microsoft.com/office/word/2015/wordml/symex" xmlns:wpg="http://schemas.microsoft.com/office/word/2010/wordprocessingGroup" xmlns:wpi="http://schemas.microsoft.com/office/word/2010/wordprocessingInk" xmlns:wne="http://schemas.microsoft.com/office/word/2006/wordml" xmlns:wps="http://schemas.microsoft.com/office/word/2010/wordprocessingShape" mc:Ignorable="w14 w15 w16se w16cid w16 w16cex w16sdtdh wp14">
   <w:docParts>
-    <w:docPart>
-      <w:docPartPr>
-        <w:name w:val="DefaultPlaceholder_-1854013438"/>
-        <w:category>
-          <w:name w:val="Общие"/>
-          <w:gallery w:val="placeholder"/>
-        </w:category>
-        <w:types>
-          <w:type w:val="bbPlcHdr"/>
-        </w:types>
-        <w:behaviors>
-          <w:behavior w:val="content"/>
-        </w:behaviors>
-        <w:guid w:val="{793E2A43-14FB-49E7-B59F-AE9B91D497A6}"/>
-      </w:docPartPr>
-      <w:docPartBody>
-        <w:p>
-          <w:r>
-            <w:rPr>
-              <w:rStyle w:val="a3"/>
-              <w:rPrChange w:id="0" w:author="Пользователь" w:date="2023-10-18T14:59:00Z">
-                <w:rPr>
-                  <w:rFonts w:eastAsiaTheme="minorHAnsi"/>
-                  <w:lang w:eastAsia="en-US"/>
-                </w:rPr>
-              </w:rPrChange>
-            </w:rPr>
-            <w:t>Выберите элемент.</w:t>
-          </w:r>
-        </w:p>
-      </w:docPartBody>
-    </w:docPart>
     <w:docPart>
       <w:docPartPr>
         <w:name w:val="BB2234AC01A84EF6B6CE2A14EBA6134A"/>
@@ -3971,7 +2911,7 @@
           <w:r>
             <w:rPr>
               <w:rStyle w:val="a3"/>
-              <w:rPrChange w:id="1" w:author="Пользователь" w:date="2023-10-18T14:59:00Z">
+              <w:rPrChange w:id="0" w:author="Пользователь" w:date="2023-10-18T14:59:00Z">
                 <w:rPr>
                   <w:rFonts w:eastAsiaTheme="minorHAnsi"/>
                   <w:lang w:eastAsia="en-US"/>
@@ -3988,10 +2928,10 @@
 </file>
 
 <file path=word/glossary/fontTable.xml><?xml version="1.0" encoding="utf-8"?>
-<w:fonts xmlns:mc="http://schemas.openxmlformats.org/markup-compatibility/2006" xmlns:r="http://schemas.openxmlformats.org/officeDocument/2006/relationships" xmlns:w="http://schemas.openxmlformats.org/wordprocessingml/2006/main" xmlns:w14="http://schemas.microsoft.com/office/word/2010/wordml" xmlns:w15="http://schemas.microsoft.com/office/word/2012/wordml" xmlns:w16cex="http://schemas.microsoft.com/office/word/2018/wordml/cex" xmlns:w16cid="http://schemas.microsoft.com/office/word/2016/wordml/cid" xmlns:w16="http://schemas.microsoft.com/office/word/2018/wordml" xmlns:w16du="http://schemas.microsoft.com/office/word/2023/wordml/word16du" xmlns:w16sdtdh="http://schemas.microsoft.com/office/word/2020/wordml/sdtdatahash" xmlns:w16sdtfl="http://schemas.microsoft.com/office/word/2024/wordml/sdtformatlock" xmlns:w16se="http://schemas.microsoft.com/office/word/2015/wordml/symex" mc:Ignorable="w14 w15 w16se w16cid w16 w16cex w16sdtdh w16sdtfl w16du">
+<w:fonts xmlns:mc="http://schemas.openxmlformats.org/markup-compatibility/2006" xmlns:r="http://schemas.openxmlformats.org/officeDocument/2006/relationships" xmlns:w="http://schemas.openxmlformats.org/wordprocessingml/2006/main" xmlns:w14="http://schemas.microsoft.com/office/word/2010/wordml" xmlns:w15="http://schemas.microsoft.com/office/word/2012/wordml" xmlns:w16cex="http://schemas.microsoft.com/office/word/2018/wordml/cex" xmlns:w16cid="http://schemas.microsoft.com/office/word/2016/wordml/cid" xmlns:w16="http://schemas.microsoft.com/office/word/2018/wordml" xmlns:w16sdtdh="http://schemas.microsoft.com/office/word/2020/wordml/sdtdatahash" xmlns:w16se="http://schemas.microsoft.com/office/word/2015/wordml/symex" mc:Ignorable="w14 w15 w16se w16cid w16 w16cex w16sdtdh">
   <w:font w:name="Times New Roman">
     <w:panose1 w:val="02020603050405020304"/>
-    <w:charset w:val="CC"/>
+    <w:charset w:val="00"/>
     <w:family w:val="roman"/>
     <w:pitch w:val="variable"/>
     <w:sig w:usb0="E0002EFF" w:usb1="C000785B" w:usb2="00000009" w:usb3="00000000" w:csb0="000001FF" w:csb1="00000000"/>
@@ -4022,7 +2962,7 @@
     <w:charset w:val="CC"/>
     <w:family w:val="swiss"/>
     <w:pitch w:val="variable"/>
-    <w:sig w:usb0="E4002EFF" w:usb1="C000247B" w:usb2="00000009" w:usb3="00000000" w:csb0="000001FF" w:csb1="00000000"/>
+    <w:sig w:usb0="E4002EFF" w:usb1="C200247B" w:usb2="00000009" w:usb3="00000000" w:csb0="000001FF" w:csb1="00000000"/>
   </w:font>
   <w:font w:name="Cambria">
     <w:panose1 w:val="02040503050406030204"/>
@@ -4047,18 +2987,23 @@
     <w:pitch w:val="default"/>
     <w:sig w:usb0="00000001" w:usb1="08070000" w:usb2="00000010" w:usb3="00000000" w:csb0="00020000" w:csb1="00000000"/>
   </w:font>
-  <w:font w:name="Calibri Light">
-    <w:panose1 w:val="020F0302020204030204"/>
-    <w:charset w:val="CC"/>
+  <w:font w:name="Aptos">
+    <w:charset w:val="00"/>
     <w:family w:val="swiss"/>
     <w:pitch w:val="variable"/>
-    <w:sig w:usb0="E4002EFF" w:usb1="C000247B" w:usb2="00000009" w:usb3="00000000" w:csb0="000001FF" w:csb1="00000000"/>
+    <w:sig w:usb0="20000287" w:usb1="00000003" w:usb2="00000000" w:usb3="00000000" w:csb0="0000019F" w:csb1="00000000"/>
+  </w:font>
+  <w:font w:name="Aptos Display">
+    <w:charset w:val="00"/>
+    <w:family w:val="swiss"/>
+    <w:pitch w:val="variable"/>
+    <w:sig w:usb0="20000287" w:usb1="00000003" w:usb2="00000000" w:usb3="00000000" w:csb0="0000019F" w:csb1="00000000"/>
   </w:font>
 </w:fonts>
 </file>
 
 <file path=word/glossary/settings.xml><?xml version="1.0" encoding="utf-8"?>
-<w:settings xmlns:mc="http://schemas.openxmlformats.org/markup-compatibility/2006" xmlns:o="urn:schemas-microsoft-com:office:office" xmlns:r="http://schemas.openxmlformats.org/officeDocument/2006/relationships" xmlns:m="http://schemas.openxmlformats.org/officeDocument/2006/math" xmlns:v="urn:schemas-microsoft-com:vml" xmlns:w10="urn:schemas-microsoft-com:office:word" xmlns:w="http://schemas.openxmlformats.org/wordprocessingml/2006/main" xmlns:w14="http://schemas.microsoft.com/office/word/2010/wordml" xmlns:w15="http://schemas.microsoft.com/office/word/2012/wordml" xmlns:w16cex="http://schemas.microsoft.com/office/word/2018/wordml/cex" xmlns:w16cid="http://schemas.microsoft.com/office/word/2016/wordml/cid" xmlns:w16="http://schemas.microsoft.com/office/word/2018/wordml" xmlns:w16du="http://schemas.microsoft.com/office/word/2023/wordml/word16du" xmlns:w16sdtdh="http://schemas.microsoft.com/office/word/2020/wordml/sdtdatahash" xmlns:w16sdtfl="http://schemas.microsoft.com/office/word/2024/wordml/sdtformatlock" xmlns:w16se="http://schemas.microsoft.com/office/word/2015/wordml/symex" xmlns:sl="http://schemas.openxmlformats.org/schemaLibrary/2006/main" mc:Ignorable="w14 w15 w16se w16cid w16 w16cex w16sdtdh w16sdtfl w16du">
+<w:settings xmlns:mc="http://schemas.openxmlformats.org/markup-compatibility/2006" xmlns:o="urn:schemas-microsoft-com:office:office" xmlns:r="http://schemas.openxmlformats.org/officeDocument/2006/relationships" xmlns:m="http://schemas.openxmlformats.org/officeDocument/2006/math" xmlns:v="urn:schemas-microsoft-com:vml" xmlns:w10="urn:schemas-microsoft-com:office:word" xmlns:w="http://schemas.openxmlformats.org/wordprocessingml/2006/main" xmlns:w14="http://schemas.microsoft.com/office/word/2010/wordml" xmlns:w15="http://schemas.microsoft.com/office/word/2012/wordml" xmlns:w16cex="http://schemas.microsoft.com/office/word/2018/wordml/cex" xmlns:w16cid="http://schemas.microsoft.com/office/word/2016/wordml/cid" xmlns:w16="http://schemas.microsoft.com/office/word/2018/wordml" xmlns:w16sdtdh="http://schemas.microsoft.com/office/word/2020/wordml/sdtdatahash" xmlns:w16se="http://schemas.microsoft.com/office/word/2015/wordml/symex" xmlns:sl="http://schemas.openxmlformats.org/schemaLibrary/2006/main" mc:Ignorable="w14 w15 w16se w16cid w16 w16cex w16sdtdh">
   <w:view w:val="normal"/>
   <w:defaultTabStop w:val="708"/>
   <w:characterSpacingControl w:val="doNotCompress"/>
@@ -4073,7 +3018,9 @@
   </w:compat>
   <w:rsids>
     <w:rsidRoot w:val="00280E18"/>
+    <w:rsid w:val="0002511B"/>
     <w:rsid w:val="00053E6C"/>
+    <w:rsid w:val="000E61DC"/>
     <w:rsid w:val="0016364E"/>
     <w:rsid w:val="0019691B"/>
     <w:rsid w:val="001D2707"/>
@@ -4096,6 +3043,7 @@
     <w:rsid w:val="008D3DC0"/>
     <w:rsid w:val="00925BA9"/>
     <w:rsid w:val="00A54695"/>
+    <w:rsid w:val="00A85E66"/>
     <w:rsid w:val="00AA22F9"/>
     <w:rsid w:val="00B12948"/>
     <w:rsid w:val="00C22F69"/>
@@ -4133,7 +3081,7 @@
 </file>
 
 <file path=word/glossary/styles.xml><?xml version="1.0" encoding="utf-8"?>
-<w:styles xmlns:mc="http://schemas.openxmlformats.org/markup-compatibility/2006" xmlns:r="http://schemas.openxmlformats.org/officeDocument/2006/relationships" xmlns:w="http://schemas.openxmlformats.org/wordprocessingml/2006/main" xmlns:w14="http://schemas.microsoft.com/office/word/2010/wordml" xmlns:w15="http://schemas.microsoft.com/office/word/2012/wordml" xmlns:w16cex="http://schemas.microsoft.com/office/word/2018/wordml/cex" xmlns:w16cid="http://schemas.microsoft.com/office/word/2016/wordml/cid" xmlns:w16="http://schemas.microsoft.com/office/word/2018/wordml" xmlns:w16du="http://schemas.microsoft.com/office/word/2023/wordml/word16du" xmlns:w16sdtdh="http://schemas.microsoft.com/office/word/2020/wordml/sdtdatahash" xmlns:w16sdtfl="http://schemas.microsoft.com/office/word/2024/wordml/sdtformatlock" xmlns:w16se="http://schemas.microsoft.com/office/word/2015/wordml/symex" mc:Ignorable="w14 w15 w16se w16cid w16 w16cex w16sdtdh w16sdtfl w16du">
+<w:styles xmlns:mc="http://schemas.openxmlformats.org/markup-compatibility/2006" xmlns:r="http://schemas.openxmlformats.org/officeDocument/2006/relationships" xmlns:w="http://schemas.openxmlformats.org/wordprocessingml/2006/main" xmlns:w14="http://schemas.microsoft.com/office/word/2010/wordml" xmlns:w15="http://schemas.microsoft.com/office/word/2012/wordml" xmlns:w16cex="http://schemas.microsoft.com/office/word/2018/wordml/cex" xmlns:w16cid="http://schemas.microsoft.com/office/word/2016/wordml/cid" xmlns:w16="http://schemas.microsoft.com/office/word/2018/wordml" xmlns:w16sdtdh="http://schemas.microsoft.com/office/word/2020/wordml/sdtdatahash" xmlns:w16se="http://schemas.microsoft.com/office/word/2015/wordml/symex" mc:Ignorable="w14 w15 w16se w16cid w16 w16cex w16sdtdh">
   <w:docDefaults>
     <w:rPrDefault>
       <w:rPr>
@@ -4565,22 +3513,14 @@
     <w:basedOn w:val="a0"/>
     <w:uiPriority w:val="99"/>
     <w:semiHidden/>
-    <w:rsid w:val="00627D49"/>
+    <w:rsid w:val="0002511B"/>
     <w:rPr>
       <w:color w:val="808080"/>
     </w:rPr>
   </w:style>
-  <w:style w:type="paragraph" w:customStyle="1" w:styleId="6895544D44F74F598EC6DE31EEFE0B78">
-    <w:name w:val="6895544D44F74F598EC6DE31EEFE0B78"/>
-    <w:rsid w:val="00F77E3E"/>
-    <w:rPr>
-      <w:kern w:val="0"/>
-      <w14:ligatures w14:val="none"/>
-    </w:rPr>
-  </w:style>
-  <w:style w:type="paragraph" w:customStyle="1" w:styleId="4F980654F7BC48C6A8D1B95E9B88296E">
-    <w:name w:val="4F980654F7BC48C6A8D1B95E9B88296E"/>
-    <w:rsid w:val="00627D49"/>
+  <w:style w:type="paragraph" w:customStyle="1" w:styleId="60E19D88698A411E9BCE424191737E2D">
+    <w:name w:val="60E19D88698A411E9BCE424191737E2D"/>
+    <w:rsid w:val="0002511B"/>
     <w:pPr>
       <w:spacing w:line="278" w:lineRule="auto"/>
     </w:pPr>
@@ -4604,7 +3544,7 @@
 </file>
 
 <file path=word/glossary/webSettings.xml><?xml version="1.0" encoding="utf-8"?>
-<w:webSettings xmlns:mc="http://schemas.openxmlformats.org/markup-compatibility/2006" xmlns:r="http://schemas.openxmlformats.org/officeDocument/2006/relationships" xmlns:w="http://schemas.openxmlformats.org/wordprocessingml/2006/main" xmlns:w14="http://schemas.microsoft.com/office/word/2010/wordml" xmlns:w15="http://schemas.microsoft.com/office/word/2012/wordml" xmlns:w16cex="http://schemas.microsoft.com/office/word/2018/wordml/cex" xmlns:w16cid="http://schemas.microsoft.com/office/word/2016/wordml/cid" xmlns:w16="http://schemas.microsoft.com/office/word/2018/wordml" xmlns:w16du="http://schemas.microsoft.com/office/word/2023/wordml/word16du" xmlns:w16sdtdh="http://schemas.microsoft.com/office/word/2020/wordml/sdtdatahash" xmlns:w16sdtfl="http://schemas.microsoft.com/office/word/2024/wordml/sdtformatlock" xmlns:w16se="http://schemas.microsoft.com/office/word/2015/wordml/symex" mc:Ignorable="w14 w15 w16se w16cid w16 w16cex w16sdtdh w16sdtfl w16du">
+<w:webSettings xmlns:mc="http://schemas.openxmlformats.org/markup-compatibility/2006" xmlns:r="http://schemas.openxmlformats.org/officeDocument/2006/relationships" xmlns:w="http://schemas.openxmlformats.org/wordprocessingml/2006/main" xmlns:w14="http://schemas.microsoft.com/office/word/2010/wordml" xmlns:w15="http://schemas.microsoft.com/office/word/2012/wordml" xmlns:w16cex="http://schemas.microsoft.com/office/word/2018/wordml/cex" xmlns:w16cid="http://schemas.microsoft.com/office/word/2016/wordml/cid" xmlns:w16="http://schemas.microsoft.com/office/word/2018/wordml" xmlns:w16sdtdh="http://schemas.microsoft.com/office/word/2020/wordml/sdtdatahash" xmlns:w16se="http://schemas.microsoft.com/office/word/2015/wordml/symex" mc:Ignorable="w14 w15 w16se w16cid w16 w16cex w16sdtdh">
   <w:optimizeForBrowser/>
   <w:allowPNG/>
 </w:webSettings>

</xml_diff>

<commit_message>
Fresh approval sheet template
</commit_message>
<xml_diff>
--- a/backend/templates/approval_sheet.docx
+++ b/backend/templates/approval_sheet.docx
@@ -1,5 +1,5 @@
 
-<file path=doc.xml><?xml version="1.0" encoding="utf-8"?>
+<file path=word/document.xml><?xml version="1.0" encoding="utf-8"?>
 <w:document xmlns:wpc="http://schemas.microsoft.com/office/word/2010/wordprocessingCanvas" xmlns:cx="http://schemas.microsoft.com/office/drawing/2014/chartex" xmlns:cx1="http://schemas.microsoft.com/office/drawing/2015/9/8/chartex" xmlns:cx2="http://schemas.microsoft.com/office/drawing/2015/10/21/chartex" xmlns:cx3="http://schemas.microsoft.com/office/drawing/2016/5/9/chartex" xmlns:cx4="http://schemas.microsoft.com/office/drawing/2016/5/10/chartex" xmlns:cx5="http://schemas.microsoft.com/office/drawing/2016/5/11/chartex" xmlns:cx6="http://schemas.microsoft.com/office/drawing/2016/5/12/chartex" xmlns:cx7="http://schemas.microsoft.com/office/drawing/2016/5/13/chartex" xmlns:cx8="http://schemas.microsoft.com/office/drawing/2016/5/14/chartex" xmlns:mc="http://schemas.openxmlformats.org/markup-compatibility/2006" xmlns:aink="http://schemas.microsoft.com/office/drawing/2016/ink" xmlns:am3d="http://schemas.microsoft.com/office/drawing/2017/model3d" xmlns:o="urn:schemas-microsoft-com:office:office" xmlns:oel="http://schemas.microsoft.com/office/2019/extlst" xmlns:r="http://schemas.openxmlformats.org/officeDocument/2006/relationships" xmlns:m="http://schemas.openxmlformats.org/officeDocument/2006/math" xmlns:v="urn:schemas-microsoft-com:vml" xmlns:wp14="http://schemas.microsoft.com/office/word/2010/wordprocessingDrawing" xmlns:wp="http://schemas.openxmlformats.org/drawingml/2006/wordprocessingDrawing" xmlns:w10="urn:schemas-microsoft-com:office:word" xmlns:w="http://schemas.openxmlformats.org/wordprocessingml/2006/main" xmlns:w14="http://schemas.microsoft.com/office/word/2010/wordml" xmlns:w15="http://schemas.microsoft.com/office/word/2012/wordml" xmlns:w16cex="http://schemas.microsoft.com/office/word/2018/wordml/cex" xmlns:w16cid="http://schemas.microsoft.com/office/word/2016/wordml/cid" xmlns:w16="http://schemas.microsoft.com/office/word/2018/wordml" xmlns:w16du="http://schemas.microsoft.com/office/word/2023/wordml/word16du" xmlns:w16sdtdh="http://schemas.microsoft.com/office/word/2020/wordml/sdtdatahash" xmlns:w16sdtfl="http://schemas.microsoft.com/office/word/2024/wordml/sdtformatlock" xmlns:w16se="http://schemas.microsoft.com/office/word/2015/wordml/symex" xmlns:wpg="http://schemas.microsoft.com/office/word/2010/wordprocessingGroup" xmlns:wpi="http://schemas.microsoft.com/office/word/2010/wordprocessingInk" xmlns:wne="http://schemas.microsoft.com/office/word/2006/wordml" xmlns:wps="http://schemas.microsoft.com/office/word/2010/wordprocessingShape" mc:Ignorable="w14 w15 w16se w16cid w16 w16cex w16sdtdh w16sdtfl w16du wp14">
   <w:body>
     <w:tbl>
@@ -1619,4 +1619,2013 @@
     </w:sectPr>
   </w:body>
 </w:document>
+</file>
+
+<file path=word/endnotes.xml><?xml version="1.0" encoding="utf-8"?>
+<w:endnotes xmlns:wpc="http://schemas.microsoft.com/office/word/2010/wordprocessingCanvas" xmlns:cx="http://schemas.microsoft.com/office/drawing/2014/chartex" xmlns:cx1="http://schemas.microsoft.com/office/drawing/2015/9/8/chartex" xmlns:cx2="http://schemas.microsoft.com/office/drawing/2015/10/21/chartex" xmlns:cx3="http://schemas.microsoft.com/office/drawing/2016/5/9/chartex" xmlns:cx4="http://schemas.microsoft.com/office/drawing/2016/5/10/chartex" xmlns:cx5="http://schemas.microsoft.com/office/drawing/2016/5/11/chartex" xmlns:cx6="http://schemas.microsoft.com/office/drawing/2016/5/12/chartex" xmlns:cx7="http://schemas.microsoft.com/office/drawing/2016/5/13/chartex" xmlns:cx8="http://schemas.microsoft.com/office/drawing/2016/5/14/chartex" xmlns:mc="http://schemas.openxmlformats.org/markup-compatibility/2006" xmlns:aink="http://schemas.microsoft.com/office/drawing/2016/ink" xmlns:am3d="http://schemas.microsoft.com/office/drawing/2017/model3d" xmlns:o="urn:schemas-microsoft-com:office:office" xmlns:oel="http://schemas.microsoft.com/office/2019/extlst" xmlns:r="http://schemas.openxmlformats.org/officeDocument/2006/relationships" xmlns:m="http://schemas.openxmlformats.org/officeDocument/2006/math" xmlns:v="urn:schemas-microsoft-com:vml" xmlns:wp14="http://schemas.microsoft.com/office/word/2010/wordprocessingDrawing" xmlns:wp="http://schemas.openxmlformats.org/drawingml/2006/wordprocessingDrawing" xmlns:w10="urn:schemas-microsoft-com:office:word" xmlns:w="http://schemas.openxmlformats.org/wordprocessingml/2006/main" xmlns:w14="http://schemas.microsoft.com/office/word/2010/wordml" xmlns:w15="http://schemas.microsoft.com/office/word/2012/wordml" xmlns:w16cex="http://schemas.microsoft.com/office/word/2018/wordml/cex" xmlns:w16cid="http://schemas.microsoft.com/office/word/2016/wordml/cid" xmlns:w16="http://schemas.microsoft.com/office/word/2018/wordml" xmlns:w16du="http://schemas.microsoft.com/office/word/2023/wordml/word16du" xmlns:w16sdtdh="http://schemas.microsoft.com/office/word/2020/wordml/sdtdatahash" xmlns:w16sdtfl="http://schemas.microsoft.com/office/word/2024/wordml/sdtformatlock" xmlns:w16se="http://schemas.microsoft.com/office/word/2015/wordml/symex" xmlns:wpg="http://schemas.microsoft.com/office/word/2010/wordprocessingGroup" xmlns:wpi="http://schemas.microsoft.com/office/word/2010/wordprocessingInk" xmlns:wne="http://schemas.microsoft.com/office/word/2006/wordml" xmlns:wps="http://schemas.microsoft.com/office/word/2010/wordprocessingShape" mc:Ignorable="w14 w15 w16se w16cid w16 w16cex w16sdtdh w16sdtfl w16du wp14">
+  <w:endnote w:type="separator" w:id="-1">
+    <w:p>
+      <w:r>
+        <w:separator/>
+      </w:r>
+    </w:p>
+  </w:endnote>
+  <w:endnote w:type="continuationSeparator" w:id="0">
+    <w:p>
+      <w:r>
+        <w:continuationSeparator/>
+      </w:r>
+    </w:p>
+  </w:endnote>
+</w:endnotes>
+</file>
+
+<file path=word/footnotes.xml><?xml version="1.0" encoding="utf-8"?>
+<w:footnotes xmlns:wpc="http://schemas.microsoft.com/office/word/2010/wordprocessingCanvas" xmlns:cx="http://schemas.microsoft.com/office/drawing/2014/chartex" xmlns:cx1="http://schemas.microsoft.com/office/drawing/2015/9/8/chartex" xmlns:cx2="http://schemas.microsoft.com/office/drawing/2015/10/21/chartex" xmlns:cx3="http://schemas.microsoft.com/office/drawing/2016/5/9/chartex" xmlns:cx4="http://schemas.microsoft.com/office/drawing/2016/5/10/chartex" xmlns:cx5="http://schemas.microsoft.com/office/drawing/2016/5/11/chartex" xmlns:cx6="http://schemas.microsoft.com/office/drawing/2016/5/12/chartex" xmlns:cx7="http://schemas.microsoft.com/office/drawing/2016/5/13/chartex" xmlns:cx8="http://schemas.microsoft.com/office/drawing/2016/5/14/chartex" xmlns:mc="http://schemas.openxmlformats.org/markup-compatibility/2006" xmlns:aink="http://schemas.microsoft.com/office/drawing/2016/ink" xmlns:am3d="http://schemas.microsoft.com/office/drawing/2017/model3d" xmlns:o="urn:schemas-microsoft-com:office:office" xmlns:oel="http://schemas.microsoft.com/office/2019/extlst" xmlns:r="http://schemas.openxmlformats.org/officeDocument/2006/relationships" xmlns:m="http://schemas.openxmlformats.org/officeDocument/2006/math" xmlns:v="urn:schemas-microsoft-com:vml" xmlns:wp14="http://schemas.microsoft.com/office/word/2010/wordprocessingDrawing" xmlns:wp="http://schemas.openxmlformats.org/drawingml/2006/wordprocessingDrawing" xmlns:w10="urn:schemas-microsoft-com:office:word" xmlns:w="http://schemas.openxmlformats.org/wordprocessingml/2006/main" xmlns:w14="http://schemas.microsoft.com/office/word/2010/wordml" xmlns:w15="http://schemas.microsoft.com/office/word/2012/wordml" xmlns:w16cex="http://schemas.microsoft.com/office/word/2018/wordml/cex" xmlns:w16cid="http://schemas.microsoft.com/office/word/2016/wordml/cid" xmlns:w16="http://schemas.microsoft.com/office/word/2018/wordml" xmlns:w16du="http://schemas.microsoft.com/office/word/2023/wordml/word16du" xmlns:w16sdtdh="http://schemas.microsoft.com/office/word/2020/wordml/sdtdatahash" xmlns:w16sdtfl="http://schemas.microsoft.com/office/word/2024/wordml/sdtformatlock" xmlns:w16se="http://schemas.microsoft.com/office/word/2015/wordml/symex" xmlns:wpg="http://schemas.microsoft.com/office/word/2010/wordprocessingGroup" xmlns:wpi="http://schemas.microsoft.com/office/word/2010/wordprocessingInk" xmlns:wne="http://schemas.microsoft.com/office/word/2006/wordml" xmlns:wps="http://schemas.microsoft.com/office/word/2010/wordprocessingShape" mc:Ignorable="w14 w15 w16se w16cid w16 w16cex w16sdtdh w16sdtfl w16du wp14">
+  <w:footnote w:type="separator" w:id="-1">
+    <w:p>
+      <w:r>
+        <w:separator/>
+      </w:r>
+    </w:p>
+  </w:footnote>
+  <w:footnote w:type="continuationSeparator" w:id="0">
+    <w:p>
+      <w:r>
+        <w:continuationSeparator/>
+      </w:r>
+    </w:p>
+  </w:footnote>
+</w:footnotes>
+</file>
+
+<file path=word/header1.xml><?xml version="1.0" encoding="utf-8"?>
+<w:hdr xmlns:wpc="http://schemas.microsoft.com/office/word/2010/wordprocessingCanvas" xmlns:cx="http://schemas.microsoft.com/office/drawing/2014/chartex" xmlns:cx1="http://schemas.microsoft.com/office/drawing/2015/9/8/chartex" xmlns:cx2="http://schemas.microsoft.com/office/drawing/2015/10/21/chartex" xmlns:cx3="http://schemas.microsoft.com/office/drawing/2016/5/9/chartex" xmlns:cx4="http://schemas.microsoft.com/office/drawing/2016/5/10/chartex" xmlns:cx5="http://schemas.microsoft.com/office/drawing/2016/5/11/chartex" xmlns:cx6="http://schemas.microsoft.com/office/drawing/2016/5/12/chartex" xmlns:cx7="http://schemas.microsoft.com/office/drawing/2016/5/13/chartex" xmlns:cx8="http://schemas.microsoft.com/office/drawing/2016/5/14/chartex" xmlns:mc="http://schemas.openxmlformats.org/markup-compatibility/2006" xmlns:aink="http://schemas.microsoft.com/office/drawing/2016/ink" xmlns:am3d="http://schemas.microsoft.com/office/drawing/2017/model3d" xmlns:o="urn:schemas-microsoft-com:office:office" xmlns:oel="http://schemas.microsoft.com/office/2019/extlst" xmlns:r="http://schemas.openxmlformats.org/officeDocument/2006/relationships" xmlns:m="http://schemas.openxmlformats.org/officeDocument/2006/math" xmlns:v="urn:schemas-microsoft-com:vml" xmlns:wp14="http://schemas.microsoft.com/office/word/2010/wordprocessingDrawing" xmlns:wp="http://schemas.openxmlformats.org/drawingml/2006/wordprocessingDrawing" xmlns:w10="urn:schemas-microsoft-com:office:word" xmlns:w="http://schemas.openxmlformats.org/wordprocessingml/2006/main" xmlns:w14="http://schemas.microsoft.com/office/word/2010/wordml" xmlns:w15="http://schemas.microsoft.com/office/word/2012/wordml" xmlns:w16cex="http://schemas.microsoft.com/office/word/2018/wordml/cex" xmlns:w16cid="http://schemas.microsoft.com/office/word/2016/wordml/cid" xmlns:w16="http://schemas.microsoft.com/office/word/2018/wordml" xmlns:w16du="http://schemas.microsoft.com/office/word/2023/wordml/word16du" xmlns:w16sdtdh="http://schemas.microsoft.com/office/word/2020/wordml/sdtdatahash" xmlns:w16sdtfl="http://schemas.microsoft.com/office/word/2024/wordml/sdtformatlock" xmlns:w16se="http://schemas.microsoft.com/office/word/2015/wordml/symex" xmlns:wpg="http://schemas.microsoft.com/office/word/2010/wordprocessingGroup" xmlns:wpi="http://schemas.microsoft.com/office/word/2010/wordprocessingInk" xmlns:wne="http://schemas.microsoft.com/office/word/2006/wordml" xmlns:wps="http://schemas.microsoft.com/office/word/2010/wordprocessingShape" mc:Ignorable="w14 w15 w16se w16cid w16 w16cex w16sdtdh w16sdtfl w16du wp14">
+  <w:sdt>
+    <w:sdtPr>
+      <w:id w:val="1226567953"/>
+      <w:docPartObj>
+        <w:docPartGallery w:val="Page Numbers (Top of Page)"/>
+        <w:docPartUnique/>
+      </w:docPartObj>
+    </w:sdtPr>
+    <w:sdtContent>
+      <w:p>
+        <w:pPr>
+          <w:pStyle w:val="a6"/>
+          <w:jc w:val="center"/>
+        </w:pPr>
+        <w:r>
+          <w:fldChar w:fldCharType="begin"/>
+        </w:r>
+        <w:r>
+          <w:instrText>PAGE   \* MERGEFORMAT</w:instrText>
+        </w:r>
+        <w:r>
+          <w:fldChar w:fldCharType="separate"/>
+        </w:r>
+        <w:r>
+          <w:rPr>
+            <w:noProof/>
+          </w:rPr>
+          <w:t>2</w:t>
+        </w:r>
+        <w:r>
+          <w:fldChar w:fldCharType="end"/>
+        </w:r>
+      </w:p>
+    </w:sdtContent>
+  </w:sdt>
+  <w:p>
+    <w:pPr>
+      <w:pStyle w:val="a6"/>
+    </w:pPr>
+  </w:p>
+</w:hdr>
+</file>
+
+<file path=word/numbering.xml><?xml version="1.0" encoding="utf-8"?>
+<w:numbering xmlns:wpc="http://schemas.microsoft.com/office/word/2010/wordprocessingCanvas" xmlns:cx="http://schemas.microsoft.com/office/drawing/2014/chartex" xmlns:cx1="http://schemas.microsoft.com/office/drawing/2015/9/8/chartex" xmlns:cx2="http://schemas.microsoft.com/office/drawing/2015/10/21/chartex" xmlns:cx3="http://schemas.microsoft.com/office/drawing/2016/5/9/chartex" xmlns:cx4="http://schemas.microsoft.com/office/drawing/2016/5/10/chartex" xmlns:cx5="http://schemas.microsoft.com/office/drawing/2016/5/11/chartex" xmlns:cx6="http://schemas.microsoft.com/office/drawing/2016/5/12/chartex" xmlns:cx7="http://schemas.microsoft.com/office/drawing/2016/5/13/chartex" xmlns:cx8="http://schemas.microsoft.com/office/drawing/2016/5/14/chartex" xmlns:mc="http://schemas.openxmlformats.org/markup-compatibility/2006" xmlns:aink="http://schemas.microsoft.com/office/drawing/2016/ink" xmlns:am3d="http://schemas.microsoft.com/office/drawing/2017/model3d" xmlns:o="urn:schemas-microsoft-com:office:office" xmlns:oel="http://schemas.microsoft.com/office/2019/extlst" xmlns:r="http://schemas.openxmlformats.org/officeDocument/2006/relationships" xmlns:m="http://schemas.openxmlformats.org/officeDocument/2006/math" xmlns:v="urn:schemas-microsoft-com:vml" xmlns:wp14="http://schemas.microsoft.com/office/word/2010/wordprocessingDrawing" xmlns:wp="http://schemas.openxmlformats.org/drawingml/2006/wordprocessingDrawing" xmlns:w10="urn:schemas-microsoft-com:office:word" xmlns:w="http://schemas.openxmlformats.org/wordprocessingml/2006/main" xmlns:w14="http://schemas.microsoft.com/office/word/2010/wordml" xmlns:w15="http://schemas.microsoft.com/office/word/2012/wordml" xmlns:w16cex="http://schemas.microsoft.com/office/word/2018/wordml/cex" xmlns:w16cid="http://schemas.microsoft.com/office/word/2016/wordml/cid" xmlns:w16="http://schemas.microsoft.com/office/word/2018/wordml" xmlns:w16du="http://schemas.microsoft.com/office/word/2023/wordml/word16du" xmlns:w16sdtdh="http://schemas.microsoft.com/office/word/2020/wordml/sdtdatahash" xmlns:w16sdtfl="http://schemas.microsoft.com/office/word/2024/wordml/sdtformatlock" xmlns:w16se="http://schemas.microsoft.com/office/word/2015/wordml/symex" xmlns:wpg="http://schemas.microsoft.com/office/word/2010/wordprocessingGroup" xmlns:wpi="http://schemas.microsoft.com/office/word/2010/wordprocessingInk" xmlns:wne="http://schemas.microsoft.com/office/word/2006/wordml" xmlns:wps="http://schemas.microsoft.com/office/word/2010/wordprocessingShape" mc:Ignorable="w14 w15 w16se w16cid w16 w16cex w16sdtdh w16sdtfl w16du wp14">
+  <w:abstractNum w:abstractNumId="0" w15:restartNumberingAfterBreak="0">
+    <w:nsid w:val="0C2A4E2B"/>
+    <w:multiLevelType w:val="hybridMultilevel"/>
+    <w:tmpl w:val="17B60550"/>
+    <w:lvl w:ilvl="0" w:tplc="24505214">
+      <w:start w:val="1"/>
+      <w:numFmt w:val="decimal"/>
+      <w:lvlText w:val="%1."/>
+      <w:lvlJc w:val="left"/>
+      <w:pPr>
+        <w:ind w:left="644" w:hanging="360"/>
+      </w:pPr>
+      <w:rPr>
+        <w:b/>
+      </w:rPr>
+    </w:lvl>
+    <w:lvl w:ilvl="1" w:tplc="04190019" w:tentative="1">
+      <w:start w:val="1"/>
+      <w:numFmt w:val="lowerLetter"/>
+      <w:lvlText w:val="%2."/>
+      <w:lvlJc w:val="left"/>
+      <w:pPr>
+        <w:ind w:left="1364" w:hanging="360"/>
+      </w:pPr>
+    </w:lvl>
+    <w:lvl w:ilvl="2" w:tplc="0419001B" w:tentative="1">
+      <w:start w:val="1"/>
+      <w:numFmt w:val="lowerRoman"/>
+      <w:lvlText w:val="%3."/>
+      <w:lvlJc w:val="right"/>
+      <w:pPr>
+        <w:ind w:left="2084" w:hanging="180"/>
+      </w:pPr>
+    </w:lvl>
+    <w:lvl w:ilvl="3" w:tplc="0419000F" w:tentative="1">
+      <w:start w:val="1"/>
+      <w:numFmt w:val="decimal"/>
+      <w:lvlText w:val="%4."/>
+      <w:lvlJc w:val="left"/>
+      <w:pPr>
+        <w:ind w:left="2804" w:hanging="360"/>
+      </w:pPr>
+    </w:lvl>
+    <w:lvl w:ilvl="4" w:tplc="04190019" w:tentative="1">
+      <w:start w:val="1"/>
+      <w:numFmt w:val="lowerLetter"/>
+      <w:lvlText w:val="%5."/>
+      <w:lvlJc w:val="left"/>
+      <w:pPr>
+        <w:ind w:left="3524" w:hanging="360"/>
+      </w:pPr>
+    </w:lvl>
+    <w:lvl w:ilvl="5" w:tplc="0419001B" w:tentative="1">
+      <w:start w:val="1"/>
+      <w:numFmt w:val="lowerRoman"/>
+      <w:lvlText w:val="%6."/>
+      <w:lvlJc w:val="right"/>
+      <w:pPr>
+        <w:ind w:left="4244" w:hanging="180"/>
+      </w:pPr>
+    </w:lvl>
+    <w:lvl w:ilvl="6" w:tplc="0419000F" w:tentative="1">
+      <w:start w:val="1"/>
+      <w:numFmt w:val="decimal"/>
+      <w:lvlText w:val="%7."/>
+      <w:lvlJc w:val="left"/>
+      <w:pPr>
+        <w:ind w:left="4964" w:hanging="360"/>
+      </w:pPr>
+    </w:lvl>
+    <w:lvl w:ilvl="7" w:tplc="04190019" w:tentative="1">
+      <w:start w:val="1"/>
+      <w:numFmt w:val="lowerLetter"/>
+      <w:lvlText w:val="%8."/>
+      <w:lvlJc w:val="left"/>
+      <w:pPr>
+        <w:ind w:left="5684" w:hanging="360"/>
+      </w:pPr>
+    </w:lvl>
+    <w:lvl w:ilvl="8" w:tplc="0419001B" w:tentative="1">
+      <w:start w:val="1"/>
+      <w:numFmt w:val="lowerRoman"/>
+      <w:lvlText w:val="%9."/>
+      <w:lvlJc w:val="right"/>
+      <w:pPr>
+        <w:ind w:left="6404" w:hanging="180"/>
+      </w:pPr>
+    </w:lvl>
+  </w:abstractNum>
+  <w:abstractNum w:abstractNumId="1" w15:restartNumberingAfterBreak="0">
+    <w:nsid w:val="1A636F04"/>
+    <w:multiLevelType w:val="hybridMultilevel"/>
+    <w:tmpl w:val="9C223F1C"/>
+    <w:lvl w:ilvl="0" w:tplc="1F2AF146">
+      <w:start w:val="1"/>
+      <w:numFmt w:val="decimal"/>
+      <w:lvlText w:val="%1."/>
+      <w:lvlJc w:val="left"/>
+      <w:pPr>
+        <w:ind w:left="927" w:hanging="360"/>
+      </w:pPr>
+      <w:rPr>
+        <w:rFonts w:hint="default"/>
+        <w:b/>
+      </w:rPr>
+    </w:lvl>
+    <w:lvl w:ilvl="1" w:tplc="04190019" w:tentative="1">
+      <w:start w:val="1"/>
+      <w:numFmt w:val="lowerLetter"/>
+      <w:lvlText w:val="%2."/>
+      <w:lvlJc w:val="left"/>
+      <w:pPr>
+        <w:ind w:left="1647" w:hanging="360"/>
+      </w:pPr>
+    </w:lvl>
+    <w:lvl w:ilvl="2" w:tplc="0419001B" w:tentative="1">
+      <w:start w:val="1"/>
+      <w:numFmt w:val="lowerRoman"/>
+      <w:lvlText w:val="%3."/>
+      <w:lvlJc w:val="right"/>
+      <w:pPr>
+        <w:ind w:left="2367" w:hanging="180"/>
+      </w:pPr>
+    </w:lvl>
+    <w:lvl w:ilvl="3" w:tplc="0419000F" w:tentative="1">
+      <w:start w:val="1"/>
+      <w:numFmt w:val="decimal"/>
+      <w:lvlText w:val="%4."/>
+      <w:lvlJc w:val="left"/>
+      <w:pPr>
+        <w:ind w:left="3087" w:hanging="360"/>
+      </w:pPr>
+    </w:lvl>
+    <w:lvl w:ilvl="4" w:tplc="04190019" w:tentative="1">
+      <w:start w:val="1"/>
+      <w:numFmt w:val="lowerLetter"/>
+      <w:lvlText w:val="%5."/>
+      <w:lvlJc w:val="left"/>
+      <w:pPr>
+        <w:ind w:left="3807" w:hanging="360"/>
+      </w:pPr>
+    </w:lvl>
+    <w:lvl w:ilvl="5" w:tplc="0419001B" w:tentative="1">
+      <w:start w:val="1"/>
+      <w:numFmt w:val="lowerRoman"/>
+      <w:lvlText w:val="%6."/>
+      <w:lvlJc w:val="right"/>
+      <w:pPr>
+        <w:ind w:left="4527" w:hanging="180"/>
+      </w:pPr>
+    </w:lvl>
+    <w:lvl w:ilvl="6" w:tplc="0419000F" w:tentative="1">
+      <w:start w:val="1"/>
+      <w:numFmt w:val="decimal"/>
+      <w:lvlText w:val="%7."/>
+      <w:lvlJc w:val="left"/>
+      <w:pPr>
+        <w:ind w:left="5247" w:hanging="360"/>
+      </w:pPr>
+    </w:lvl>
+    <w:lvl w:ilvl="7" w:tplc="04190019" w:tentative="1">
+      <w:start w:val="1"/>
+      <w:numFmt w:val="lowerLetter"/>
+      <w:lvlText w:val="%8."/>
+      <w:lvlJc w:val="left"/>
+      <w:pPr>
+        <w:ind w:left="5967" w:hanging="360"/>
+      </w:pPr>
+    </w:lvl>
+    <w:lvl w:ilvl="8" w:tplc="0419001B" w:tentative="1">
+      <w:start w:val="1"/>
+      <w:numFmt w:val="lowerRoman"/>
+      <w:lvlText w:val="%9."/>
+      <w:lvlJc w:val="right"/>
+      <w:pPr>
+        <w:ind w:left="6687" w:hanging="180"/>
+      </w:pPr>
+    </w:lvl>
+  </w:abstractNum>
+  <w:abstractNum w:abstractNumId="2" w15:restartNumberingAfterBreak="0">
+    <w:nsid w:val="3A7C6CF5"/>
+    <w:multiLevelType w:val="hybridMultilevel"/>
+    <w:tmpl w:val="F1222B36"/>
+    <w:lvl w:ilvl="0" w:tplc="0EE85F98">
+      <w:start w:val="1"/>
+      <w:numFmt w:val="decimal"/>
+      <w:lvlText w:val="%1."/>
+      <w:lvlJc w:val="left"/>
+      <w:pPr>
+        <w:ind w:left="720" w:hanging="360"/>
+      </w:pPr>
+      <w:rPr>
+        <w:rFonts w:hint="default"/>
+        <w:b/>
+      </w:rPr>
+    </w:lvl>
+    <w:lvl w:ilvl="1" w:tplc="04190019">
+      <w:start w:val="1"/>
+      <w:numFmt w:val="lowerLetter"/>
+      <w:lvlText w:val="%2."/>
+      <w:lvlJc w:val="left"/>
+      <w:pPr>
+        <w:ind w:left="1440" w:hanging="360"/>
+      </w:pPr>
+    </w:lvl>
+    <w:lvl w:ilvl="2" w:tplc="0419001B" w:tentative="1">
+      <w:start w:val="1"/>
+      <w:numFmt w:val="lowerRoman"/>
+      <w:lvlText w:val="%3."/>
+      <w:lvlJc w:val="right"/>
+      <w:pPr>
+        <w:ind w:left="2160" w:hanging="180"/>
+      </w:pPr>
+    </w:lvl>
+    <w:lvl w:ilvl="3" w:tplc="0419000F" w:tentative="1">
+      <w:start w:val="1"/>
+      <w:numFmt w:val="decimal"/>
+      <w:lvlText w:val="%4."/>
+      <w:lvlJc w:val="left"/>
+      <w:pPr>
+        <w:ind w:left="2880" w:hanging="360"/>
+      </w:pPr>
+    </w:lvl>
+    <w:lvl w:ilvl="4" w:tplc="04190019" w:tentative="1">
+      <w:start w:val="1"/>
+      <w:numFmt w:val="lowerLetter"/>
+      <w:lvlText w:val="%5."/>
+      <w:lvlJc w:val="left"/>
+      <w:pPr>
+        <w:ind w:left="3600" w:hanging="360"/>
+      </w:pPr>
+    </w:lvl>
+    <w:lvl w:ilvl="5" w:tplc="0419001B" w:tentative="1">
+      <w:start w:val="1"/>
+      <w:numFmt w:val="lowerRoman"/>
+      <w:lvlText w:val="%6."/>
+      <w:lvlJc w:val="right"/>
+      <w:pPr>
+        <w:ind w:left="4320" w:hanging="180"/>
+      </w:pPr>
+    </w:lvl>
+    <w:lvl w:ilvl="6" w:tplc="0419000F" w:tentative="1">
+      <w:start w:val="1"/>
+      <w:numFmt w:val="decimal"/>
+      <w:lvlText w:val="%7."/>
+      <w:lvlJc w:val="left"/>
+      <w:pPr>
+        <w:ind w:left="5040" w:hanging="360"/>
+      </w:pPr>
+    </w:lvl>
+    <w:lvl w:ilvl="7" w:tplc="04190019" w:tentative="1">
+      <w:start w:val="1"/>
+      <w:numFmt w:val="lowerLetter"/>
+      <w:lvlText w:val="%8."/>
+      <w:lvlJc w:val="left"/>
+      <w:pPr>
+        <w:ind w:left="5760" w:hanging="360"/>
+      </w:pPr>
+    </w:lvl>
+    <w:lvl w:ilvl="8" w:tplc="0419001B" w:tentative="1">
+      <w:start w:val="1"/>
+      <w:numFmt w:val="lowerRoman"/>
+      <w:lvlText w:val="%9."/>
+      <w:lvlJc w:val="right"/>
+      <w:pPr>
+        <w:ind w:left="6480" w:hanging="180"/>
+      </w:pPr>
+    </w:lvl>
+  </w:abstractNum>
+  <w:abstractNum w:abstractNumId="3" w15:restartNumberingAfterBreak="0">
+    <w:nsid w:val="3BB138CA"/>
+    <w:multiLevelType w:val="hybridMultilevel"/>
+    <w:tmpl w:val="AAE23A42"/>
+    <w:lvl w:ilvl="0" w:tplc="38FCA7EA">
+      <w:start w:val="1"/>
+      <w:numFmt w:val="bullet"/>
+      <w:lvlText w:val="–"/>
+      <w:lvlJc w:val="left"/>
+      <w:pPr>
+        <w:ind w:left="720" w:hanging="360"/>
+      </w:pPr>
+      <w:rPr>
+        <w:rFonts w:ascii="Times New Roman" w:hAnsi="Times New Roman" w:cs="Times New Roman" w:hint="default"/>
+      </w:rPr>
+    </w:lvl>
+    <w:lvl w:ilvl="1" w:tplc="04190003" w:tentative="1">
+      <w:start w:val="1"/>
+      <w:numFmt w:val="bullet"/>
+      <w:lvlText w:val="o"/>
+      <w:lvlJc w:val="left"/>
+      <w:pPr>
+        <w:ind w:left="1440" w:hanging="360"/>
+      </w:pPr>
+      <w:rPr>
+        <w:rFonts w:ascii="Courier New" w:hAnsi="Courier New" w:cs="Courier New" w:hint="default"/>
+      </w:rPr>
+    </w:lvl>
+    <w:lvl w:ilvl="2" w:tplc="04190005" w:tentative="1">
+      <w:start w:val="1"/>
+      <w:numFmt w:val="bullet"/>
+      <w:lvlText w:val=""/>
+      <w:lvlJc w:val="left"/>
+      <w:pPr>
+        <w:ind w:left="2160" w:hanging="360"/>
+      </w:pPr>
+      <w:rPr>
+        <w:rFonts w:ascii="Wingdings" w:hAnsi="Wingdings" w:hint="default"/>
+      </w:rPr>
+    </w:lvl>
+    <w:lvl w:ilvl="3" w:tplc="04190001" w:tentative="1">
+      <w:start w:val="1"/>
+      <w:numFmt w:val="bullet"/>
+      <w:lvlText w:val=""/>
+      <w:lvlJc w:val="left"/>
+      <w:pPr>
+        <w:ind w:left="2880" w:hanging="360"/>
+      </w:pPr>
+      <w:rPr>
+        <w:rFonts w:ascii="Symbol" w:hAnsi="Symbol" w:hint="default"/>
+      </w:rPr>
+    </w:lvl>
+    <w:lvl w:ilvl="4" w:tplc="04190003" w:tentative="1">
+      <w:start w:val="1"/>
+      <w:numFmt w:val="bullet"/>
+      <w:lvlText w:val="o"/>
+      <w:lvlJc w:val="left"/>
+      <w:pPr>
+        <w:ind w:left="3600" w:hanging="360"/>
+      </w:pPr>
+      <w:rPr>
+        <w:rFonts w:ascii="Courier New" w:hAnsi="Courier New" w:cs="Courier New" w:hint="default"/>
+      </w:rPr>
+    </w:lvl>
+    <w:lvl w:ilvl="5" w:tplc="04190005" w:tentative="1">
+      <w:start w:val="1"/>
+      <w:numFmt w:val="bullet"/>
+      <w:lvlText w:val=""/>
+      <w:lvlJc w:val="left"/>
+      <w:pPr>
+        <w:ind w:left="4320" w:hanging="360"/>
+      </w:pPr>
+      <w:rPr>
+        <w:rFonts w:ascii="Wingdings" w:hAnsi="Wingdings" w:hint="default"/>
+      </w:rPr>
+    </w:lvl>
+    <w:lvl w:ilvl="6" w:tplc="04190001" w:tentative="1">
+      <w:start w:val="1"/>
+      <w:numFmt w:val="bullet"/>
+      <w:lvlText w:val=""/>
+      <w:lvlJc w:val="left"/>
+      <w:pPr>
+        <w:ind w:left="5040" w:hanging="360"/>
+      </w:pPr>
+      <w:rPr>
+        <w:rFonts w:ascii="Symbol" w:hAnsi="Symbol" w:hint="default"/>
+      </w:rPr>
+    </w:lvl>
+    <w:lvl w:ilvl="7" w:tplc="04190003" w:tentative="1">
+      <w:start w:val="1"/>
+      <w:numFmt w:val="bullet"/>
+      <w:lvlText w:val="o"/>
+      <w:lvlJc w:val="left"/>
+      <w:pPr>
+        <w:ind w:left="5760" w:hanging="360"/>
+      </w:pPr>
+      <w:rPr>
+        <w:rFonts w:ascii="Courier New" w:hAnsi="Courier New" w:cs="Courier New" w:hint="default"/>
+      </w:rPr>
+    </w:lvl>
+    <w:lvl w:ilvl="8" w:tplc="04190005" w:tentative="1">
+      <w:start w:val="1"/>
+      <w:numFmt w:val="bullet"/>
+      <w:lvlText w:val=""/>
+      <w:lvlJc w:val="left"/>
+      <w:pPr>
+        <w:ind w:left="6480" w:hanging="360"/>
+      </w:pPr>
+      <w:rPr>
+        <w:rFonts w:ascii="Wingdings" w:hAnsi="Wingdings" w:hint="default"/>
+      </w:rPr>
+    </w:lvl>
+  </w:abstractNum>
+  <w:abstractNum w:abstractNumId="4" w15:restartNumberingAfterBreak="0">
+    <w:nsid w:val="3BCA7EF8"/>
+    <w:multiLevelType w:val="multilevel"/>
+    <w:tmpl w:val="63BCB808"/>
+    <w:lvl w:ilvl="0">
+      <w:start w:val="1"/>
+      <w:numFmt w:val="decimal"/>
+      <w:lvlText w:val="%1."/>
+      <w:lvlJc w:val="left"/>
+      <w:pPr>
+        <w:ind w:left="450" w:hanging="450"/>
+      </w:pPr>
+      <w:rPr>
+        <w:rFonts w:hint="default"/>
+      </w:rPr>
+    </w:lvl>
+    <w:lvl w:ilvl="1">
+      <w:start w:val="1"/>
+      <w:numFmt w:val="decimal"/>
+      <w:lvlText w:val="%1.%2."/>
+      <w:lvlJc w:val="left"/>
+      <w:pPr>
+        <w:ind w:left="1800" w:hanging="720"/>
+      </w:pPr>
+      <w:rPr>
+        <w:rFonts w:hint="default"/>
+      </w:rPr>
+    </w:lvl>
+    <w:lvl w:ilvl="2">
+      <w:start w:val="1"/>
+      <w:numFmt w:val="decimal"/>
+      <w:lvlText w:val="%1.%2.%3."/>
+      <w:lvlJc w:val="left"/>
+      <w:pPr>
+        <w:ind w:left="2880" w:hanging="720"/>
+      </w:pPr>
+      <w:rPr>
+        <w:rFonts w:hint="default"/>
+      </w:rPr>
+    </w:lvl>
+    <w:lvl w:ilvl="3">
+      <w:start w:val="1"/>
+      <w:numFmt w:val="decimal"/>
+      <w:lvlText w:val="%1.%2.%3.%4."/>
+      <w:lvlJc w:val="left"/>
+      <w:pPr>
+        <w:ind w:left="4320" w:hanging="1080"/>
+      </w:pPr>
+      <w:rPr>
+        <w:rFonts w:hint="default"/>
+      </w:rPr>
+    </w:lvl>
+    <w:lvl w:ilvl="4">
+      <w:start w:val="1"/>
+      <w:numFmt w:val="decimal"/>
+      <w:lvlText w:val="%1.%2.%3.%4.%5."/>
+      <w:lvlJc w:val="left"/>
+      <w:pPr>
+        <w:ind w:left="5400" w:hanging="1080"/>
+      </w:pPr>
+      <w:rPr>
+        <w:rFonts w:hint="default"/>
+      </w:rPr>
+    </w:lvl>
+    <w:lvl w:ilvl="5">
+      <w:start w:val="1"/>
+      <w:numFmt w:val="decimal"/>
+      <w:lvlText w:val="%1.%2.%3.%4.%5.%6."/>
+      <w:lvlJc w:val="left"/>
+      <w:pPr>
+        <w:ind w:left="6840" w:hanging="1440"/>
+      </w:pPr>
+      <w:rPr>
+        <w:rFonts w:hint="default"/>
+      </w:rPr>
+    </w:lvl>
+    <w:lvl w:ilvl="6">
+      <w:start w:val="1"/>
+      <w:numFmt w:val="decimal"/>
+      <w:lvlText w:val="%1.%2.%3.%4.%5.%6.%7."/>
+      <w:lvlJc w:val="left"/>
+      <w:pPr>
+        <w:ind w:left="8280" w:hanging="1800"/>
+      </w:pPr>
+      <w:rPr>
+        <w:rFonts w:hint="default"/>
+      </w:rPr>
+    </w:lvl>
+    <w:lvl w:ilvl="7">
+      <w:start w:val="1"/>
+      <w:numFmt w:val="decimal"/>
+      <w:lvlText w:val="%1.%2.%3.%4.%5.%6.%7.%8."/>
+      <w:lvlJc w:val="left"/>
+      <w:pPr>
+        <w:ind w:left="9360" w:hanging="1800"/>
+      </w:pPr>
+      <w:rPr>
+        <w:rFonts w:hint="default"/>
+      </w:rPr>
+    </w:lvl>
+    <w:lvl w:ilvl="8">
+      <w:start w:val="1"/>
+      <w:numFmt w:val="decimal"/>
+      <w:lvlText w:val="%1.%2.%3.%4.%5.%6.%7.%8.%9."/>
+      <w:lvlJc w:val="left"/>
+      <w:pPr>
+        <w:ind w:left="10800" w:hanging="2160"/>
+      </w:pPr>
+      <w:rPr>
+        <w:rFonts w:hint="default"/>
+      </w:rPr>
+    </w:lvl>
+  </w:abstractNum>
+  <w:abstractNum w:abstractNumId="5" w15:restartNumberingAfterBreak="0">
+    <w:nsid w:val="576F050C"/>
+    <w:multiLevelType w:val="hybridMultilevel"/>
+    <w:tmpl w:val="B93CDC12"/>
+    <w:lvl w:ilvl="0" w:tplc="04190001">
+      <w:start w:val="1"/>
+      <w:numFmt w:val="bullet"/>
+      <w:lvlText w:val=""/>
+      <w:lvlJc w:val="left"/>
+      <w:pPr>
+        <w:ind w:left="2520" w:hanging="360"/>
+      </w:pPr>
+      <w:rPr>
+        <w:rFonts w:ascii="Symbol" w:hAnsi="Symbol" w:hint="default"/>
+      </w:rPr>
+    </w:lvl>
+    <w:lvl w:ilvl="1" w:tplc="04190003" w:tentative="1">
+      <w:start w:val="1"/>
+      <w:numFmt w:val="bullet"/>
+      <w:lvlText w:val="o"/>
+      <w:lvlJc w:val="left"/>
+      <w:pPr>
+        <w:ind w:left="3240" w:hanging="360"/>
+      </w:pPr>
+      <w:rPr>
+        <w:rFonts w:ascii="Courier New" w:hAnsi="Courier New" w:cs="Courier New" w:hint="default"/>
+      </w:rPr>
+    </w:lvl>
+    <w:lvl w:ilvl="2" w:tplc="04190005" w:tentative="1">
+      <w:start w:val="1"/>
+      <w:numFmt w:val="bullet"/>
+      <w:lvlText w:val=""/>
+      <w:lvlJc w:val="left"/>
+      <w:pPr>
+        <w:ind w:left="3960" w:hanging="360"/>
+      </w:pPr>
+      <w:rPr>
+        <w:rFonts w:ascii="Wingdings" w:hAnsi="Wingdings" w:hint="default"/>
+      </w:rPr>
+    </w:lvl>
+    <w:lvl w:ilvl="3" w:tplc="04190001" w:tentative="1">
+      <w:start w:val="1"/>
+      <w:numFmt w:val="bullet"/>
+      <w:lvlText w:val=""/>
+      <w:lvlJc w:val="left"/>
+      <w:pPr>
+        <w:ind w:left="4680" w:hanging="360"/>
+      </w:pPr>
+      <w:rPr>
+        <w:rFonts w:ascii="Symbol" w:hAnsi="Symbol" w:hint="default"/>
+      </w:rPr>
+    </w:lvl>
+    <w:lvl w:ilvl="4" w:tplc="04190003" w:tentative="1">
+      <w:start w:val="1"/>
+      <w:numFmt w:val="bullet"/>
+      <w:lvlText w:val="o"/>
+      <w:lvlJc w:val="left"/>
+      <w:pPr>
+        <w:ind w:left="5400" w:hanging="360"/>
+      </w:pPr>
+      <w:rPr>
+        <w:rFonts w:ascii="Courier New" w:hAnsi="Courier New" w:cs="Courier New" w:hint="default"/>
+      </w:rPr>
+    </w:lvl>
+    <w:lvl w:ilvl="5" w:tplc="04190005" w:tentative="1">
+      <w:start w:val="1"/>
+      <w:numFmt w:val="bullet"/>
+      <w:lvlText w:val=""/>
+      <w:lvlJc w:val="left"/>
+      <w:pPr>
+        <w:ind w:left="6120" w:hanging="360"/>
+      </w:pPr>
+      <w:rPr>
+        <w:rFonts w:ascii="Wingdings" w:hAnsi="Wingdings" w:hint="default"/>
+      </w:rPr>
+    </w:lvl>
+    <w:lvl w:ilvl="6" w:tplc="04190001" w:tentative="1">
+      <w:start w:val="1"/>
+      <w:numFmt w:val="bullet"/>
+      <w:lvlText w:val=""/>
+      <w:lvlJc w:val="left"/>
+      <w:pPr>
+        <w:ind w:left="6840" w:hanging="360"/>
+      </w:pPr>
+      <w:rPr>
+        <w:rFonts w:ascii="Symbol" w:hAnsi="Symbol" w:hint="default"/>
+      </w:rPr>
+    </w:lvl>
+    <w:lvl w:ilvl="7" w:tplc="04190003" w:tentative="1">
+      <w:start w:val="1"/>
+      <w:numFmt w:val="bullet"/>
+      <w:lvlText w:val="o"/>
+      <w:lvlJc w:val="left"/>
+      <w:pPr>
+        <w:ind w:left="7560" w:hanging="360"/>
+      </w:pPr>
+      <w:rPr>
+        <w:rFonts w:ascii="Courier New" w:hAnsi="Courier New" w:cs="Courier New" w:hint="default"/>
+      </w:rPr>
+    </w:lvl>
+    <w:lvl w:ilvl="8" w:tplc="04190005" w:tentative="1">
+      <w:start w:val="1"/>
+      <w:numFmt w:val="bullet"/>
+      <w:lvlText w:val=""/>
+      <w:lvlJc w:val="left"/>
+      <w:pPr>
+        <w:ind w:left="8280" w:hanging="360"/>
+      </w:pPr>
+      <w:rPr>
+        <w:rFonts w:ascii="Wingdings" w:hAnsi="Wingdings" w:hint="default"/>
+      </w:rPr>
+    </w:lvl>
+  </w:abstractNum>
+  <w:abstractNum w:abstractNumId="6" w15:restartNumberingAfterBreak="0">
+    <w:nsid w:val="6AEE6CF3"/>
+    <w:multiLevelType w:val="hybridMultilevel"/>
+    <w:tmpl w:val="D616C48A"/>
+    <w:lvl w:ilvl="0" w:tplc="D2E2C49A">
+      <w:start w:val="1"/>
+      <w:numFmt w:val="decimal"/>
+      <w:lvlText w:val="%1."/>
+      <w:lvlJc w:val="left"/>
+      <w:pPr>
+        <w:ind w:left="1069" w:hanging="360"/>
+      </w:pPr>
+      <w:rPr>
+        <w:rFonts w:hint="default"/>
+      </w:rPr>
+    </w:lvl>
+    <w:lvl w:ilvl="1" w:tplc="04190019" w:tentative="1">
+      <w:start w:val="1"/>
+      <w:numFmt w:val="lowerLetter"/>
+      <w:lvlText w:val="%2."/>
+      <w:lvlJc w:val="left"/>
+      <w:pPr>
+        <w:ind w:left="1789" w:hanging="360"/>
+      </w:pPr>
+    </w:lvl>
+    <w:lvl w:ilvl="2" w:tplc="0419001B" w:tentative="1">
+      <w:start w:val="1"/>
+      <w:numFmt w:val="lowerRoman"/>
+      <w:lvlText w:val="%3."/>
+      <w:lvlJc w:val="right"/>
+      <w:pPr>
+        <w:ind w:left="2509" w:hanging="180"/>
+      </w:pPr>
+    </w:lvl>
+    <w:lvl w:ilvl="3" w:tplc="0419000F" w:tentative="1">
+      <w:start w:val="1"/>
+      <w:numFmt w:val="decimal"/>
+      <w:lvlText w:val="%4."/>
+      <w:lvlJc w:val="left"/>
+      <w:pPr>
+        <w:ind w:left="3229" w:hanging="360"/>
+      </w:pPr>
+    </w:lvl>
+    <w:lvl w:ilvl="4" w:tplc="04190019" w:tentative="1">
+      <w:start w:val="1"/>
+      <w:numFmt w:val="lowerLetter"/>
+      <w:lvlText w:val="%5."/>
+      <w:lvlJc w:val="left"/>
+      <w:pPr>
+        <w:ind w:left="3949" w:hanging="360"/>
+      </w:pPr>
+    </w:lvl>
+    <w:lvl w:ilvl="5" w:tplc="0419001B" w:tentative="1">
+      <w:start w:val="1"/>
+      <w:numFmt w:val="lowerRoman"/>
+      <w:lvlText w:val="%6."/>
+      <w:lvlJc w:val="right"/>
+      <w:pPr>
+        <w:ind w:left="4669" w:hanging="180"/>
+      </w:pPr>
+    </w:lvl>
+    <w:lvl w:ilvl="6" w:tplc="0419000F" w:tentative="1">
+      <w:start w:val="1"/>
+      <w:numFmt w:val="decimal"/>
+      <w:lvlText w:val="%7."/>
+      <w:lvlJc w:val="left"/>
+      <w:pPr>
+        <w:ind w:left="5389" w:hanging="360"/>
+      </w:pPr>
+    </w:lvl>
+    <w:lvl w:ilvl="7" w:tplc="04190019" w:tentative="1">
+      <w:start w:val="1"/>
+      <w:numFmt w:val="lowerLetter"/>
+      <w:lvlText w:val="%8."/>
+      <w:lvlJc w:val="left"/>
+      <w:pPr>
+        <w:ind w:left="6109" w:hanging="360"/>
+      </w:pPr>
+    </w:lvl>
+    <w:lvl w:ilvl="8" w:tplc="0419001B" w:tentative="1">
+      <w:start w:val="1"/>
+      <w:numFmt w:val="lowerRoman"/>
+      <w:lvlText w:val="%9."/>
+      <w:lvlJc w:val="right"/>
+      <w:pPr>
+        <w:ind w:left="6829" w:hanging="180"/>
+      </w:pPr>
+    </w:lvl>
+  </w:abstractNum>
+  <w:abstractNum w:abstractNumId="7" w15:restartNumberingAfterBreak="0">
+    <w:nsid w:val="71EE0261"/>
+    <w:multiLevelType w:val="hybridMultilevel"/>
+    <w:tmpl w:val="00BC6AAE"/>
+    <w:lvl w:ilvl="0" w:tplc="04190001">
+      <w:start w:val="1"/>
+      <w:numFmt w:val="bullet"/>
+      <w:lvlText w:val=""/>
+      <w:lvlJc w:val="left"/>
+      <w:pPr>
+        <w:ind w:left="1287" w:hanging="360"/>
+      </w:pPr>
+      <w:rPr>
+        <w:rFonts w:ascii="Symbol" w:hAnsi="Symbol" w:hint="default"/>
+      </w:rPr>
+    </w:lvl>
+    <w:lvl w:ilvl="1" w:tplc="04190003" w:tentative="1">
+      <w:start w:val="1"/>
+      <w:numFmt w:val="bullet"/>
+      <w:lvlText w:val="o"/>
+      <w:lvlJc w:val="left"/>
+      <w:pPr>
+        <w:ind w:left="2007" w:hanging="360"/>
+      </w:pPr>
+      <w:rPr>
+        <w:rFonts w:ascii="Courier New" w:hAnsi="Courier New" w:cs="Courier New" w:hint="default"/>
+      </w:rPr>
+    </w:lvl>
+    <w:lvl w:ilvl="2" w:tplc="04190005" w:tentative="1">
+      <w:start w:val="1"/>
+      <w:numFmt w:val="bullet"/>
+      <w:lvlText w:val=""/>
+      <w:lvlJc w:val="left"/>
+      <w:pPr>
+        <w:ind w:left="2727" w:hanging="360"/>
+      </w:pPr>
+      <w:rPr>
+        <w:rFonts w:ascii="Wingdings" w:hAnsi="Wingdings" w:hint="default"/>
+      </w:rPr>
+    </w:lvl>
+    <w:lvl w:ilvl="3" w:tplc="04190001" w:tentative="1">
+      <w:start w:val="1"/>
+      <w:numFmt w:val="bullet"/>
+      <w:lvlText w:val=""/>
+      <w:lvlJc w:val="left"/>
+      <w:pPr>
+        <w:ind w:left="3447" w:hanging="360"/>
+      </w:pPr>
+      <w:rPr>
+        <w:rFonts w:ascii="Symbol" w:hAnsi="Symbol" w:hint="default"/>
+      </w:rPr>
+    </w:lvl>
+    <w:lvl w:ilvl="4" w:tplc="04190003" w:tentative="1">
+      <w:start w:val="1"/>
+      <w:numFmt w:val="bullet"/>
+      <w:lvlText w:val="o"/>
+      <w:lvlJc w:val="left"/>
+      <w:pPr>
+        <w:ind w:left="4167" w:hanging="360"/>
+      </w:pPr>
+      <w:rPr>
+        <w:rFonts w:ascii="Courier New" w:hAnsi="Courier New" w:cs="Courier New" w:hint="default"/>
+      </w:rPr>
+    </w:lvl>
+    <w:lvl w:ilvl="5" w:tplc="04190005" w:tentative="1">
+      <w:start w:val="1"/>
+      <w:numFmt w:val="bullet"/>
+      <w:lvlText w:val=""/>
+      <w:lvlJc w:val="left"/>
+      <w:pPr>
+        <w:ind w:left="4887" w:hanging="360"/>
+      </w:pPr>
+      <w:rPr>
+        <w:rFonts w:ascii="Wingdings" w:hAnsi="Wingdings" w:hint="default"/>
+      </w:rPr>
+    </w:lvl>
+    <w:lvl w:ilvl="6" w:tplc="04190001" w:tentative="1">
+      <w:start w:val="1"/>
+      <w:numFmt w:val="bullet"/>
+      <w:lvlText w:val=""/>
+      <w:lvlJc w:val="left"/>
+      <w:pPr>
+        <w:ind w:left="5607" w:hanging="360"/>
+      </w:pPr>
+      <w:rPr>
+        <w:rFonts w:ascii="Symbol" w:hAnsi="Symbol" w:hint="default"/>
+      </w:rPr>
+    </w:lvl>
+    <w:lvl w:ilvl="7" w:tplc="04190003" w:tentative="1">
+      <w:start w:val="1"/>
+      <w:numFmt w:val="bullet"/>
+      <w:lvlText w:val="o"/>
+      <w:lvlJc w:val="left"/>
+      <w:pPr>
+        <w:ind w:left="6327" w:hanging="360"/>
+      </w:pPr>
+      <w:rPr>
+        <w:rFonts w:ascii="Courier New" w:hAnsi="Courier New" w:cs="Courier New" w:hint="default"/>
+      </w:rPr>
+    </w:lvl>
+    <w:lvl w:ilvl="8" w:tplc="04190005" w:tentative="1">
+      <w:start w:val="1"/>
+      <w:numFmt w:val="bullet"/>
+      <w:lvlText w:val=""/>
+      <w:lvlJc w:val="left"/>
+      <w:pPr>
+        <w:ind w:left="7047" w:hanging="360"/>
+      </w:pPr>
+      <w:rPr>
+        <w:rFonts w:ascii="Wingdings" w:hAnsi="Wingdings" w:hint="default"/>
+      </w:rPr>
+    </w:lvl>
+  </w:abstractNum>
+  <w:abstractNum w:abstractNumId="8" w15:restartNumberingAfterBreak="0">
+    <w:nsid w:val="76085C42"/>
+    <w:multiLevelType w:val="hybridMultilevel"/>
+    <w:tmpl w:val="12F0F588"/>
+    <w:lvl w:ilvl="0" w:tplc="04190001">
+      <w:start w:val="1"/>
+      <w:numFmt w:val="bullet"/>
+      <w:lvlText w:val=""/>
+      <w:lvlJc w:val="left"/>
+      <w:pPr>
+        <w:ind w:left="2138" w:hanging="360"/>
+      </w:pPr>
+      <w:rPr>
+        <w:rFonts w:ascii="Symbol" w:hAnsi="Symbol" w:hint="default"/>
+      </w:rPr>
+    </w:lvl>
+    <w:lvl w:ilvl="1" w:tplc="04190003" w:tentative="1">
+      <w:start w:val="1"/>
+      <w:numFmt w:val="bullet"/>
+      <w:lvlText w:val="o"/>
+      <w:lvlJc w:val="left"/>
+      <w:pPr>
+        <w:ind w:left="2858" w:hanging="360"/>
+      </w:pPr>
+      <w:rPr>
+        <w:rFonts w:ascii="Courier New" w:hAnsi="Courier New" w:cs="Courier New" w:hint="default"/>
+      </w:rPr>
+    </w:lvl>
+    <w:lvl w:ilvl="2" w:tplc="04190005" w:tentative="1">
+      <w:start w:val="1"/>
+      <w:numFmt w:val="bullet"/>
+      <w:lvlText w:val=""/>
+      <w:lvlJc w:val="left"/>
+      <w:pPr>
+        <w:ind w:left="3578" w:hanging="360"/>
+      </w:pPr>
+      <w:rPr>
+        <w:rFonts w:ascii="Wingdings" w:hAnsi="Wingdings" w:hint="default"/>
+      </w:rPr>
+    </w:lvl>
+    <w:lvl w:ilvl="3" w:tplc="04190001" w:tentative="1">
+      <w:start w:val="1"/>
+      <w:numFmt w:val="bullet"/>
+      <w:lvlText w:val=""/>
+      <w:lvlJc w:val="left"/>
+      <w:pPr>
+        <w:ind w:left="4298" w:hanging="360"/>
+      </w:pPr>
+      <w:rPr>
+        <w:rFonts w:ascii="Symbol" w:hAnsi="Symbol" w:hint="default"/>
+      </w:rPr>
+    </w:lvl>
+    <w:lvl w:ilvl="4" w:tplc="04190003" w:tentative="1">
+      <w:start w:val="1"/>
+      <w:numFmt w:val="bullet"/>
+      <w:lvlText w:val="o"/>
+      <w:lvlJc w:val="left"/>
+      <w:pPr>
+        <w:ind w:left="5018" w:hanging="360"/>
+      </w:pPr>
+      <w:rPr>
+        <w:rFonts w:ascii="Courier New" w:hAnsi="Courier New" w:cs="Courier New" w:hint="default"/>
+      </w:rPr>
+    </w:lvl>
+    <w:lvl w:ilvl="5" w:tplc="04190005" w:tentative="1">
+      <w:start w:val="1"/>
+      <w:numFmt w:val="bullet"/>
+      <w:lvlText w:val=""/>
+      <w:lvlJc w:val="left"/>
+      <w:pPr>
+        <w:ind w:left="5738" w:hanging="360"/>
+      </w:pPr>
+      <w:rPr>
+        <w:rFonts w:ascii="Wingdings" w:hAnsi="Wingdings" w:hint="default"/>
+      </w:rPr>
+    </w:lvl>
+    <w:lvl w:ilvl="6" w:tplc="04190001" w:tentative="1">
+      <w:start w:val="1"/>
+      <w:numFmt w:val="bullet"/>
+      <w:lvlText w:val=""/>
+      <w:lvlJc w:val="left"/>
+      <w:pPr>
+        <w:ind w:left="6458" w:hanging="360"/>
+      </w:pPr>
+      <w:rPr>
+        <w:rFonts w:ascii="Symbol" w:hAnsi="Symbol" w:hint="default"/>
+      </w:rPr>
+    </w:lvl>
+    <w:lvl w:ilvl="7" w:tplc="04190003" w:tentative="1">
+      <w:start w:val="1"/>
+      <w:numFmt w:val="bullet"/>
+      <w:lvlText w:val="o"/>
+      <w:lvlJc w:val="left"/>
+      <w:pPr>
+        <w:ind w:left="7178" w:hanging="360"/>
+      </w:pPr>
+      <w:rPr>
+        <w:rFonts w:ascii="Courier New" w:hAnsi="Courier New" w:cs="Courier New" w:hint="default"/>
+      </w:rPr>
+    </w:lvl>
+    <w:lvl w:ilvl="8" w:tplc="04190005" w:tentative="1">
+      <w:start w:val="1"/>
+      <w:numFmt w:val="bullet"/>
+      <w:lvlText w:val=""/>
+      <w:lvlJc w:val="left"/>
+      <w:pPr>
+        <w:ind w:left="7898" w:hanging="360"/>
+      </w:pPr>
+      <w:rPr>
+        <w:rFonts w:ascii="Wingdings" w:hAnsi="Wingdings" w:hint="default"/>
+      </w:rPr>
+    </w:lvl>
+  </w:abstractNum>
+  <w:num w:numId="1" w16cid:durableId="1230774702">
+    <w:abstractNumId w:val="6"/>
+  </w:num>
+  <w:num w:numId="2" w16cid:durableId="804277643">
+    <w:abstractNumId w:val="2"/>
+  </w:num>
+  <w:num w:numId="3" w16cid:durableId="1121343877">
+    <w:abstractNumId w:val="4"/>
+  </w:num>
+  <w:num w:numId="4" w16cid:durableId="1999385567">
+    <w:abstractNumId w:val="3"/>
+  </w:num>
+  <w:num w:numId="5" w16cid:durableId="1581208461">
+    <w:abstractNumId w:val="0"/>
+    <w:lvlOverride w:ilvl="0">
+      <w:startOverride w:val="1"/>
+    </w:lvlOverride>
+    <w:lvlOverride w:ilvl="1">
+      <w:startOverride w:val="1"/>
+    </w:lvlOverride>
+    <w:lvlOverride w:ilvl="2">
+      <w:startOverride w:val="1"/>
+    </w:lvlOverride>
+    <w:lvlOverride w:ilvl="3">
+      <w:startOverride w:val="1"/>
+    </w:lvlOverride>
+    <w:lvlOverride w:ilvl="4">
+      <w:startOverride w:val="1"/>
+    </w:lvlOverride>
+    <w:lvlOverride w:ilvl="5">
+      <w:startOverride w:val="1"/>
+    </w:lvlOverride>
+    <w:lvlOverride w:ilvl="6">
+      <w:startOverride w:val="1"/>
+    </w:lvlOverride>
+    <w:lvlOverride w:ilvl="7">
+      <w:startOverride w:val="1"/>
+    </w:lvlOverride>
+    <w:lvlOverride w:ilvl="8">
+      <w:startOverride w:val="1"/>
+    </w:lvlOverride>
+  </w:num>
+  <w:num w:numId="6" w16cid:durableId="1092166735">
+    <w:abstractNumId w:val="7"/>
+  </w:num>
+  <w:num w:numId="7" w16cid:durableId="1031689061">
+    <w:abstractNumId w:val="0"/>
+  </w:num>
+  <w:num w:numId="8" w16cid:durableId="1002127248">
+    <w:abstractNumId w:val="5"/>
+  </w:num>
+  <w:num w:numId="9" w16cid:durableId="397484510">
+    <w:abstractNumId w:val="8"/>
+  </w:num>
+  <w:num w:numId="10" w16cid:durableId="1430857015">
+    <w:abstractNumId w:val="1"/>
+  </w:num>
+</w:numbering>
+</file>
+
+<file path=word/styles.xml><?xml version="1.0" encoding="utf-8"?>
+<w:styles xmlns:mc="http://schemas.openxmlformats.org/markup-compatibility/2006" xmlns:r="http://schemas.openxmlformats.org/officeDocument/2006/relationships" xmlns:w="http://schemas.openxmlformats.org/wordprocessingml/2006/main" xmlns:w14="http://schemas.microsoft.com/office/word/2010/wordml" xmlns:w15="http://schemas.microsoft.com/office/word/2012/wordml" xmlns:w16cex="http://schemas.microsoft.com/office/word/2018/wordml/cex" xmlns:w16cid="http://schemas.microsoft.com/office/word/2016/wordml/cid" xmlns:w16="http://schemas.microsoft.com/office/word/2018/wordml" xmlns:w16du="http://schemas.microsoft.com/office/word/2023/wordml/word16du" xmlns:w16sdtdh="http://schemas.microsoft.com/office/word/2020/wordml/sdtdatahash" xmlns:w16sdtfl="http://schemas.microsoft.com/office/word/2024/wordml/sdtformatlock" xmlns:w16se="http://schemas.microsoft.com/office/word/2015/wordml/symex" mc:Ignorable="w14 w15 w16se w16cid w16 w16cex w16sdtdh w16sdtfl w16du">
+  <w:docDefaults>
+    <w:rPrDefault>
+      <w:rPr>
+        <w:rFonts w:asciiTheme="minorHAnsi" w:eastAsiaTheme="minorHAnsi" w:hAnsiTheme="minorHAnsi" w:cstheme="minorBidi"/>
+        <w:sz w:val="22"/>
+        <w:szCs w:val="22"/>
+        <w:lang w:val="ru-RU" w:eastAsia="en-US" w:bidi="ar-SA"/>
+      </w:rPr>
+    </w:rPrDefault>
+    <w:pPrDefault>
+      <w:pPr>
+        <w:spacing w:after="200" w:line="276" w:lineRule="auto"/>
+      </w:pPr>
+    </w:pPrDefault>
+  </w:docDefaults>
+  <w:latentStyles w:defLockedState="0" w:defUIPriority="99" w:defSemiHidden="0" w:defUnhideWhenUsed="0" w:defQFormat="0" w:count="376">
+    <w:lsdException w:name="Normal" w:uiPriority="0" w:qFormat="1"/>
+    <w:lsdException w:name="heading 1" w:uiPriority="0" w:qFormat="1"/>
+    <w:lsdException w:name="heading 2" w:semiHidden="1" w:uiPriority="9" w:unhideWhenUsed="1" w:qFormat="1"/>
+    <w:lsdException w:name="heading 3" w:semiHidden="1" w:uiPriority="9" w:unhideWhenUsed="1" w:qFormat="1"/>
+    <w:lsdException w:name="heading 4" w:semiHidden="1" w:uiPriority="9" w:unhideWhenUsed="1" w:qFormat="1"/>
+    <w:lsdException w:name="heading 5" w:semiHidden="1" w:uiPriority="9" w:unhideWhenUsed="1" w:qFormat="1"/>
+    <w:lsdException w:name="heading 6" w:semiHidden="1" w:uiPriority="9" w:unhideWhenUsed="1" w:qFormat="1"/>
+    <w:lsdException w:name="heading 7" w:semiHidden="1" w:uiPriority="9" w:unhideWhenUsed="1" w:qFormat="1"/>
+    <w:lsdException w:name="heading 8" w:semiHidden="1" w:uiPriority="9" w:unhideWhenUsed="1" w:qFormat="1"/>
+    <w:lsdException w:name="heading 9" w:semiHidden="1" w:uiPriority="9" w:unhideWhenUsed="1" w:qFormat="1"/>
+    <w:lsdException w:name="index 1" w:semiHidden="1" w:unhideWhenUsed="1"/>
+    <w:lsdException w:name="index 2" w:semiHidden="1" w:unhideWhenUsed="1"/>
+    <w:lsdException w:name="index 3" w:semiHidden="1" w:unhideWhenUsed="1"/>
+    <w:lsdException w:name="index 4" w:semiHidden="1" w:unhideWhenUsed="1"/>
+    <w:lsdException w:name="index 5" w:semiHidden="1" w:unhideWhenUsed="1"/>
+    <w:lsdException w:name="index 6" w:semiHidden="1" w:unhideWhenUsed="1"/>
+    <w:lsdException w:name="index 7" w:semiHidden="1" w:unhideWhenUsed="1"/>
+    <w:lsdException w:name="index 8" w:semiHidden="1" w:unhideWhenUsed="1"/>
+    <w:lsdException w:name="index 9" w:semiHidden="1" w:unhideWhenUsed="1"/>
+    <w:lsdException w:name="toc 1" w:semiHidden="1" w:uiPriority="39" w:unhideWhenUsed="1"/>
+    <w:lsdException w:name="toc 2" w:semiHidden="1" w:uiPriority="39" w:unhideWhenUsed="1"/>
+    <w:lsdException w:name="toc 3" w:semiHidden="1" w:uiPriority="39" w:unhideWhenUsed="1"/>
+    <w:lsdException w:name="toc 4" w:semiHidden="1" w:uiPriority="39" w:unhideWhenUsed="1"/>
+    <w:lsdException w:name="toc 5" w:semiHidden="1" w:uiPriority="39" w:unhideWhenUsed="1"/>
+    <w:lsdException w:name="toc 6" w:semiHidden="1" w:uiPriority="39" w:unhideWhenUsed="1"/>
+    <w:lsdException w:name="toc 7" w:semiHidden="1" w:uiPriority="39" w:unhideWhenUsed="1"/>
+    <w:lsdException w:name="toc 8" w:semiHidden="1" w:uiPriority="39" w:unhideWhenUsed="1"/>
+    <w:lsdException w:name="toc 9" w:semiHidden="1" w:uiPriority="39" w:unhideWhenUsed="1"/>
+    <w:lsdException w:name="Normal Indent" w:semiHidden="1" w:unhideWhenUsed="1"/>
+    <w:lsdException w:name="footnote text" w:semiHidden="1" w:unhideWhenUsed="1"/>
+    <w:lsdException w:name="annotation text" w:semiHidden="1" w:unhideWhenUsed="1"/>
+    <w:lsdException w:name="header" w:semiHidden="1" w:unhideWhenUsed="1"/>
+    <w:lsdException w:name="footer" w:semiHidden="1" w:unhideWhenUsed="1"/>
+    <w:lsdException w:name="index heading" w:semiHidden="1" w:unhideWhenUsed="1"/>
+    <w:lsdException w:name="caption" w:semiHidden="1" w:uiPriority="35" w:unhideWhenUsed="1" w:qFormat="1"/>
+    <w:lsdException w:name="table of figures" w:semiHidden="1" w:unhideWhenUsed="1"/>
+    <w:lsdException w:name="envelope address" w:semiHidden="1" w:unhideWhenUsed="1"/>
+    <w:lsdException w:name="envelope return" w:semiHidden="1" w:unhideWhenUsed="1"/>
+    <w:lsdException w:name="footnote reference" w:semiHidden="1" w:unhideWhenUsed="1"/>
+    <w:lsdException w:name="annotation reference" w:semiHidden="1" w:unhideWhenUsed="1"/>
+    <w:lsdException w:name="line number" w:semiHidden="1" w:unhideWhenUsed="1"/>
+    <w:lsdException w:name="page number" w:semiHidden="1" w:unhideWhenUsed="1"/>
+    <w:lsdException w:name="endnote reference" w:semiHidden="1" w:unhideWhenUsed="1"/>
+    <w:lsdException w:name="endnote text" w:semiHidden="1" w:unhideWhenUsed="1"/>
+    <w:lsdException w:name="table of authorities" w:semiHidden="1" w:unhideWhenUsed="1"/>
+    <w:lsdException w:name="macro" w:semiHidden="1" w:unhideWhenUsed="1"/>
+    <w:lsdException w:name="toa heading" w:semiHidden="1" w:unhideWhenUsed="1"/>
+    <w:lsdException w:name="List" w:semiHidden="1" w:unhideWhenUsed="1"/>
+    <w:lsdException w:name="List Bullet" w:semiHidden="1" w:unhideWhenUsed="1"/>
+    <w:lsdException w:name="List Number" w:semiHidden="1" w:unhideWhenUsed="1"/>
+    <w:lsdException w:name="List 2" w:semiHidden="1" w:unhideWhenUsed="1"/>
+    <w:lsdException w:name="List 3" w:semiHidden="1" w:unhideWhenUsed="1"/>
+    <w:lsdException w:name="List 4" w:semiHidden="1" w:unhideWhenUsed="1"/>
+    <w:lsdException w:name="List 5" w:semiHidden="1" w:unhideWhenUsed="1"/>
+    <w:lsdException w:name="List Bullet 2" w:semiHidden="1" w:unhideWhenUsed="1"/>
+    <w:lsdException w:name="List Bullet 3" w:semiHidden="1" w:unhideWhenUsed="1"/>
+    <w:lsdException w:name="List Bullet 4" w:semiHidden="1" w:unhideWhenUsed="1"/>
+    <w:lsdException w:name="List Bullet 5" w:semiHidden="1" w:unhideWhenUsed="1"/>
+    <w:lsdException w:name="List Number 2" w:semiHidden="1" w:unhideWhenUsed="1"/>
+    <w:lsdException w:name="List Number 3" w:semiHidden="1" w:unhideWhenUsed="1"/>
+    <w:lsdException w:name="List Number 4" w:semiHidden="1" w:unhideWhenUsed="1"/>
+    <w:lsdException w:name="List Number 5" w:semiHidden="1" w:unhideWhenUsed="1"/>
+    <w:lsdException w:name="Title" w:uiPriority="10" w:qFormat="1"/>
+    <w:lsdException w:name="Closing" w:semiHidden="1" w:unhideWhenUsed="1"/>
+    <w:lsdException w:name="Signature" w:semiHidden="1" w:unhideWhenUsed="1"/>
+    <w:lsdException w:name="Default Paragraph Font" w:semiHidden="1" w:uiPriority="1" w:unhideWhenUsed="1"/>
+    <w:lsdException w:name="Body Text" w:semiHidden="1" w:unhideWhenUsed="1"/>
+    <w:lsdException w:name="Body Text Indent" w:semiHidden="1" w:unhideWhenUsed="1"/>
+    <w:lsdException w:name="List Continue" w:semiHidden="1" w:unhideWhenUsed="1"/>
+    <w:lsdException w:name="List Continue 2" w:semiHidden="1" w:unhideWhenUsed="1"/>
+    <w:lsdException w:name="List Continue 3" w:semiHidden="1" w:unhideWhenUsed="1"/>
+    <w:lsdException w:name="List Continue 4" w:semiHidden="1" w:unhideWhenUsed="1"/>
+    <w:lsdException w:name="List Continue 5" w:semiHidden="1" w:unhideWhenUsed="1"/>
+    <w:lsdException w:name="Message Header" w:semiHidden="1" w:unhideWhenUsed="1"/>
+    <w:lsdException w:name="Subtitle" w:uiPriority="11" w:qFormat="1"/>
+    <w:lsdException w:name="Salutation" w:semiHidden="1" w:unhideWhenUsed="1"/>
+    <w:lsdException w:name="Date" w:semiHidden="1" w:unhideWhenUsed="1"/>
+    <w:lsdException w:name="Body Text First Indent" w:semiHidden="1" w:unhideWhenUsed="1"/>
+    <w:lsdException w:name="Body Text First Indent 2" w:semiHidden="1" w:unhideWhenUsed="1"/>
+    <w:lsdException w:name="Note Heading" w:semiHidden="1" w:unhideWhenUsed="1"/>
+    <w:lsdException w:name="Body Text 2" w:semiHidden="1" w:unhideWhenUsed="1"/>
+    <w:lsdException w:name="Body Text 3" w:semiHidden="1" w:unhideWhenUsed="1"/>
+    <w:lsdException w:name="Body Text Indent 2" w:semiHidden="1" w:unhideWhenUsed="1"/>
+    <w:lsdException w:name="Body Text Indent 3" w:semiHidden="1" w:unhideWhenUsed="1"/>
+    <w:lsdException w:name="Block Text" w:semiHidden="1" w:unhideWhenUsed="1"/>
+    <w:lsdException w:name="Hyperlink" w:semiHidden="1" w:unhideWhenUsed="1"/>
+    <w:lsdException w:name="FollowedHyperlink" w:semiHidden="1" w:unhideWhenUsed="1"/>
+    <w:lsdException w:name="Strong" w:uiPriority="22" w:qFormat="1"/>
+    <w:lsdException w:name="Emphasis" w:uiPriority="20" w:qFormat="1"/>
+    <w:lsdException w:name="Document Map" w:semiHidden="1" w:unhideWhenUsed="1"/>
+    <w:lsdException w:name="Plain Text" w:semiHidden="1" w:unhideWhenUsed="1"/>
+    <w:lsdException w:name="E-mail Signature" w:semiHidden="1" w:unhideWhenUsed="1"/>
+    <w:lsdException w:name="HTML Top of Form" w:semiHidden="1" w:unhideWhenUsed="1"/>
+    <w:lsdException w:name="HTML Bottom of Form" w:semiHidden="1" w:unhideWhenUsed="1"/>
+    <w:lsdException w:name="Normal (Web)" w:semiHidden="1" w:unhideWhenUsed="1"/>
+    <w:lsdException w:name="HTML Acronym" w:semiHidden="1" w:unhideWhenUsed="1"/>
+    <w:lsdException w:name="HTML Address" w:semiHidden="1" w:unhideWhenUsed="1"/>
+    <w:lsdException w:name="HTML Cite" w:semiHidden="1" w:unhideWhenUsed="1"/>
+    <w:lsdException w:name="HTML Code" w:semiHidden="1" w:unhideWhenUsed="1"/>
+    <w:lsdException w:name="HTML Definition" w:semiHidden="1" w:unhideWhenUsed="1"/>
+    <w:lsdException w:name="HTML Keyboard" w:semiHidden="1" w:unhideWhenUsed="1"/>
+    <w:lsdException w:name="HTML Preformatted" w:semiHidden="1" w:unhideWhenUsed="1"/>
+    <w:lsdException w:name="HTML Sample" w:semiHidden="1" w:unhideWhenUsed="1"/>
+    <w:lsdException w:name="HTML Typewriter" w:semiHidden="1" w:unhideWhenUsed="1"/>
+    <w:lsdException w:name="HTML Variable" w:semiHidden="1" w:unhideWhenUsed="1"/>
+    <w:lsdException w:name="Normal Table" w:semiHidden="1" w:unhideWhenUsed="1"/>
+    <w:lsdException w:name="annotation subject" w:semiHidden="1" w:unhideWhenUsed="1"/>
+    <w:lsdException w:name="No List" w:semiHidden="1" w:unhideWhenUsed="1"/>
+    <w:lsdException w:name="Outline List 1" w:semiHidden="1" w:unhideWhenUsed="1"/>
+    <w:lsdException w:name="Outline List 2" w:semiHidden="1" w:unhideWhenUsed="1"/>
+    <w:lsdException w:name="Outline List 3" w:semiHidden="1" w:unhideWhenUsed="1"/>
+    <w:lsdException w:name="Table Simple 1" w:semiHidden="1" w:unhideWhenUsed="1"/>
+    <w:lsdException w:name="Table Simple 2" w:semiHidden="1" w:unhideWhenUsed="1"/>
+    <w:lsdException w:name="Table Simple 3" w:semiHidden="1" w:unhideWhenUsed="1"/>
+    <w:lsdException w:name="Table Classic 1" w:semiHidden="1" w:unhideWhenUsed="1"/>
+    <w:lsdException w:name="Table Classic 2" w:semiHidden="1" w:unhideWhenUsed="1"/>
+    <w:lsdException w:name="Table Classic 3" w:semiHidden="1" w:unhideWhenUsed="1"/>
+    <w:lsdException w:name="Table Classic 4" w:semiHidden="1" w:unhideWhenUsed="1"/>
+    <w:lsdException w:name="Table Colorful 1" w:semiHidden="1" w:unhideWhenUsed="1"/>
+    <w:lsdException w:name="Table Colorful 2" w:semiHidden="1" w:unhideWhenUsed="1"/>
+    <w:lsdException w:name="Table Colorful 3" w:semiHidden="1" w:unhideWhenUsed="1"/>
+    <w:lsdException w:name="Table Columns 1" w:semiHidden="1" w:unhideWhenUsed="1"/>
+    <w:lsdException w:name="Table Columns 2" w:semiHidden="1" w:unhideWhenUsed="1"/>
+    <w:lsdException w:name="Table Columns 3" w:semiHidden="1" w:unhideWhenUsed="1"/>
+    <w:lsdException w:name="Table Columns 4" w:semiHidden="1" w:unhideWhenUsed="1"/>
+    <w:lsdException w:name="Table Columns 5" w:semiHidden="1" w:unhideWhenUsed="1"/>
+    <w:lsdException w:name="Table Grid 1" w:semiHidden="1" w:unhideWhenUsed="1"/>
+    <w:lsdException w:name="Table Grid 2" w:semiHidden="1" w:unhideWhenUsed="1"/>
+    <w:lsdException w:name="Table Grid 3" w:semiHidden="1" w:unhideWhenUsed="1"/>
+    <w:lsdException w:name="Table Grid 4" w:semiHidden="1" w:unhideWhenUsed="1"/>
+    <w:lsdException w:name="Table Grid 5" w:semiHidden="1" w:unhideWhenUsed="1"/>
+    <w:lsdException w:name="Table Grid 6" w:semiHidden="1" w:unhideWhenUsed="1"/>
+    <w:lsdException w:name="Table Grid 7" w:semiHidden="1" w:unhideWhenUsed="1"/>
+    <w:lsdException w:name="Table Grid 8" w:semiHidden="1" w:unhideWhenUsed="1"/>
+    <w:lsdException w:name="Table List 1" w:semiHidden="1" w:unhideWhenUsed="1"/>
+    <w:lsdException w:name="Table List 2" w:semiHidden="1" w:unhideWhenUsed="1"/>
+    <w:lsdException w:name="Table List 3" w:semiHidden="1" w:unhideWhenUsed="1"/>
+    <w:lsdException w:name="Table List 4" w:semiHidden="1" w:unhideWhenUsed="1"/>
+    <w:lsdException w:name="Table List 5" w:semiHidden="1" w:unhideWhenUsed="1"/>
+    <w:lsdException w:name="Table List 6" w:semiHidden="1" w:unhideWhenUsed="1"/>
+    <w:lsdException w:name="Table List 7" w:semiHidden="1" w:unhideWhenUsed="1"/>
+    <w:lsdException w:name="Table List 8" w:semiHidden="1" w:unhideWhenUsed="1"/>
+    <w:lsdException w:name="Table 3D effects 1" w:semiHidden="1" w:unhideWhenUsed="1"/>
+    <w:lsdException w:name="Table 3D effects 2" w:semiHidden="1" w:unhideWhenUsed="1"/>
+    <w:lsdException w:name="Table 3D effects 3" w:semiHidden="1" w:unhideWhenUsed="1"/>
+    <w:lsdException w:name="Table Contemporary" w:semiHidden="1" w:unhideWhenUsed="1"/>
+    <w:lsdException w:name="Table Elegant" w:semiHidden="1" w:unhideWhenUsed="1"/>
+    <w:lsdException w:name="Table Professional" w:semiHidden="1" w:unhideWhenUsed="1"/>
+    <w:lsdException w:name="Table Subtle 1" w:semiHidden="1" w:unhideWhenUsed="1"/>
+    <w:lsdException w:name="Table Subtle 2" w:semiHidden="1" w:unhideWhenUsed="1"/>
+    <w:lsdException w:name="Table Web 1" w:semiHidden="1" w:unhideWhenUsed="1"/>
+    <w:lsdException w:name="Table Web 2" w:semiHidden="1" w:unhideWhenUsed="1"/>
+    <w:lsdException w:name="Table Web 3" w:semiHidden="1" w:unhideWhenUsed="1"/>
+    <w:lsdException w:name="Balloon Text" w:semiHidden="1" w:unhideWhenUsed="1"/>
+    <w:lsdException w:name="Table Grid" w:uiPriority="59"/>
+    <w:lsdException w:name="Table Theme" w:semiHidden="1" w:unhideWhenUsed="1"/>
+    <w:lsdException w:name="Placeholder Text" w:semiHidden="1"/>
+    <w:lsdException w:name="No Spacing" w:uiPriority="1" w:qFormat="1"/>
+    <w:lsdException w:name="Light Shading" w:uiPriority="60"/>
+    <w:lsdException w:name="Light List" w:uiPriority="61"/>
+    <w:lsdException w:name="Light Grid" w:uiPriority="62"/>
+    <w:lsdException w:name="Medium Shading 1" w:uiPriority="63"/>
+    <w:lsdException w:name="Medium Shading 2" w:uiPriority="64"/>
+    <w:lsdException w:name="Medium List 1" w:uiPriority="65"/>
+    <w:lsdException w:name="Medium List 2" w:uiPriority="66"/>
+    <w:lsdException w:name="Medium Grid 1" w:uiPriority="67"/>
+    <w:lsdException w:name="Medium Grid 2" w:uiPriority="68"/>
+    <w:lsdException w:name="Medium Grid 3" w:uiPriority="69"/>
+    <w:lsdException w:name="Dark List" w:uiPriority="70"/>
+    <w:lsdException w:name="Colorful Shading" w:uiPriority="71"/>
+    <w:lsdException w:name="Colorful List" w:uiPriority="72"/>
+    <w:lsdException w:name="Colorful Grid" w:uiPriority="73"/>
+    <w:lsdException w:name="Light Shading Accent 1" w:uiPriority="60"/>
+    <w:lsdException w:name="Light List Accent 1" w:uiPriority="61"/>
+    <w:lsdException w:name="Light Grid Accent 1" w:uiPriority="62"/>
+    <w:lsdException w:name="Medium Shading 1 Accent 1" w:uiPriority="63"/>
+    <w:lsdException w:name="Medium Shading 2 Accent 1" w:uiPriority="64"/>
+    <w:lsdException w:name="Medium List 1 Accent 1" w:uiPriority="65"/>
+    <w:lsdException w:name="Revision" w:semiHidden="1"/>
+    <w:lsdException w:name="List Paragraph" w:uiPriority="34" w:qFormat="1"/>
+    <w:lsdException w:name="Quote" w:uiPriority="29" w:qFormat="1"/>
+    <w:lsdException w:name="Intense Quote" w:uiPriority="30" w:qFormat="1"/>
+    <w:lsdException w:name="Medium List 2 Accent 1" w:uiPriority="66"/>
+    <w:lsdException w:name="Medium Grid 1 Accent 1" w:uiPriority="67"/>
+    <w:lsdException w:name="Medium Grid 2 Accent 1" w:uiPriority="68"/>
+    <w:lsdException w:name="Medium Grid 3 Accent 1" w:uiPriority="69"/>
+    <w:lsdException w:name="Dark List Accent 1" w:uiPriority="70"/>
+    <w:lsdException w:name="Colorful Shading Accent 1" w:uiPriority="71"/>
+    <w:lsdException w:name="Colorful List Accent 1" w:uiPriority="72"/>
+    <w:lsdException w:name="Colorful Grid Accent 1" w:uiPriority="73"/>
+    <w:lsdException w:name="Light Shading Accent 2" w:uiPriority="60"/>
+    <w:lsdException w:name="Light List Accent 2" w:uiPriority="61"/>
+    <w:lsdException w:name="Light Grid Accent 2" w:uiPriority="62"/>
+    <w:lsdException w:name="Medium Shading 1 Accent 2" w:uiPriority="63"/>
+    <w:lsdException w:name="Medium Shading 2 Accent 2" w:uiPriority="64"/>
+    <w:lsdException w:name="Medium List 1 Accent 2" w:uiPriority="65"/>
+    <w:lsdException w:name="Medium List 2 Accent 2" w:uiPriority="66"/>
+    <w:lsdException w:name="Medium Grid 1 Accent 2" w:uiPriority="67"/>
+    <w:lsdException w:name="Medium Grid 2 Accent 2" w:uiPriority="68"/>
+    <w:lsdException w:name="Medium Grid 3 Accent 2" w:uiPriority="69"/>
+    <w:lsdException w:name="Dark List Accent 2" w:uiPriority="70"/>
+    <w:lsdException w:name="Colorful Shading Accent 2" w:uiPriority="71"/>
+    <w:lsdException w:name="Colorful List Accent 2" w:uiPriority="72"/>
+    <w:lsdException w:name="Colorful Grid Accent 2" w:uiPriority="73"/>
+    <w:lsdException w:name="Light Shading Accent 3" w:uiPriority="60"/>
+    <w:lsdException w:name="Light List Accent 3" w:uiPriority="61"/>
+    <w:lsdException w:name="Light Grid Accent 3" w:uiPriority="62"/>
+    <w:lsdException w:name="Medium Shading 1 Accent 3" w:uiPriority="63"/>
+    <w:lsdException w:name="Medium Shading 2 Accent 3" w:uiPriority="64"/>
+    <w:lsdException w:name="Medium List 1 Accent 3" w:uiPriority="65"/>
+    <w:lsdException w:name="Medium List 2 Accent 3" w:uiPriority="66"/>
+    <w:lsdException w:name="Medium Grid 1 Accent 3" w:uiPriority="67"/>
+    <w:lsdException w:name="Medium Grid 2 Accent 3" w:uiPriority="68"/>
+    <w:lsdException w:name="Medium Grid 3 Accent 3" w:uiPriority="69"/>
+    <w:lsdException w:name="Dark List Accent 3" w:uiPriority="70"/>
+    <w:lsdException w:name="Colorful Shading Accent 3" w:uiPriority="71"/>
+    <w:lsdException w:name="Colorful List Accent 3" w:uiPriority="72"/>
+    <w:lsdException w:name="Colorful Grid Accent 3" w:uiPriority="73"/>
+    <w:lsdException w:name="Light Shading Accent 4" w:uiPriority="60"/>
+    <w:lsdException w:name="Light List Accent 4" w:uiPriority="61"/>
+    <w:lsdException w:name="Light Grid Accent 4" w:uiPriority="62"/>
+    <w:lsdException w:name="Medium Shading 1 Accent 4" w:uiPriority="63"/>
+    <w:lsdException w:name="Medium Shading 2 Accent 4" w:uiPriority="64"/>
+    <w:lsdException w:name="Medium List 1 Accent 4" w:uiPriority="65"/>
+    <w:lsdException w:name="Medium List 2 Accent 4" w:uiPriority="66"/>
+    <w:lsdException w:name="Medium Grid 1 Accent 4" w:uiPriority="67"/>
+    <w:lsdException w:name="Medium Grid 2 Accent 4" w:uiPriority="68"/>
+    <w:lsdException w:name="Medium Grid 3 Accent 4" w:uiPriority="69"/>
+    <w:lsdException w:name="Dark List Accent 4" w:uiPriority="70"/>
+    <w:lsdException w:name="Colorful Shading Accent 4" w:uiPriority="71"/>
+    <w:lsdException w:name="Colorful List Accent 4" w:uiPriority="72"/>
+    <w:lsdException w:name="Colorful Grid Accent 4" w:uiPriority="73"/>
+    <w:lsdException w:name="Light Shading Accent 5" w:uiPriority="60"/>
+    <w:lsdException w:name="Light List Accent 5" w:uiPriority="61"/>
+    <w:lsdException w:name="Light Grid Accent 5" w:uiPriority="62"/>
+    <w:lsdException w:name="Medium Shading 1 Accent 5" w:uiPriority="63"/>
+    <w:lsdException w:name="Medium Shading 2 Accent 5" w:uiPriority="64"/>
+    <w:lsdException w:name="Medium List 1 Accent 5" w:uiPriority="65"/>
+    <w:lsdException w:name="Medium List 2 Accent 5" w:uiPriority="66"/>
+    <w:lsdException w:name="Medium Grid 1 Accent 5" w:uiPriority="67"/>
+    <w:lsdException w:name="Medium Grid 2 Accent 5" w:uiPriority="68"/>
+    <w:lsdException w:name="Medium Grid 3 Accent 5" w:uiPriority="69"/>
+    <w:lsdException w:name="Dark List Accent 5" w:uiPriority="70"/>
+    <w:lsdException w:name="Colorful Shading Accent 5" w:uiPriority="71"/>
+    <w:lsdException w:name="Colorful List Accent 5" w:uiPriority="72"/>
+    <w:lsdException w:name="Colorful Grid Accent 5" w:uiPriority="73"/>
+    <w:lsdException w:name="Light Shading Accent 6" w:uiPriority="60"/>
+    <w:lsdException w:name="Light List Accent 6" w:uiPriority="61"/>
+    <w:lsdException w:name="Light Grid Accent 6" w:uiPriority="62"/>
+    <w:lsdException w:name="Medium Shading 1 Accent 6" w:uiPriority="63"/>
+    <w:lsdException w:name="Medium Shading 2 Accent 6" w:uiPriority="64"/>
+    <w:lsdException w:name="Medium List 1 Accent 6" w:uiPriority="65"/>
+    <w:lsdException w:name="Medium List 2 Accent 6" w:uiPriority="66"/>
+    <w:lsdException w:name="Medium Grid 1 Accent 6" w:uiPriority="67"/>
+    <w:lsdException w:name="Medium Grid 2 Accent 6" w:uiPriority="68"/>
+    <w:lsdException w:name="Medium Grid 3 Accent 6" w:uiPriority="69"/>
+    <w:lsdException w:name="Dark List Accent 6" w:uiPriority="70"/>
+    <w:lsdException w:name="Colorful Shading Accent 6" w:uiPriority="71"/>
+    <w:lsdException w:name="Colorful List Accent 6" w:uiPriority="72"/>
+    <w:lsdException w:name="Colorful Grid Accent 6" w:uiPriority="73"/>
+    <w:lsdException w:name="Subtle Emphasis" w:uiPriority="19" w:qFormat="1"/>
+    <w:lsdException w:name="Intense Emphasis" w:uiPriority="21" w:qFormat="1"/>
+    <w:lsdException w:name="Subtle Reference" w:uiPriority="31" w:qFormat="1"/>
+    <w:lsdException w:name="Intense Reference" w:uiPriority="32" w:qFormat="1"/>
+    <w:lsdException w:name="Book Title" w:uiPriority="33" w:qFormat="1"/>
+    <w:lsdException w:name="Bibliography" w:semiHidden="1" w:uiPriority="37" w:unhideWhenUsed="1"/>
+    <w:lsdException w:name="TOC Heading" w:semiHidden="1" w:uiPriority="39" w:unhideWhenUsed="1" w:qFormat="1"/>
+    <w:lsdException w:name="Plain Table 1" w:uiPriority="41"/>
+    <w:lsdException w:name="Plain Table 2" w:uiPriority="42"/>
+    <w:lsdException w:name="Plain Table 3" w:uiPriority="43"/>
+    <w:lsdException w:name="Plain Table 4" w:uiPriority="44"/>
+    <w:lsdException w:name="Plain Table 5" w:uiPriority="45"/>
+    <w:lsdException w:name="Grid Table Light" w:uiPriority="40"/>
+    <w:lsdException w:name="Grid Table 1 Light" w:uiPriority="46"/>
+    <w:lsdException w:name="Grid Table 2" w:uiPriority="47"/>
+    <w:lsdException w:name="Grid Table 3" w:uiPriority="48"/>
+    <w:lsdException w:name="Grid Table 4" w:uiPriority="49"/>
+    <w:lsdException w:name="Grid Table 5 Dark" w:uiPriority="50"/>
+    <w:lsdException w:name="Grid Table 6 Colorful" w:uiPriority="51"/>
+    <w:lsdException w:name="Grid Table 7 Colorful" w:uiPriority="52"/>
+    <w:lsdException w:name="Grid Table 1 Light Accent 1" w:uiPriority="46"/>
+    <w:lsdException w:name="Grid Table 2 Accent 1" w:uiPriority="47"/>
+    <w:lsdException w:name="Grid Table 3 Accent 1" w:uiPriority="48"/>
+    <w:lsdException w:name="Grid Table 4 Accent 1" w:uiPriority="49"/>
+    <w:lsdException w:name="Grid Table 5 Dark Accent 1" w:uiPriority="50"/>
+    <w:lsdException w:name="Grid Table 6 Colorful Accent 1" w:uiPriority="51"/>
+    <w:lsdException w:name="Grid Table 7 Colorful Accent 1" w:uiPriority="52"/>
+    <w:lsdException w:name="Grid Table 1 Light Accent 2" w:uiPriority="46"/>
+    <w:lsdException w:name="Grid Table 2 Accent 2" w:uiPriority="47"/>
+    <w:lsdException w:name="Grid Table 3 Accent 2" w:uiPriority="48"/>
+    <w:lsdException w:name="Grid Table 4 Accent 2" w:uiPriority="49"/>
+    <w:lsdException w:name="Grid Table 5 Dark Accent 2" w:uiPriority="50"/>
+    <w:lsdException w:name="Grid Table 6 Colorful Accent 2" w:uiPriority="51"/>
+    <w:lsdException w:name="Grid Table 7 Colorful Accent 2" w:uiPriority="52"/>
+    <w:lsdException w:name="Grid Table 1 Light Accent 3" w:uiPriority="46"/>
+    <w:lsdException w:name="Grid Table 2 Accent 3" w:uiPriority="47"/>
+    <w:lsdException w:name="Grid Table 3 Accent 3" w:uiPriority="48"/>
+    <w:lsdException w:name="Grid Table 4 Accent 3" w:uiPriority="49"/>
+    <w:lsdException w:name="Grid Table 5 Dark Accent 3" w:uiPriority="50"/>
+    <w:lsdException w:name="Grid Table 6 Colorful Accent 3" w:uiPriority="51"/>
+    <w:lsdException w:name="Grid Table 7 Colorful Accent 3" w:uiPriority="52"/>
+    <w:lsdException w:name="Grid Table 1 Light Accent 4" w:uiPriority="46"/>
+    <w:lsdException w:name="Grid Table 2 Accent 4" w:uiPriority="47"/>
+    <w:lsdException w:name="Grid Table 3 Accent 4" w:uiPriority="48"/>
+    <w:lsdException w:name="Grid Table 4 Accent 4" w:uiPriority="49"/>
+    <w:lsdException w:name="Grid Table 5 Dark Accent 4" w:uiPriority="50"/>
+    <w:lsdException w:name="Grid Table 6 Colorful Accent 4" w:uiPriority="51"/>
+    <w:lsdException w:name="Grid Table 7 Colorful Accent 4" w:uiPriority="52"/>
+    <w:lsdException w:name="Grid Table 1 Light Accent 5" w:uiPriority="46"/>
+    <w:lsdException w:name="Grid Table 2 Accent 5" w:uiPriority="47"/>
+    <w:lsdException w:name="Grid Table 3 Accent 5" w:uiPriority="48"/>
+    <w:lsdException w:name="Grid Table 4 Accent 5" w:uiPriority="49"/>
+    <w:lsdException w:name="Grid Table 5 Dark Accent 5" w:uiPriority="50"/>
+    <w:lsdException w:name="Grid Table 6 Colorful Accent 5" w:uiPriority="51"/>
+    <w:lsdException w:name="Grid Table 7 Colorful Accent 5" w:uiPriority="52"/>
+    <w:lsdException w:name="Grid Table 1 Light Accent 6" w:uiPriority="46"/>
+    <w:lsdException w:name="Grid Table 2 Accent 6" w:uiPriority="47"/>
+    <w:lsdException w:name="Grid Table 3 Accent 6" w:uiPriority="48"/>
+    <w:lsdException w:name="Grid Table 4 Accent 6" w:uiPriority="49"/>
+    <w:lsdException w:name="Grid Table 5 Dark Accent 6" w:uiPriority="50"/>
+    <w:lsdException w:name="Grid Table 6 Colorful Accent 6" w:uiPriority="51"/>
+    <w:lsdException w:name="Grid Table 7 Colorful Accent 6" w:uiPriority="52"/>
+    <w:lsdException w:name="List Table 1 Light" w:uiPriority="46"/>
+    <w:lsdException w:name="List Table 2" w:uiPriority="47"/>
+    <w:lsdException w:name="List Table 3" w:uiPriority="48"/>
+    <w:lsdException w:name="List Table 4" w:uiPriority="49"/>
+    <w:lsdException w:name="List Table 5 Dark" w:uiPriority="50"/>
+    <w:lsdException w:name="List Table 6 Colorful" w:uiPriority="51"/>
+    <w:lsdException w:name="List Table 7 Colorful" w:uiPriority="52"/>
+    <w:lsdException w:name="List Table 1 Light Accent 1" w:uiPriority="46"/>
+    <w:lsdException w:name="List Table 2 Accent 1" w:uiPriority="47"/>
+    <w:lsdException w:name="List Table 3 Accent 1" w:uiPriority="48"/>
+    <w:lsdException w:name="List Table 4 Accent 1" w:uiPriority="49"/>
+    <w:lsdException w:name="List Table 5 Dark Accent 1" w:uiPriority="50"/>
+    <w:lsdException w:name="List Table 6 Colorful Accent 1" w:uiPriority="51"/>
+    <w:lsdException w:name="List Table 7 Colorful Accent 1" w:uiPriority="52"/>
+    <w:lsdException w:name="List Table 1 Light Accent 2" w:uiPriority="46"/>
+    <w:lsdException w:name="List Table 2 Accent 2" w:uiPriority="47"/>
+    <w:lsdException w:name="List Table 3 Accent 2" w:uiPriority="48"/>
+    <w:lsdException w:name="List Table 4 Accent 2" w:uiPriority="49"/>
+    <w:lsdException w:name="List Table 5 Dark Accent 2" w:uiPriority="50"/>
+    <w:lsdException w:name="List Table 6 Colorful Accent 2" w:uiPriority="51"/>
+    <w:lsdException w:name="List Table 7 Colorful Accent 2" w:uiPriority="52"/>
+    <w:lsdException w:name="List Table 1 Light Accent 3" w:uiPriority="46"/>
+    <w:lsdException w:name="List Table 2 Accent 3" w:uiPriority="47"/>
+    <w:lsdException w:name="List Table 3 Accent 3" w:uiPriority="48"/>
+    <w:lsdException w:name="List Table 4 Accent 3" w:uiPriority="49"/>
+    <w:lsdException w:name="List Table 5 Dark Accent 3" w:uiPriority="50"/>
+    <w:lsdException w:name="List Table 6 Colorful Accent 3" w:uiPriority="51"/>
+    <w:lsdException w:name="List Table 7 Colorful Accent 3" w:uiPriority="52"/>
+    <w:lsdException w:name="List Table 1 Light Accent 4" w:uiPriority="46"/>
+    <w:lsdException w:name="List Table 2 Accent 4" w:uiPriority="47"/>
+    <w:lsdException w:name="List Table 3 Accent 4" w:uiPriority="48"/>
+    <w:lsdException w:name="List Table 4 Accent 4" w:uiPriority="49"/>
+    <w:lsdException w:name="List Table 5 Dark Accent 4" w:uiPriority="50"/>
+    <w:lsdException w:name="List Table 6 Colorful Accent 4" w:uiPriority="51"/>
+    <w:lsdException w:name="List Table 7 Colorful Accent 4" w:uiPriority="52"/>
+    <w:lsdException w:name="List Table 1 Light Accent 5" w:uiPriority="46"/>
+    <w:lsdException w:name="List Table 2 Accent 5" w:uiPriority="47"/>
+    <w:lsdException w:name="List Table 3 Accent 5" w:uiPriority="48"/>
+    <w:lsdException w:name="List Table 4 Accent 5" w:uiPriority="49"/>
+    <w:lsdException w:name="List Table 5 Dark Accent 5" w:uiPriority="50"/>
+    <w:lsdException w:name="List Table 6 Colorful Accent 5" w:uiPriority="51"/>
+    <w:lsdException w:name="List Table 7 Colorful Accent 5" w:uiPriority="52"/>
+    <w:lsdException w:name="List Table 1 Light Accent 6" w:uiPriority="46"/>
+    <w:lsdException w:name="List Table 2 Accent 6" w:uiPriority="47"/>
+    <w:lsdException w:name="List Table 3 Accent 6" w:uiPriority="48"/>
+    <w:lsdException w:name="List Table 4 Accent 6" w:uiPriority="49"/>
+    <w:lsdException w:name="List Table 5 Dark Accent 6" w:uiPriority="50"/>
+    <w:lsdException w:name="List Table 6 Colorful Accent 6" w:uiPriority="51"/>
+    <w:lsdException w:name="List Table 7 Colorful Accent 6" w:uiPriority="52"/>
+    <w:lsdException w:name="Mention" w:semiHidden="1" w:unhideWhenUsed="1"/>
+    <w:lsdException w:name="Smart Hyperlink" w:semiHidden="1" w:unhideWhenUsed="1"/>
+    <w:lsdException w:name="Hashtag" w:semiHidden="1" w:unhideWhenUsed="1"/>
+    <w:lsdException w:name="Unresolved Mention" w:semiHidden="1" w:unhideWhenUsed="1"/>
+    <w:lsdException w:name="Smart Link" w:semiHidden="1" w:unhideWhenUsed="1"/>
+  </w:latentStyles>
+  <w:style w:type="paragraph" w:default="1" w:styleId="a">
+    <w:name w:val="Normal"/>
+    <w:qFormat/>
+    <w:rsid w:val="003E62B2"/>
+    <w:pPr>
+      <w:suppressAutoHyphens/>
+      <w:spacing w:after="0" w:line="240" w:lineRule="auto"/>
+    </w:pPr>
+    <w:rPr>
+      <w:rFonts w:ascii="Times New Roman" w:eastAsia="Times New Roman" w:hAnsi="Times New Roman" w:cs="Times New Roman"/>
+      <w:sz w:val="24"/>
+      <w:szCs w:val="24"/>
+      <w:lang w:eastAsia="ar-SA"/>
+    </w:rPr>
+  </w:style>
+  <w:style w:type="paragraph" w:styleId="1">
+    <w:name w:val="heading 1"/>
+    <w:basedOn w:val="a"/>
+    <w:next w:val="a"/>
+    <w:link w:val="10"/>
+    <w:qFormat/>
+    <w:rsid w:val="00801299"/>
+    <w:pPr>
+      <w:keepNext/>
+      <w:keepLines/>
+      <w:suppressAutoHyphens w:val="0"/>
+      <w:spacing w:before="480" w:line="276" w:lineRule="auto"/>
+      <w:outlineLvl w:val="0"/>
+    </w:pPr>
+    <w:rPr>
+      <w:rFonts w:ascii="Cambria" w:eastAsia="Calibri" w:hAnsi="Cambria"/>
+      <w:b/>
+      <w:bCs/>
+      <w:color w:val="365F91"/>
+      <w:sz w:val="28"/>
+      <w:szCs w:val="28"/>
+      <w:lang w:eastAsia="en-US"/>
+    </w:rPr>
+  </w:style>
+  <w:style w:type="character" w:default="1" w:styleId="a0">
+    <w:name w:val="Default Paragraph Font"/>
+    <w:uiPriority w:val="1"/>
+    <w:semiHidden/>
+    <w:unhideWhenUsed/>
+  </w:style>
+  <w:style w:type="table" w:default="1" w:styleId="a1">
+    <w:name w:val="Normal Table"/>
+    <w:uiPriority w:val="99"/>
+    <w:semiHidden/>
+    <w:unhideWhenUsed/>
+    <w:tblPr>
+      <w:tblInd w:w="0" w:type="dxa"/>
+      <w:tblCellMar>
+        <w:top w:w="0" w:type="dxa"/>
+        <w:left w:w="108" w:type="dxa"/>
+        <w:bottom w:w="0" w:type="dxa"/>
+        <w:right w:w="108" w:type="dxa"/>
+      </w:tblCellMar>
+    </w:tblPr>
+  </w:style>
+  <w:style w:type="numbering" w:default="1" w:styleId="a2">
+    <w:name w:val="No List"/>
+    <w:uiPriority w:val="99"/>
+    <w:semiHidden/>
+    <w:unhideWhenUsed/>
+  </w:style>
+  <w:style w:type="paragraph" w:styleId="a3">
+    <w:name w:val="No Spacing"/>
+    <w:uiPriority w:val="1"/>
+    <w:qFormat/>
+    <w:rsid w:val="000C5082"/>
+    <w:pPr>
+      <w:suppressAutoHyphens/>
+      <w:spacing w:after="0" w:line="240" w:lineRule="auto"/>
+    </w:pPr>
+    <w:rPr>
+      <w:rFonts w:ascii="Times New Roman" w:eastAsia="Times New Roman" w:hAnsi="Times New Roman" w:cs="Times New Roman"/>
+      <w:sz w:val="24"/>
+      <w:szCs w:val="24"/>
+      <w:lang w:eastAsia="ar-SA"/>
+    </w:rPr>
+  </w:style>
+  <w:style w:type="paragraph" w:styleId="a4">
+    <w:name w:val="Balloon Text"/>
+    <w:basedOn w:val="a"/>
+    <w:link w:val="a5"/>
+    <w:uiPriority w:val="99"/>
+    <w:semiHidden/>
+    <w:unhideWhenUsed/>
+    <w:rsid w:val="000C5082"/>
+    <w:rPr>
+      <w:rFonts w:ascii="Tahoma" w:hAnsi="Tahoma" w:cs="Tahoma"/>
+      <w:sz w:val="16"/>
+      <w:szCs w:val="16"/>
+    </w:rPr>
+  </w:style>
+  <w:style w:type="character" w:customStyle="1" w:styleId="a5">
+    <w:name w:val="Текст выноски Знак"/>
+    <w:basedOn w:val="a0"/>
+    <w:link w:val="a4"/>
+    <w:uiPriority w:val="99"/>
+    <w:semiHidden/>
+    <w:rsid w:val="000C5082"/>
+    <w:rPr>
+      <w:rFonts w:ascii="Tahoma" w:eastAsia="Times New Roman" w:hAnsi="Tahoma" w:cs="Tahoma"/>
+      <w:sz w:val="16"/>
+      <w:szCs w:val="16"/>
+      <w:lang w:eastAsia="ar-SA"/>
+    </w:rPr>
+  </w:style>
+  <w:style w:type="paragraph" w:styleId="a6">
+    <w:name w:val="header"/>
+    <w:basedOn w:val="a"/>
+    <w:link w:val="a7"/>
+    <w:uiPriority w:val="99"/>
+    <w:unhideWhenUsed/>
+    <w:rsid w:val="000C5082"/>
+    <w:pPr>
+      <w:tabs>
+        <w:tab w:val="center" w:pos="4677"/>
+        <w:tab w:val="right" w:pos="9355"/>
+      </w:tabs>
+    </w:pPr>
+  </w:style>
+  <w:style w:type="character" w:customStyle="1" w:styleId="a7">
+    <w:name w:val="Верхний колонтитул Знак"/>
+    <w:basedOn w:val="a0"/>
+    <w:link w:val="a6"/>
+    <w:uiPriority w:val="99"/>
+    <w:rsid w:val="000C5082"/>
+    <w:rPr>
+      <w:rFonts w:ascii="Times New Roman" w:eastAsia="Times New Roman" w:hAnsi="Times New Roman" w:cs="Times New Roman"/>
+      <w:sz w:val="24"/>
+      <w:szCs w:val="24"/>
+      <w:lang w:eastAsia="ar-SA"/>
+    </w:rPr>
+  </w:style>
+  <w:style w:type="paragraph" w:styleId="a8">
+    <w:name w:val="footer"/>
+    <w:basedOn w:val="a"/>
+    <w:link w:val="a9"/>
+    <w:uiPriority w:val="99"/>
+    <w:unhideWhenUsed/>
+    <w:rsid w:val="000C5082"/>
+    <w:pPr>
+      <w:tabs>
+        <w:tab w:val="center" w:pos="4677"/>
+        <w:tab w:val="right" w:pos="9355"/>
+      </w:tabs>
+    </w:pPr>
+  </w:style>
+  <w:style w:type="character" w:customStyle="1" w:styleId="a9">
+    <w:name w:val="Нижний колонтитул Знак"/>
+    <w:basedOn w:val="a0"/>
+    <w:link w:val="a8"/>
+    <w:uiPriority w:val="99"/>
+    <w:rsid w:val="000C5082"/>
+    <w:rPr>
+      <w:rFonts w:ascii="Times New Roman" w:eastAsia="Times New Roman" w:hAnsi="Times New Roman" w:cs="Times New Roman"/>
+      <w:sz w:val="24"/>
+      <w:szCs w:val="24"/>
+      <w:lang w:eastAsia="ar-SA"/>
+    </w:rPr>
+  </w:style>
+  <w:style w:type="paragraph" w:customStyle="1" w:styleId="Default">
+    <w:name w:val="Default"/>
+    <w:rsid w:val="00E069B6"/>
+    <w:pPr>
+      <w:autoSpaceDE w:val="0"/>
+      <w:autoSpaceDN w:val="0"/>
+      <w:adjustRightInd w:val="0"/>
+      <w:spacing w:after="0" w:line="240" w:lineRule="auto"/>
+    </w:pPr>
+    <w:rPr>
+      <w:rFonts w:ascii="Times New Roman" w:hAnsi="Times New Roman" w:cs="Times New Roman"/>
+      <w:color w:val="000000"/>
+      <w:sz w:val="24"/>
+      <w:szCs w:val="24"/>
+    </w:rPr>
+  </w:style>
+  <w:style w:type="character" w:customStyle="1" w:styleId="10">
+    <w:name w:val="Заголовок 1 Знак"/>
+    <w:basedOn w:val="a0"/>
+    <w:link w:val="1"/>
+    <w:rsid w:val="00801299"/>
+    <w:rPr>
+      <w:rFonts w:ascii="Cambria" w:eastAsia="Calibri" w:hAnsi="Cambria" w:cs="Times New Roman"/>
+      <w:b/>
+      <w:bCs/>
+      <w:color w:val="365F91"/>
+      <w:sz w:val="28"/>
+      <w:szCs w:val="28"/>
+    </w:rPr>
+  </w:style>
+  <w:style w:type="paragraph" w:styleId="aa">
+    <w:name w:val="List Paragraph"/>
+    <w:basedOn w:val="a"/>
+    <w:uiPriority w:val="34"/>
+    <w:qFormat/>
+    <w:rsid w:val="00370F84"/>
+    <w:pPr>
+      <w:ind w:left="720"/>
+      <w:contextualSpacing/>
+    </w:pPr>
+  </w:style>
+  <w:style w:type="table" w:styleId="ab">
+    <w:name w:val="Table Grid"/>
+    <w:basedOn w:val="a1"/>
+    <w:uiPriority w:val="59"/>
+    <w:rsid w:val="00DF29F7"/>
+    <w:pPr>
+      <w:spacing w:after="0" w:line="240" w:lineRule="auto"/>
+    </w:pPr>
+    <w:tblPr>
+      <w:tblBorders>
+        <w:top w:val="single" w:sz="4" w:space="0" w:color="auto"/>
+        <w:left w:val="single" w:sz="4" w:space="0" w:color="auto"/>
+        <w:bottom w:val="single" w:sz="4" w:space="0" w:color="auto"/>
+        <w:right w:val="single" w:sz="4" w:space="0" w:color="auto"/>
+        <w:insideH w:val="single" w:sz="4" w:space="0" w:color="auto"/>
+        <w:insideV w:val="single" w:sz="4" w:space="0" w:color="auto"/>
+      </w:tblBorders>
+    </w:tblPr>
+  </w:style>
+  <w:style w:type="character" w:styleId="ac">
+    <w:name w:val="Hyperlink"/>
+    <w:basedOn w:val="a0"/>
+    <w:uiPriority w:val="99"/>
+    <w:semiHidden/>
+    <w:unhideWhenUsed/>
+    <w:rsid w:val="00170DD7"/>
+    <w:rPr>
+      <w:color w:val="0000FF"/>
+      <w:u w:val="single"/>
+    </w:rPr>
+  </w:style>
+  <w:style w:type="character" w:styleId="ad">
+    <w:name w:val="Placeholder Text"/>
+    <w:basedOn w:val="a0"/>
+    <w:uiPriority w:val="99"/>
+    <w:semiHidden/>
+    <w:rsid w:val="00B074FE"/>
+    <w:rPr>
+      <w:color w:val="808080"/>
+    </w:rPr>
+  </w:style>
+</w:styles>
+</file>
+
+<file path=word/theme/theme1.xml><?xml version="1.0" encoding="utf-8"?>
+<a:theme xmlns:a="http://schemas.openxmlformats.org/drawingml/2006/main" name="Тема Office">
+  <a:themeElements>
+    <a:clrScheme name="Стандартная">
+      <a:dk1>
+        <a:sysClr val="windowText" lastClr="000000"/>
+      </a:dk1>
+      <a:lt1>
+        <a:sysClr val="window" lastClr="FFFFFF"/>
+      </a:lt1>
+      <a:dk2>
+        <a:srgbClr val="1F497D"/>
+      </a:dk2>
+      <a:lt2>
+        <a:srgbClr val="EEECE1"/>
+      </a:lt2>
+      <a:accent1>
+        <a:srgbClr val="4F81BD"/>
+      </a:accent1>
+      <a:accent2>
+        <a:srgbClr val="C0504D"/>
+      </a:accent2>
+      <a:accent3>
+        <a:srgbClr val="9BBB59"/>
+      </a:accent3>
+      <a:accent4>
+        <a:srgbClr val="8064A2"/>
+      </a:accent4>
+      <a:accent5>
+        <a:srgbClr val="4BACC6"/>
+      </a:accent5>
+      <a:accent6>
+        <a:srgbClr val="F79646"/>
+      </a:accent6>
+      <a:hlink>
+        <a:srgbClr val="0000FF"/>
+      </a:hlink>
+      <a:folHlink>
+        <a:srgbClr val="800080"/>
+      </a:folHlink>
+    </a:clrScheme>
+    <a:fontScheme name="Стандартная">
+      <a:majorFont>
+        <a:latin typeface="Cambria"/>
+        <a:ea typeface=""/>
+        <a:cs typeface=""/>
+        <a:font script="Jpan" typeface="ＭＳ ゴシック"/>
+        <a:font script="Hang" typeface="맑은 고딕"/>
+        <a:font script="Hans" typeface="宋体"/>
+        <a:font script="Hant" typeface="新細明體"/>
+        <a:font script="Arab" typeface="Times New Roman"/>
+        <a:font script="Hebr" typeface="Times New Roman"/>
+        <a:font script="Thai" typeface="Angsana New"/>
+        <a:font script="Ethi" typeface="Nyala"/>
+        <a:font script="Beng" typeface="Vrinda"/>
+        <a:font script="Gujr" typeface="Shruti"/>
+        <a:font script="Khmr" typeface="MoolBoran"/>
+        <a:font script="Knda" typeface="Tunga"/>
+        <a:font script="Guru" typeface="Raavi"/>
+        <a:font script="Cans" typeface="Euphemia"/>
+        <a:font script="Cher" typeface="Plantagenet Cherokee"/>
+        <a:font script="Yiii" typeface="Microsoft Yi Baiti"/>
+        <a:font script="Tibt" typeface="Microsoft Himalaya"/>
+        <a:font script="Thaa" typeface="MV Boli"/>
+        <a:font script="Deva" typeface="Mangal"/>
+        <a:font script="Telu" typeface="Gautami"/>
+        <a:font script="Taml" typeface="Latha"/>
+        <a:font script="Syrc" typeface="Estrangelo Edessa"/>
+        <a:font script="Orya" typeface="Kalinga"/>
+        <a:font script="Mlym" typeface="Kartika"/>
+        <a:font script="Laoo" typeface="DokChampa"/>
+        <a:font script="Sinh" typeface="Iskoola Pota"/>
+        <a:font script="Mong" typeface="Mongolian Baiti"/>
+        <a:font script="Viet" typeface="Times New Roman"/>
+        <a:font script="Uigh" typeface="Microsoft Uighur"/>
+        <a:font script="Geor" typeface="Sylfaen"/>
+      </a:majorFont>
+      <a:minorFont>
+        <a:latin typeface="Calibri"/>
+        <a:ea typeface=""/>
+        <a:cs typeface=""/>
+        <a:font script="Jpan" typeface="ＭＳ 明朝"/>
+        <a:font script="Hang" typeface="맑은 고딕"/>
+        <a:font script="Hans" typeface="宋体"/>
+        <a:font script="Hant" typeface="新細明體"/>
+        <a:font script="Arab" typeface="Arial"/>
+        <a:font script="Hebr" typeface="Arial"/>
+        <a:font script="Thai" typeface="Cordia New"/>
+        <a:font script="Ethi" typeface="Nyala"/>
+        <a:font script="Beng" typeface="Vrinda"/>
+        <a:font script="Gujr" typeface="Shruti"/>
+        <a:font script="Khmr" typeface="DaunPenh"/>
+        <a:font script="Knda" typeface="Tunga"/>
+        <a:font script="Guru" typeface="Raavi"/>
+        <a:font script="Cans" typeface="Euphemia"/>
+        <a:font script="Cher" typeface="Plantagenet Cherokee"/>
+        <a:font script="Yiii" typeface="Microsoft Yi Baiti"/>
+        <a:font script="Tibt" typeface="Microsoft Himalaya"/>
+        <a:font script="Thaa" typeface="MV Boli"/>
+        <a:font script="Deva" typeface="Mangal"/>
+        <a:font script="Telu" typeface="Gautami"/>
+        <a:font script="Taml" typeface="Latha"/>
+        <a:font script="Syrc" typeface="Estrangelo Edessa"/>
+        <a:font script="Orya" typeface="Kalinga"/>
+        <a:font script="Mlym" typeface="Kartika"/>
+        <a:font script="Laoo" typeface="DokChampa"/>
+        <a:font script="Sinh" typeface="Iskoola Pota"/>
+        <a:font script="Mong" typeface="Mongolian Baiti"/>
+        <a:font script="Viet" typeface="Arial"/>
+        <a:font script="Uigh" typeface="Microsoft Uighur"/>
+        <a:font script="Geor" typeface="Sylfaen"/>
+      </a:minorFont>
+    </a:fontScheme>
+    <a:fmtScheme name="Стандартная">
+      <a:fillStyleLst>
+        <a:solidFill>
+          <a:schemeClr val="phClr"/>
+        </a:solidFill>
+        <a:gradFill rotWithShape="1">
+          <a:gsLst>
+            <a:gs pos="0">
+              <a:schemeClr val="phClr">
+                <a:tint val="50000"/>
+                <a:satMod val="300000"/>
+              </a:schemeClr>
+            </a:gs>
+            <a:gs pos="35000">
+              <a:schemeClr val="phClr">
+                <a:tint val="37000"/>
+                <a:satMod val="300000"/>
+              </a:schemeClr>
+            </a:gs>
+            <a:gs pos="100000">
+              <a:schemeClr val="phClr">
+                <a:tint val="15000"/>
+                <a:satMod val="350000"/>
+              </a:schemeClr>
+            </a:gs>
+          </a:gsLst>
+          <a:lin ang="16200000" scaled="1"/>
+        </a:gradFill>
+        <a:gradFill rotWithShape="1">
+          <a:gsLst>
+            <a:gs pos="0">
+              <a:schemeClr val="phClr">
+                <a:shade val="51000"/>
+                <a:satMod val="130000"/>
+              </a:schemeClr>
+            </a:gs>
+            <a:gs pos="80000">
+              <a:schemeClr val="phClr">
+                <a:shade val="93000"/>
+                <a:satMod val="130000"/>
+              </a:schemeClr>
+            </a:gs>
+            <a:gs pos="100000">
+              <a:schemeClr val="phClr">
+                <a:shade val="94000"/>
+                <a:satMod val="135000"/>
+              </a:schemeClr>
+            </a:gs>
+          </a:gsLst>
+          <a:lin ang="16200000" scaled="0"/>
+        </a:gradFill>
+      </a:fillStyleLst>
+      <a:lnStyleLst>
+        <a:ln w="9525" cap="flat" cmpd="sng" algn="ctr">
+          <a:solidFill>
+            <a:schemeClr val="phClr">
+              <a:shade val="95000"/>
+              <a:satMod val="105000"/>
+            </a:schemeClr>
+          </a:solidFill>
+          <a:prstDash val="solid"/>
+        </a:ln>
+        <a:ln w="25400" cap="flat" cmpd="sng" algn="ctr">
+          <a:solidFill>
+            <a:schemeClr val="phClr"/>
+          </a:solidFill>
+          <a:prstDash val="solid"/>
+        </a:ln>
+        <a:ln w="38100" cap="flat" cmpd="sng" algn="ctr">
+          <a:solidFill>
+            <a:schemeClr val="phClr"/>
+          </a:solidFill>
+          <a:prstDash val="solid"/>
+        </a:ln>
+      </a:lnStyleLst>
+      <a:effectStyleLst>
+        <a:effectStyle>
+          <a:effectLst>
+            <a:outerShdw blurRad="40000" dist="20000" dir="5400000" rotWithShape="0">
+              <a:srgbClr val="000000">
+                <a:alpha val="38000"/>
+              </a:srgbClr>
+            </a:outerShdw>
+          </a:effectLst>
+        </a:effectStyle>
+        <a:effectStyle>
+          <a:effectLst>
+            <a:outerShdw blurRad="40000" dist="23000" dir="5400000" rotWithShape="0">
+              <a:srgbClr val="000000">
+                <a:alpha val="35000"/>
+              </a:srgbClr>
+            </a:outerShdw>
+          </a:effectLst>
+        </a:effectStyle>
+        <a:effectStyle>
+          <a:effectLst>
+            <a:outerShdw blurRad="40000" dist="23000" dir="5400000" rotWithShape="0">
+              <a:srgbClr val="000000">
+                <a:alpha val="35000"/>
+              </a:srgbClr>
+            </a:outerShdw>
+          </a:effectLst>
+          <a:scene3d>
+            <a:camera prst="orthographicFront">
+              <a:rot lat="0" lon="0" rev="0"/>
+            </a:camera>
+            <a:lightRig rig="threePt" dir="t">
+              <a:rot lat="0" lon="0" rev="1200000"/>
+            </a:lightRig>
+          </a:scene3d>
+          <a:sp3d>
+            <a:bevelT w="63500" h="25400"/>
+          </a:sp3d>
+        </a:effectStyle>
+      </a:effectStyleLst>
+      <a:bgFillStyleLst>
+        <a:solidFill>
+          <a:schemeClr val="phClr"/>
+        </a:solidFill>
+        <a:gradFill rotWithShape="1">
+          <a:gsLst>
+            <a:gs pos="0">
+              <a:schemeClr val="phClr">
+                <a:tint val="40000"/>
+                <a:satMod val="350000"/>
+              </a:schemeClr>
+            </a:gs>
+            <a:gs pos="40000">
+              <a:schemeClr val="phClr">
+                <a:tint val="45000"/>
+                <a:shade val="99000"/>
+                <a:satMod val="350000"/>
+              </a:schemeClr>
+            </a:gs>
+            <a:gs pos="100000">
+              <a:schemeClr val="phClr">
+                <a:shade val="20000"/>
+                <a:satMod val="255000"/>
+              </a:schemeClr>
+            </a:gs>
+          </a:gsLst>
+          <a:path path="circle">
+            <a:fillToRect l="50000" t="-80000" r="50000" b="180000"/>
+          </a:path>
+        </a:gradFill>
+        <a:gradFill rotWithShape="1">
+          <a:gsLst>
+            <a:gs pos="0">
+              <a:schemeClr val="phClr">
+                <a:tint val="80000"/>
+                <a:satMod val="300000"/>
+              </a:schemeClr>
+            </a:gs>
+            <a:gs pos="100000">
+              <a:schemeClr val="phClr">
+                <a:shade val="30000"/>
+                <a:satMod val="200000"/>
+              </a:schemeClr>
+            </a:gs>
+          </a:gsLst>
+          <a:path path="circle">
+            <a:fillToRect l="50000" t="50000" r="50000" b="50000"/>
+          </a:path>
+        </a:gradFill>
+      </a:bgFillStyleLst>
+    </a:fmtScheme>
+  </a:themeElements>
+  <a:objectDefaults/>
+  <a:extraClrSchemeLst/>
+</a:theme>
+</file>
+
+<file path=customXml/item1.xml><?xml version="1.0" encoding="utf-8"?>
+<b:Sources xmlns:b="http://schemas.openxmlformats.org/officeDocument/2006/bibliography" xmlns="http://schemas.openxmlformats.org/officeDocument/2006/bibliography" SelectedStyle="\APASixthEditionOfficeOnline.xsl" StyleName="APA" Version="6"/>
+</file>
+
+<file path=customXml/itemProps1.xml><?xml version="1.0" encoding="utf-8"?>
+<ds:datastoreItem xmlns:ds="http://schemas.openxmlformats.org/officeDocument/2006/customXml" ds:itemID="{29C7DE6A-7085-4530-92B7-147FDB9E9EC3}">
+  <ds:schemaRefs>
+    <ds:schemaRef ds:uri="http://schemas.openxmlformats.org/officeDocument/2006/bibliography"/>
+  </ds:schemaRefs>
+</ds:datastoreItem>
 </file>
</xml_diff>

<commit_message>
Update approval sheet template
</commit_message>
<xml_diff>
--- a/backend/templates/approval_sheet.docx
+++ b/backend/templates/approval_sheet.docx
@@ -1,6 +1,6 @@
 
 <file path=word/document.xml><?xml version="1.0" encoding="utf-8"?>
-<w:document xmlns:wpc="http://schemas.microsoft.com/office/word/2010/wordprocessingCanvas" xmlns:cx="http://schemas.microsoft.com/office/drawing/2014/chartex" xmlns:cx1="http://schemas.microsoft.com/office/drawing/2015/9/8/chartex" xmlns:cx2="http://schemas.microsoft.com/office/drawing/2015/10/21/chartex" xmlns:cx3="http://schemas.microsoft.com/office/drawing/2016/5/9/chartex" xmlns:cx4="http://schemas.microsoft.com/office/drawing/2016/5/10/chartex" xmlns:cx5="http://schemas.microsoft.com/office/drawing/2016/5/11/chartex" xmlns:cx6="http://schemas.microsoft.com/office/drawing/2016/5/12/chartex" xmlns:cx7="http://schemas.microsoft.com/office/drawing/2016/5/13/chartex" xmlns:cx8="http://schemas.microsoft.com/office/drawing/2016/5/14/chartex" xmlns:mc="http://schemas.openxmlformats.org/markup-compatibility/2006" xmlns:aink="http://schemas.microsoft.com/office/drawing/2016/ink" xmlns:am3d="http://schemas.microsoft.com/office/drawing/2017/model3d" xmlns:o="urn:schemas-microsoft-com:office:office" xmlns:oel="http://schemas.microsoft.com/office/2019/extlst" xmlns:r="http://schemas.openxmlformats.org/officeDocument/2006/relationships" xmlns:m="http://schemas.openxmlformats.org/officeDocument/2006/math" xmlns:v="urn:schemas-microsoft-com:vml" xmlns:wp14="http://schemas.microsoft.com/office/word/2010/wordprocessingDrawing" xmlns:wp="http://schemas.openxmlformats.org/drawingml/2006/wordprocessingDrawing" xmlns:w10="urn:schemas-microsoft-com:office:word" xmlns:w="http://schemas.openxmlformats.org/wordprocessingml/2006/main" xmlns:w14="http://schemas.microsoft.com/office/word/2010/wordml" xmlns:w15="http://schemas.microsoft.com/office/word/2012/wordml" xmlns:w16cex="http://schemas.microsoft.com/office/word/2018/wordml/cex" xmlns:w16cid="http://schemas.microsoft.com/office/word/2016/wordml/cid" xmlns:w16="http://schemas.microsoft.com/office/word/2018/wordml" xmlns:w16du="http://schemas.microsoft.com/office/word/2023/wordml/word16du" xmlns:w16sdtdh="http://schemas.microsoft.com/office/word/2020/wordml/sdtdatahash" xmlns:w16sdtfl="http://schemas.microsoft.com/office/word/2024/wordml/sdtformatlock" xmlns:w16se="http://schemas.microsoft.com/office/word/2015/wordml/symex" xmlns:wpg="http://schemas.microsoft.com/office/word/2010/wordprocessingGroup" xmlns:wpi="http://schemas.microsoft.com/office/word/2010/wordprocessingInk" xmlns:wne="http://schemas.microsoft.com/office/word/2006/wordml" xmlns:wps="http://schemas.microsoft.com/office/word/2010/wordprocessingShape" mc:Ignorable="w14 w15 w16se w16cid w16 w16cex w16sdtdh w16sdtfl w16du wp14">
+<w:document xmlns:wpc="http://schemas.microsoft.com/office/word/2010/wordprocessingCanvas" xmlns:cx="http://schemas.microsoft.com/office/drawing/2014/chartex" xmlns:cx1="http://schemas.microsoft.com/office/drawing/2015/9/8/chartex" xmlns:cx2="http://schemas.microsoft.com/office/drawing/2015/10/21/chartex" xmlns:cx3="http://schemas.microsoft.com/office/drawing/2016/5/9/chartex" xmlns:cx4="http://schemas.microsoft.com/office/drawing/2016/5/10/chartex" xmlns:cx5="http://schemas.microsoft.com/office/drawing/2016/5/11/chartex" xmlns:cx6="http://schemas.microsoft.com/office/drawing/2016/5/12/chartex" xmlns:cx7="http://schemas.microsoft.com/office/drawing/2016/5/13/chartex" xmlns:cx8="http://schemas.microsoft.com/office/drawing/2016/5/14/chartex" xmlns:mc="http://schemas.openxmlformats.org/markup-compatibility/2006" xmlns:aink="http://schemas.microsoft.com/office/drawing/2016/ink" xmlns:am3d="http://schemas.microsoft.com/office/drawing/2017/model3d" xmlns:o="urn:schemas-microsoft-com:office:office" xmlns:oel="http://schemas.microsoft.com/office/2019/extlst" xmlns:r="http://schemas.openxmlformats.org/officeDocument/2006/relationships" xmlns:m="http://schemas.openxmlformats.org/officeDocument/2006/math" xmlns:v="urn:schemas-microsoft-com:vml" xmlns:wp14="http://schemas.microsoft.com/office/word/2010/wordprocessingDrawing" xmlns:wp="http://schemas.openxmlformats.org/drawingml/2006/wordprocessingDrawing" xmlns:w10="urn:schemas-microsoft-com:office:word" xmlns:w="http://schemas.openxmlformats.org/wordprocessingml/2006/main" xmlns:w14="http://schemas.microsoft.com/office/word/2010/wordml" xmlns:w15="http://schemas.microsoft.com/office/word/2012/wordml" xmlns:w16cex="http://schemas.microsoft.com/office/word/2018/wordml/cex" xmlns:w16cid="http://schemas.microsoft.com/office/word/2016/wordml/cid" xmlns:w16="http://schemas.microsoft.com/office/word/2018/wordml" xmlns:w16sdtdh="http://schemas.microsoft.com/office/word/2020/wordml/sdtdatahash" xmlns:w16se="http://schemas.microsoft.com/office/word/2015/wordml/symex" xmlns:wpg="http://schemas.microsoft.com/office/word/2010/wordprocessingGroup" xmlns:wpi="http://schemas.microsoft.com/office/word/2010/wordprocessingInk" xmlns:wne="http://schemas.microsoft.com/office/word/2006/wordml" xmlns:wps="http://schemas.microsoft.com/office/word/2010/wordprocessingShape" mc:Ignorable="w14 w15 w16se w16cid w16 w16cex w16sdtdh wp14">
   <w:body>
     <w:tbl>
       <w:tblPr>
@@ -575,7 +575,6 @@
                     </w:rPr>
                     <w:t xml:space="preserve"> </w:t>
                   </w:r>
-                  <w:proofErr w:type="gramStart"/>
                   <w:r>
                     <w:rPr>
                       <w:sz w:val="26"/>
@@ -598,38 +597,12 @@
                     </w:rPr>
                     <w:t xml:space="preserve"> </w:t>
                   </w:r>
-                  <w:proofErr w:type="spellStart"/>
                   <w:r>
                     <w:rPr>
                       <w:sz w:val="22"/>
                       <w:lang w:val="en-US"/>
                     </w:rPr>
-                    <w:t>contract</w:t>
-                  </w:r>
-                  <w:proofErr w:type="gramEnd"/>
-                  <w:r>
-                    <w:rPr>
-                      <w:sz w:val="22"/>
-                      <w:lang w:val="en-US"/>
-                    </w:rPr>
-                    <w:t>_number</w:t>
-                  </w:r>
-                  <w:proofErr w:type="spellEnd"/>
-                  <w:proofErr w:type="gramStart"/>
-                  <w:r>
-                    <w:rPr>
-                      <w:sz w:val="22"/>
-                      <w:lang w:val="en-US"/>
-                    </w:rPr>
-                    <w:t xml:space="preserve">}}   </w:t>
-                  </w:r>
-                  <w:proofErr w:type="gramEnd"/>
-                  <w:r>
-                    <w:rPr>
-                      <w:sz w:val="22"/>
-                      <w:lang w:val="en-US"/>
-                    </w:rPr>
-                    <w:t xml:space="preserve">                                    </w:t>
+                    <w:t xml:space="preserve">contract_number}}                                       </w:t>
                   </w:r>
                 </w:p>
               </w:tc>
@@ -692,7 +665,6 @@
               </w:rPr>
               <w:t xml:space="preserve"> </w:t>
             </w:r>
-            <w:proofErr w:type="gramStart"/>
             <w:r>
               <w:rPr>
                 <w:sz w:val="22"/>
@@ -706,29 +678,26 @@
               </w:rPr>
               <w:t xml:space="preserve"> </w:t>
             </w:r>
-            <w:proofErr w:type="spellStart"/>
             <w:r>
               <w:rPr>
                 <w:sz w:val="22"/>
                 <w:lang w:val="en-US"/>
               </w:rPr>
-              <w:t>contract</w:t>
-            </w:r>
-            <w:proofErr w:type="gramEnd"/>
+              <w:t>contract_date</w:t>
+            </w:r>
             <w:r>
               <w:rPr>
                 <w:sz w:val="22"/>
                 <w:lang w:val="en-US"/>
               </w:rPr>
-              <w:t>_date</w:t>
-            </w:r>
-            <w:proofErr w:type="spellEnd"/>
+              <w:t xml:space="preserve"> </w:t>
+            </w:r>
             <w:r>
               <w:rPr>
                 <w:sz w:val="22"/>
                 <w:lang w:val="en-US"/>
               </w:rPr>
-              <w:t xml:space="preserve"> </w:t>
+              <w:t>}}</w:t>
             </w:r>
             <w:r>
               <w:rPr>
@@ -757,46 +726,6 @@
                 <w:sz w:val="22"/>
                 <w:lang w:val="en-US"/>
               </w:rPr>
-              <w:t>}}</w:t>
-            </w:r>
-            <w:r>
-              <w:rPr>
-                <w:rFonts w:eastAsia="TimesNewRomanPSMT"/>
-                <w:b/>
-                <w:bCs/>
-                <w:sz w:val="26"/>
-                <w:szCs w:val="26"/>
-                <w:lang w:val="en-US" w:eastAsia="en-US"/>
-              </w:rPr>
-              <w:t xml:space="preserve"> </w:t>
-            </w:r>
-            <w:r>
-              <w:rPr>
-                <w:rFonts w:eastAsia="TimesNewRomanPSMT"/>
-                <w:b/>
-                <w:bCs/>
-                <w:sz w:val="26"/>
-                <w:szCs w:val="26"/>
-                <w:lang w:eastAsia="en-US"/>
-              </w:rPr>
-              <w:t>г</w:t>
-            </w:r>
-            <w:r>
-              <w:rPr>
-                <w:rFonts w:eastAsia="TimesNewRomanPSMT"/>
-                <w:b/>
-                <w:bCs/>
-                <w:sz w:val="26"/>
-                <w:szCs w:val="26"/>
-                <w:lang w:val="en-US" w:eastAsia="en-US"/>
-              </w:rPr>
-              <w:t>.</w:t>
-            </w:r>
-            <w:r>
-              <w:rPr>
-                <w:sz w:val="22"/>
-                <w:lang w:val="en-US"/>
-              </w:rPr>
               <w:t xml:space="preserve">                                   </w:t>
             </w:r>
           </w:p>
@@ -823,7 +752,7 @@
         <w:rPr>
           <w:noProof/>
           <w:u w:val="single"/>
-          <w:lang w:val="en-US" w:eastAsia="ru-RU"/>
+          <w:lang w:eastAsia="ru-RU"/>
         </w:rPr>
       </w:pPr>
       <w:r>
@@ -845,9 +774,25 @@
         <w:rPr>
           <w:noProof/>
           <w:u w:val="single"/>
+          <w:lang w:eastAsia="ru-RU"/>
+        </w:rPr>
+        <w:t>{</w:t>
+      </w:r>
+      <w:r>
+        <w:rPr>
+          <w:noProof/>
+          <w:u w:val="single"/>
           <w:lang w:val="en-US" w:eastAsia="ru-RU"/>
         </w:rPr>
-        <w:t>{subject}}</w:t>
+        <w:t>subject</w:t>
+      </w:r>
+      <w:r>
+        <w:rPr>
+          <w:noProof/>
+          <w:u w:val="single"/>
+          <w:lang w:eastAsia="ru-RU"/>
+        </w:rPr>
+        <w:t>}}</w:t>
       </w:r>
     </w:p>
     <w:p>
@@ -884,15 +829,7 @@
         <w:t xml:space="preserve"> </w:t>
       </w:r>
       <w:r>
-        <w:t>{{</w:t>
-      </w:r>
-      <w:proofErr w:type="spellStart"/>
-      <w:r>
-        <w:t>purchase_method</w:t>
-      </w:r>
-      <w:proofErr w:type="spellEnd"/>
-      <w:r>
-        <w:t>}}</w:t>
+        <w:t>{{purchase_method}}</w:t>
       </w:r>
     </w:p>
     <w:p>
@@ -1144,21 +1081,7 @@
         <w:rPr>
           <w:sz w:val="20"/>
         </w:rPr>
-        <w:t>{{</w:t>
-      </w:r>
-      <w:proofErr w:type="spellStart"/>
-      <w:r>
-        <w:rPr>
-          <w:sz w:val="20"/>
-        </w:rPr>
-        <w:t>subsidy_name</w:t>
-      </w:r>
-      <w:proofErr w:type="spellEnd"/>
-      <w:r>
-        <w:rPr>
-          <w:sz w:val="20"/>
-        </w:rPr>
-        <w:t>}}</w:t>
+        <w:t>{{subsidy_name}}</w:t>
       </w:r>
     </w:p>
     <w:p>
@@ -1295,8 +1218,6 @@
             <w:pPr>
               <w:jc w:val="center"/>
             </w:pPr>
-            <w:proofErr w:type="spellStart"/>
-            <w:proofErr w:type="gramStart"/>
             <w:r>
               <w:rPr>
                 <w:b/>
@@ -1311,8 +1232,6 @@
               </w:rPr>
               <w:t>,ФИО</w:t>
             </w:r>
-            <w:proofErr w:type="spellEnd"/>
-            <w:proofErr w:type="gramEnd"/>
           </w:p>
         </w:tc>
         <w:tc>
@@ -1419,21 +1338,7 @@
               <w:rPr>
                 <w:sz w:val="18"/>
               </w:rPr>
-              <w:t>{{</w:t>
-            </w:r>
-            <w:proofErr w:type="spellStart"/>
-            <w:r>
-              <w:rPr>
-                <w:sz w:val="18"/>
-              </w:rPr>
-              <w:t>a.num</w:t>
-            </w:r>
-            <w:proofErr w:type="spellEnd"/>
-            <w:r>
-              <w:rPr>
-                <w:sz w:val="18"/>
-              </w:rPr>
-              <w:t>}}</w:t>
+              <w:t>{{a.num}}</w:t>
             </w:r>
           </w:p>
         </w:tc>
@@ -1452,71 +1357,21 @@
                 <w:sz w:val="18"/>
                 <w:lang w:val="en-US"/>
               </w:rPr>
-              <w:t>{{</w:t>
-            </w:r>
-            <w:proofErr w:type="spellStart"/>
-            <w:proofErr w:type="gramStart"/>
+              <w:t>{{a.full_name}}</w:t>
+            </w:r>
             <w:r>
               <w:rPr>
                 <w:sz w:val="18"/>
                 <w:lang w:val="en-US"/>
               </w:rPr>
-              <w:t>a.full</w:t>
-            </w:r>
-            <w:proofErr w:type="gramEnd"/>
+              <w:t xml:space="preserve">, </w:t>
+            </w:r>
             <w:r>
               <w:rPr>
                 <w:sz w:val="18"/>
                 <w:lang w:val="en-US"/>
               </w:rPr>
-              <w:t>_name</w:t>
-            </w:r>
-            <w:proofErr w:type="spellEnd"/>
-            <w:r>
-              <w:rPr>
-                <w:sz w:val="18"/>
-                <w:lang w:val="en-US"/>
-              </w:rPr>
-              <w:t>}}</w:t>
-            </w:r>
-            <w:r>
-              <w:rPr>
-                <w:sz w:val="18"/>
-                <w:lang w:val="en-US"/>
-              </w:rPr>
-              <w:t xml:space="preserve">, </w:t>
-            </w:r>
-            <w:r>
-              <w:rPr>
-                <w:sz w:val="18"/>
-                <w:lang w:val="en-US"/>
-              </w:rPr>
-              <w:t>{{</w:t>
-            </w:r>
-            <w:proofErr w:type="spellStart"/>
-            <w:proofErr w:type="gramStart"/>
-            <w:r>
-              <w:rPr>
-                <w:sz w:val="18"/>
-                <w:lang w:val="en-US"/>
-              </w:rPr>
-              <w:t>a.full</w:t>
-            </w:r>
-            <w:proofErr w:type="gramEnd"/>
-            <w:r>
-              <w:rPr>
-                <w:sz w:val="18"/>
-                <w:lang w:val="en-US"/>
-              </w:rPr>
-              <w:t>_name</w:t>
-            </w:r>
-            <w:proofErr w:type="spellEnd"/>
-            <w:r>
-              <w:rPr>
-                <w:sz w:val="18"/>
-                <w:lang w:val="en-US"/>
-              </w:rPr>
-              <w:t>}}</w:t>
+              <w:t>{{a.full_name}}</w:t>
             </w:r>
           </w:p>
         </w:tc>
@@ -1524,13 +1379,25 @@
           <w:tcPr>
             <w:tcW w:w="1562" w:type="dxa"/>
           </w:tcPr>
-          <w:p/>
+          <w:p>
+            <w:pPr>
+              <w:rPr>
+                <w:lang w:val="en-US"/>
+              </w:rPr>
+            </w:pPr>
+          </w:p>
         </w:tc>
         <w:tc>
           <w:tcPr>
             <w:tcW w:w="4030" w:type="dxa"/>
           </w:tcPr>
-          <w:p/>
+          <w:p>
+            <w:pPr>
+              <w:rPr>
+                <w:lang w:val="en-US"/>
+              </w:rPr>
+            </w:pPr>
+          </w:p>
         </w:tc>
       </w:tr>
       <w:tr>
@@ -1543,35 +1410,7 @@
               <w:rPr>
                 <w:sz w:val="16"/>
               </w:rPr>
-              <w:t>{%</w:t>
-            </w:r>
-            <w:proofErr w:type="spellStart"/>
-            <w:r>
-              <w:rPr>
-                <w:sz w:val="16"/>
-              </w:rPr>
-              <w:t>tr</w:t>
-            </w:r>
-            <w:proofErr w:type="spellEnd"/>
-            <w:r>
-              <w:rPr>
-                <w:sz w:val="16"/>
-              </w:rPr>
-              <w:t xml:space="preserve"> </w:t>
-            </w:r>
-            <w:proofErr w:type="spellStart"/>
-            <w:r>
-              <w:rPr>
-                <w:sz w:val="16"/>
-              </w:rPr>
-              <w:t>endfor</w:t>
-            </w:r>
-            <w:proofErr w:type="spellEnd"/>
-            <w:r>
-              <w:rPr>
-                <w:sz w:val="16"/>
-              </w:rPr>
-              <w:t xml:space="preserve"> %}</w:t>
+              <w:t>{%tr endfor %}</w:t>
             </w:r>
           </w:p>
         </w:tc>
@@ -1622,7 +1461,7 @@
 </file>
 
 <file path=word/endnotes.xml><?xml version="1.0" encoding="utf-8"?>
-<w:endnotes xmlns:wpc="http://schemas.microsoft.com/office/word/2010/wordprocessingCanvas" xmlns:cx="http://schemas.microsoft.com/office/drawing/2014/chartex" xmlns:cx1="http://schemas.microsoft.com/office/drawing/2015/9/8/chartex" xmlns:cx2="http://schemas.microsoft.com/office/drawing/2015/10/21/chartex" xmlns:cx3="http://schemas.microsoft.com/office/drawing/2016/5/9/chartex" xmlns:cx4="http://schemas.microsoft.com/office/drawing/2016/5/10/chartex" xmlns:cx5="http://schemas.microsoft.com/office/drawing/2016/5/11/chartex" xmlns:cx6="http://schemas.microsoft.com/office/drawing/2016/5/12/chartex" xmlns:cx7="http://schemas.microsoft.com/office/drawing/2016/5/13/chartex" xmlns:cx8="http://schemas.microsoft.com/office/drawing/2016/5/14/chartex" xmlns:mc="http://schemas.openxmlformats.org/markup-compatibility/2006" xmlns:aink="http://schemas.microsoft.com/office/drawing/2016/ink" xmlns:am3d="http://schemas.microsoft.com/office/drawing/2017/model3d" xmlns:o="urn:schemas-microsoft-com:office:office" xmlns:oel="http://schemas.microsoft.com/office/2019/extlst" xmlns:r="http://schemas.openxmlformats.org/officeDocument/2006/relationships" xmlns:m="http://schemas.openxmlformats.org/officeDocument/2006/math" xmlns:v="urn:schemas-microsoft-com:vml" xmlns:wp14="http://schemas.microsoft.com/office/word/2010/wordprocessingDrawing" xmlns:wp="http://schemas.openxmlformats.org/drawingml/2006/wordprocessingDrawing" xmlns:w10="urn:schemas-microsoft-com:office:word" xmlns:w="http://schemas.openxmlformats.org/wordprocessingml/2006/main" xmlns:w14="http://schemas.microsoft.com/office/word/2010/wordml" xmlns:w15="http://schemas.microsoft.com/office/word/2012/wordml" xmlns:w16cex="http://schemas.microsoft.com/office/word/2018/wordml/cex" xmlns:w16cid="http://schemas.microsoft.com/office/word/2016/wordml/cid" xmlns:w16="http://schemas.microsoft.com/office/word/2018/wordml" xmlns:w16du="http://schemas.microsoft.com/office/word/2023/wordml/word16du" xmlns:w16sdtdh="http://schemas.microsoft.com/office/word/2020/wordml/sdtdatahash" xmlns:w16sdtfl="http://schemas.microsoft.com/office/word/2024/wordml/sdtformatlock" xmlns:w16se="http://schemas.microsoft.com/office/word/2015/wordml/symex" xmlns:wpg="http://schemas.microsoft.com/office/word/2010/wordprocessingGroup" xmlns:wpi="http://schemas.microsoft.com/office/word/2010/wordprocessingInk" xmlns:wne="http://schemas.microsoft.com/office/word/2006/wordml" xmlns:wps="http://schemas.microsoft.com/office/word/2010/wordprocessingShape" mc:Ignorable="w14 w15 w16se w16cid w16 w16cex w16sdtdh w16sdtfl w16du wp14">
+<w:endnotes xmlns:wpc="http://schemas.microsoft.com/office/word/2010/wordprocessingCanvas" xmlns:cx="http://schemas.microsoft.com/office/drawing/2014/chartex" xmlns:cx1="http://schemas.microsoft.com/office/drawing/2015/9/8/chartex" xmlns:cx2="http://schemas.microsoft.com/office/drawing/2015/10/21/chartex" xmlns:cx3="http://schemas.microsoft.com/office/drawing/2016/5/9/chartex" xmlns:cx4="http://schemas.microsoft.com/office/drawing/2016/5/10/chartex" xmlns:cx5="http://schemas.microsoft.com/office/drawing/2016/5/11/chartex" xmlns:cx6="http://schemas.microsoft.com/office/drawing/2016/5/12/chartex" xmlns:cx7="http://schemas.microsoft.com/office/drawing/2016/5/13/chartex" xmlns:cx8="http://schemas.microsoft.com/office/drawing/2016/5/14/chartex" xmlns:mc="http://schemas.openxmlformats.org/markup-compatibility/2006" xmlns:aink="http://schemas.microsoft.com/office/drawing/2016/ink" xmlns:am3d="http://schemas.microsoft.com/office/drawing/2017/model3d" xmlns:o="urn:schemas-microsoft-com:office:office" xmlns:oel="http://schemas.microsoft.com/office/2019/extlst" xmlns:r="http://schemas.openxmlformats.org/officeDocument/2006/relationships" xmlns:m="http://schemas.openxmlformats.org/officeDocument/2006/math" xmlns:v="urn:schemas-microsoft-com:vml" xmlns:wp14="http://schemas.microsoft.com/office/word/2010/wordprocessingDrawing" xmlns:wp="http://schemas.openxmlformats.org/drawingml/2006/wordprocessingDrawing" xmlns:w10="urn:schemas-microsoft-com:office:word" xmlns:w="http://schemas.openxmlformats.org/wordprocessingml/2006/main" xmlns:w14="http://schemas.microsoft.com/office/word/2010/wordml" xmlns:w15="http://schemas.microsoft.com/office/word/2012/wordml" xmlns:w16cex="http://schemas.microsoft.com/office/word/2018/wordml/cex" xmlns:w16cid="http://schemas.microsoft.com/office/word/2016/wordml/cid" xmlns:w16="http://schemas.microsoft.com/office/word/2018/wordml" xmlns:w16sdtdh="http://schemas.microsoft.com/office/word/2020/wordml/sdtdatahash" xmlns:w16se="http://schemas.microsoft.com/office/word/2015/wordml/symex" xmlns:wpg="http://schemas.microsoft.com/office/word/2010/wordprocessingGroup" xmlns:wpi="http://schemas.microsoft.com/office/word/2010/wordprocessingInk" xmlns:wne="http://schemas.microsoft.com/office/word/2006/wordml" xmlns:wps="http://schemas.microsoft.com/office/word/2010/wordprocessingShape" mc:Ignorable="w14 w15 w16se w16cid w16 w16cex w16sdtdh wp14">
   <w:endnote w:type="separator" w:id="-1">
     <w:p>
       <w:r>
@@ -1641,7 +1480,7 @@
 </file>
 
 <file path=word/footnotes.xml><?xml version="1.0" encoding="utf-8"?>
-<w:footnotes xmlns:wpc="http://schemas.microsoft.com/office/word/2010/wordprocessingCanvas" xmlns:cx="http://schemas.microsoft.com/office/drawing/2014/chartex" xmlns:cx1="http://schemas.microsoft.com/office/drawing/2015/9/8/chartex" xmlns:cx2="http://schemas.microsoft.com/office/drawing/2015/10/21/chartex" xmlns:cx3="http://schemas.microsoft.com/office/drawing/2016/5/9/chartex" xmlns:cx4="http://schemas.microsoft.com/office/drawing/2016/5/10/chartex" xmlns:cx5="http://schemas.microsoft.com/office/drawing/2016/5/11/chartex" xmlns:cx6="http://schemas.microsoft.com/office/drawing/2016/5/12/chartex" xmlns:cx7="http://schemas.microsoft.com/office/drawing/2016/5/13/chartex" xmlns:cx8="http://schemas.microsoft.com/office/drawing/2016/5/14/chartex" xmlns:mc="http://schemas.openxmlformats.org/markup-compatibility/2006" xmlns:aink="http://schemas.microsoft.com/office/drawing/2016/ink" xmlns:am3d="http://schemas.microsoft.com/office/drawing/2017/model3d" xmlns:o="urn:schemas-microsoft-com:office:office" xmlns:oel="http://schemas.microsoft.com/office/2019/extlst" xmlns:r="http://schemas.openxmlformats.org/officeDocument/2006/relationships" xmlns:m="http://schemas.openxmlformats.org/officeDocument/2006/math" xmlns:v="urn:schemas-microsoft-com:vml" xmlns:wp14="http://schemas.microsoft.com/office/word/2010/wordprocessingDrawing" xmlns:wp="http://schemas.openxmlformats.org/drawingml/2006/wordprocessingDrawing" xmlns:w10="urn:schemas-microsoft-com:office:word" xmlns:w="http://schemas.openxmlformats.org/wordprocessingml/2006/main" xmlns:w14="http://schemas.microsoft.com/office/word/2010/wordml" xmlns:w15="http://schemas.microsoft.com/office/word/2012/wordml" xmlns:w16cex="http://schemas.microsoft.com/office/word/2018/wordml/cex" xmlns:w16cid="http://schemas.microsoft.com/office/word/2016/wordml/cid" xmlns:w16="http://schemas.microsoft.com/office/word/2018/wordml" xmlns:w16du="http://schemas.microsoft.com/office/word/2023/wordml/word16du" xmlns:w16sdtdh="http://schemas.microsoft.com/office/word/2020/wordml/sdtdatahash" xmlns:w16sdtfl="http://schemas.microsoft.com/office/word/2024/wordml/sdtformatlock" xmlns:w16se="http://schemas.microsoft.com/office/word/2015/wordml/symex" xmlns:wpg="http://schemas.microsoft.com/office/word/2010/wordprocessingGroup" xmlns:wpi="http://schemas.microsoft.com/office/word/2010/wordprocessingInk" xmlns:wne="http://schemas.microsoft.com/office/word/2006/wordml" xmlns:wps="http://schemas.microsoft.com/office/word/2010/wordprocessingShape" mc:Ignorable="w14 w15 w16se w16cid w16 w16cex w16sdtdh w16sdtfl w16du wp14">
+<w:footnotes xmlns:wpc="http://schemas.microsoft.com/office/word/2010/wordprocessingCanvas" xmlns:cx="http://schemas.microsoft.com/office/drawing/2014/chartex" xmlns:cx1="http://schemas.microsoft.com/office/drawing/2015/9/8/chartex" xmlns:cx2="http://schemas.microsoft.com/office/drawing/2015/10/21/chartex" xmlns:cx3="http://schemas.microsoft.com/office/drawing/2016/5/9/chartex" xmlns:cx4="http://schemas.microsoft.com/office/drawing/2016/5/10/chartex" xmlns:cx5="http://schemas.microsoft.com/office/drawing/2016/5/11/chartex" xmlns:cx6="http://schemas.microsoft.com/office/drawing/2016/5/12/chartex" xmlns:cx7="http://schemas.microsoft.com/office/drawing/2016/5/13/chartex" xmlns:cx8="http://schemas.microsoft.com/office/drawing/2016/5/14/chartex" xmlns:mc="http://schemas.openxmlformats.org/markup-compatibility/2006" xmlns:aink="http://schemas.microsoft.com/office/drawing/2016/ink" xmlns:am3d="http://schemas.microsoft.com/office/drawing/2017/model3d" xmlns:o="urn:schemas-microsoft-com:office:office" xmlns:oel="http://schemas.microsoft.com/office/2019/extlst" xmlns:r="http://schemas.openxmlformats.org/officeDocument/2006/relationships" xmlns:m="http://schemas.openxmlformats.org/officeDocument/2006/math" xmlns:v="urn:schemas-microsoft-com:vml" xmlns:wp14="http://schemas.microsoft.com/office/word/2010/wordprocessingDrawing" xmlns:wp="http://schemas.openxmlformats.org/drawingml/2006/wordprocessingDrawing" xmlns:w10="urn:schemas-microsoft-com:office:word" xmlns:w="http://schemas.openxmlformats.org/wordprocessingml/2006/main" xmlns:w14="http://schemas.microsoft.com/office/word/2010/wordml" xmlns:w15="http://schemas.microsoft.com/office/word/2012/wordml" xmlns:w16cex="http://schemas.microsoft.com/office/word/2018/wordml/cex" xmlns:w16cid="http://schemas.microsoft.com/office/word/2016/wordml/cid" xmlns:w16="http://schemas.microsoft.com/office/word/2018/wordml" xmlns:w16sdtdh="http://schemas.microsoft.com/office/word/2020/wordml/sdtdatahash" xmlns:w16se="http://schemas.microsoft.com/office/word/2015/wordml/symex" xmlns:wpg="http://schemas.microsoft.com/office/word/2010/wordprocessingGroup" xmlns:wpi="http://schemas.microsoft.com/office/word/2010/wordprocessingInk" xmlns:wne="http://schemas.microsoft.com/office/word/2006/wordml" xmlns:wps="http://schemas.microsoft.com/office/word/2010/wordprocessingShape" mc:Ignorable="w14 w15 w16se w16cid w16 w16cex w16sdtdh wp14">
   <w:footnote w:type="separator" w:id="-1">
     <w:p>
       <w:r>
@@ -1660,7 +1499,7 @@
 </file>
 
 <file path=word/header1.xml><?xml version="1.0" encoding="utf-8"?>
-<w:hdr xmlns:wpc="http://schemas.microsoft.com/office/word/2010/wordprocessingCanvas" xmlns:cx="http://schemas.microsoft.com/office/drawing/2014/chartex" xmlns:cx1="http://schemas.microsoft.com/office/drawing/2015/9/8/chartex" xmlns:cx2="http://schemas.microsoft.com/office/drawing/2015/10/21/chartex" xmlns:cx3="http://schemas.microsoft.com/office/drawing/2016/5/9/chartex" xmlns:cx4="http://schemas.microsoft.com/office/drawing/2016/5/10/chartex" xmlns:cx5="http://schemas.microsoft.com/office/drawing/2016/5/11/chartex" xmlns:cx6="http://schemas.microsoft.com/office/drawing/2016/5/12/chartex" xmlns:cx7="http://schemas.microsoft.com/office/drawing/2016/5/13/chartex" xmlns:cx8="http://schemas.microsoft.com/office/drawing/2016/5/14/chartex" xmlns:mc="http://schemas.openxmlformats.org/markup-compatibility/2006" xmlns:aink="http://schemas.microsoft.com/office/drawing/2016/ink" xmlns:am3d="http://schemas.microsoft.com/office/drawing/2017/model3d" xmlns:o="urn:schemas-microsoft-com:office:office" xmlns:oel="http://schemas.microsoft.com/office/2019/extlst" xmlns:r="http://schemas.openxmlformats.org/officeDocument/2006/relationships" xmlns:m="http://schemas.openxmlformats.org/officeDocument/2006/math" xmlns:v="urn:schemas-microsoft-com:vml" xmlns:wp14="http://schemas.microsoft.com/office/word/2010/wordprocessingDrawing" xmlns:wp="http://schemas.openxmlformats.org/drawingml/2006/wordprocessingDrawing" xmlns:w10="urn:schemas-microsoft-com:office:word" xmlns:w="http://schemas.openxmlformats.org/wordprocessingml/2006/main" xmlns:w14="http://schemas.microsoft.com/office/word/2010/wordml" xmlns:w15="http://schemas.microsoft.com/office/word/2012/wordml" xmlns:w16cex="http://schemas.microsoft.com/office/word/2018/wordml/cex" xmlns:w16cid="http://schemas.microsoft.com/office/word/2016/wordml/cid" xmlns:w16="http://schemas.microsoft.com/office/word/2018/wordml" xmlns:w16du="http://schemas.microsoft.com/office/word/2023/wordml/word16du" xmlns:w16sdtdh="http://schemas.microsoft.com/office/word/2020/wordml/sdtdatahash" xmlns:w16sdtfl="http://schemas.microsoft.com/office/word/2024/wordml/sdtformatlock" xmlns:w16se="http://schemas.microsoft.com/office/word/2015/wordml/symex" xmlns:wpg="http://schemas.microsoft.com/office/word/2010/wordprocessingGroup" xmlns:wpi="http://schemas.microsoft.com/office/word/2010/wordprocessingInk" xmlns:wne="http://schemas.microsoft.com/office/word/2006/wordml" xmlns:wps="http://schemas.microsoft.com/office/word/2010/wordprocessingShape" mc:Ignorable="w14 w15 w16se w16cid w16 w16cex w16sdtdh w16sdtfl w16du wp14">
+<w:hdr xmlns:wpc="http://schemas.microsoft.com/office/word/2010/wordprocessingCanvas" xmlns:cx="http://schemas.microsoft.com/office/drawing/2014/chartex" xmlns:cx1="http://schemas.microsoft.com/office/drawing/2015/9/8/chartex" xmlns:cx2="http://schemas.microsoft.com/office/drawing/2015/10/21/chartex" xmlns:cx3="http://schemas.microsoft.com/office/drawing/2016/5/9/chartex" xmlns:cx4="http://schemas.microsoft.com/office/drawing/2016/5/10/chartex" xmlns:cx5="http://schemas.microsoft.com/office/drawing/2016/5/11/chartex" xmlns:cx6="http://schemas.microsoft.com/office/drawing/2016/5/12/chartex" xmlns:cx7="http://schemas.microsoft.com/office/drawing/2016/5/13/chartex" xmlns:cx8="http://schemas.microsoft.com/office/drawing/2016/5/14/chartex" xmlns:mc="http://schemas.openxmlformats.org/markup-compatibility/2006" xmlns:aink="http://schemas.microsoft.com/office/drawing/2016/ink" xmlns:am3d="http://schemas.microsoft.com/office/drawing/2017/model3d" xmlns:o="urn:schemas-microsoft-com:office:office" xmlns:oel="http://schemas.microsoft.com/office/2019/extlst" xmlns:r="http://schemas.openxmlformats.org/officeDocument/2006/relationships" xmlns:m="http://schemas.openxmlformats.org/officeDocument/2006/math" xmlns:v="urn:schemas-microsoft-com:vml" xmlns:wp14="http://schemas.microsoft.com/office/word/2010/wordprocessingDrawing" xmlns:wp="http://schemas.openxmlformats.org/drawingml/2006/wordprocessingDrawing" xmlns:w10="urn:schemas-microsoft-com:office:word" xmlns:w="http://schemas.openxmlformats.org/wordprocessingml/2006/main" xmlns:w14="http://schemas.microsoft.com/office/word/2010/wordml" xmlns:w15="http://schemas.microsoft.com/office/word/2012/wordml" xmlns:w16cex="http://schemas.microsoft.com/office/word/2018/wordml/cex" xmlns:w16cid="http://schemas.microsoft.com/office/word/2016/wordml/cid" xmlns:w16="http://schemas.microsoft.com/office/word/2018/wordml" xmlns:w16sdtdh="http://schemas.microsoft.com/office/word/2020/wordml/sdtdatahash" xmlns:w16se="http://schemas.microsoft.com/office/word/2015/wordml/symex" xmlns:wpg="http://schemas.microsoft.com/office/word/2010/wordprocessingGroup" xmlns:wpi="http://schemas.microsoft.com/office/word/2010/wordprocessingInk" xmlns:wne="http://schemas.microsoft.com/office/word/2006/wordml" xmlns:wps="http://schemas.microsoft.com/office/word/2010/wordprocessingShape" mc:Ignorable="w14 w15 w16se w16cid w16 w16cex w16sdtdh wp14">
   <w:sdt>
     <w:sdtPr>
       <w:id w:val="1226567953"/>
@@ -1705,7 +1544,7 @@
 </file>
 
 <file path=word/numbering.xml><?xml version="1.0" encoding="utf-8"?>
-<w:numbering xmlns:wpc="http://schemas.microsoft.com/office/word/2010/wordprocessingCanvas" xmlns:cx="http://schemas.microsoft.com/office/drawing/2014/chartex" xmlns:cx1="http://schemas.microsoft.com/office/drawing/2015/9/8/chartex" xmlns:cx2="http://schemas.microsoft.com/office/drawing/2015/10/21/chartex" xmlns:cx3="http://schemas.microsoft.com/office/drawing/2016/5/9/chartex" xmlns:cx4="http://schemas.microsoft.com/office/drawing/2016/5/10/chartex" xmlns:cx5="http://schemas.microsoft.com/office/drawing/2016/5/11/chartex" xmlns:cx6="http://schemas.microsoft.com/office/drawing/2016/5/12/chartex" xmlns:cx7="http://schemas.microsoft.com/office/drawing/2016/5/13/chartex" xmlns:cx8="http://schemas.microsoft.com/office/drawing/2016/5/14/chartex" xmlns:mc="http://schemas.openxmlformats.org/markup-compatibility/2006" xmlns:aink="http://schemas.microsoft.com/office/drawing/2016/ink" xmlns:am3d="http://schemas.microsoft.com/office/drawing/2017/model3d" xmlns:o="urn:schemas-microsoft-com:office:office" xmlns:oel="http://schemas.microsoft.com/office/2019/extlst" xmlns:r="http://schemas.openxmlformats.org/officeDocument/2006/relationships" xmlns:m="http://schemas.openxmlformats.org/officeDocument/2006/math" xmlns:v="urn:schemas-microsoft-com:vml" xmlns:wp14="http://schemas.microsoft.com/office/word/2010/wordprocessingDrawing" xmlns:wp="http://schemas.openxmlformats.org/drawingml/2006/wordprocessingDrawing" xmlns:w10="urn:schemas-microsoft-com:office:word" xmlns:w="http://schemas.openxmlformats.org/wordprocessingml/2006/main" xmlns:w14="http://schemas.microsoft.com/office/word/2010/wordml" xmlns:w15="http://schemas.microsoft.com/office/word/2012/wordml" xmlns:w16cex="http://schemas.microsoft.com/office/word/2018/wordml/cex" xmlns:w16cid="http://schemas.microsoft.com/office/word/2016/wordml/cid" xmlns:w16="http://schemas.microsoft.com/office/word/2018/wordml" xmlns:w16du="http://schemas.microsoft.com/office/word/2023/wordml/word16du" xmlns:w16sdtdh="http://schemas.microsoft.com/office/word/2020/wordml/sdtdatahash" xmlns:w16sdtfl="http://schemas.microsoft.com/office/word/2024/wordml/sdtformatlock" xmlns:w16se="http://schemas.microsoft.com/office/word/2015/wordml/symex" xmlns:wpg="http://schemas.microsoft.com/office/word/2010/wordprocessingGroup" xmlns:wpi="http://schemas.microsoft.com/office/word/2010/wordprocessingInk" xmlns:wne="http://schemas.microsoft.com/office/word/2006/wordml" xmlns:wps="http://schemas.microsoft.com/office/word/2010/wordprocessingShape" mc:Ignorable="w14 w15 w16se w16cid w16 w16cex w16sdtdh w16sdtfl w16du wp14">
+<w:numbering xmlns:wpc="http://schemas.microsoft.com/office/word/2010/wordprocessingCanvas" xmlns:cx="http://schemas.microsoft.com/office/drawing/2014/chartex" xmlns:cx1="http://schemas.microsoft.com/office/drawing/2015/9/8/chartex" xmlns:cx2="http://schemas.microsoft.com/office/drawing/2015/10/21/chartex" xmlns:cx3="http://schemas.microsoft.com/office/drawing/2016/5/9/chartex" xmlns:cx4="http://schemas.microsoft.com/office/drawing/2016/5/10/chartex" xmlns:cx5="http://schemas.microsoft.com/office/drawing/2016/5/11/chartex" xmlns:cx6="http://schemas.microsoft.com/office/drawing/2016/5/12/chartex" xmlns:cx7="http://schemas.microsoft.com/office/drawing/2016/5/13/chartex" xmlns:cx8="http://schemas.microsoft.com/office/drawing/2016/5/14/chartex" xmlns:mc="http://schemas.openxmlformats.org/markup-compatibility/2006" xmlns:aink="http://schemas.microsoft.com/office/drawing/2016/ink" xmlns:am3d="http://schemas.microsoft.com/office/drawing/2017/model3d" xmlns:o="urn:schemas-microsoft-com:office:office" xmlns:oel="http://schemas.microsoft.com/office/2019/extlst" xmlns:r="http://schemas.openxmlformats.org/officeDocument/2006/relationships" xmlns:m="http://schemas.openxmlformats.org/officeDocument/2006/math" xmlns:v="urn:schemas-microsoft-com:vml" xmlns:wp14="http://schemas.microsoft.com/office/word/2010/wordprocessingDrawing" xmlns:wp="http://schemas.openxmlformats.org/drawingml/2006/wordprocessingDrawing" xmlns:w10="urn:schemas-microsoft-com:office:word" xmlns:w="http://schemas.openxmlformats.org/wordprocessingml/2006/main" xmlns:w14="http://schemas.microsoft.com/office/word/2010/wordml" xmlns:w15="http://schemas.microsoft.com/office/word/2012/wordml" xmlns:w16cex="http://schemas.microsoft.com/office/word/2018/wordml/cex" xmlns:w16cid="http://schemas.microsoft.com/office/word/2016/wordml/cid" xmlns:w16="http://schemas.microsoft.com/office/word/2018/wordml" xmlns:w16sdtdh="http://schemas.microsoft.com/office/word/2020/wordml/sdtdatahash" xmlns:w16se="http://schemas.microsoft.com/office/word/2015/wordml/symex" xmlns:wpg="http://schemas.microsoft.com/office/word/2010/wordprocessingGroup" xmlns:wpi="http://schemas.microsoft.com/office/word/2010/wordprocessingInk" xmlns:wne="http://schemas.microsoft.com/office/word/2006/wordml" xmlns:wps="http://schemas.microsoft.com/office/word/2010/wordprocessingShape" mc:Ignorable="w14 w15 w16se w16cid w16 w16cex w16sdtdh wp14">
   <w:abstractNum w:abstractNumId="0" w15:restartNumberingAfterBreak="0">
     <w:nsid w:val="0C2A4E2B"/>
     <w:multiLevelType w:val="hybridMultilevel"/>
@@ -2690,7 +2529,7 @@
 </file>
 
 <file path=word/styles.xml><?xml version="1.0" encoding="utf-8"?>
-<w:styles xmlns:mc="http://schemas.openxmlformats.org/markup-compatibility/2006" xmlns:r="http://schemas.openxmlformats.org/officeDocument/2006/relationships" xmlns:w="http://schemas.openxmlformats.org/wordprocessingml/2006/main" xmlns:w14="http://schemas.microsoft.com/office/word/2010/wordml" xmlns:w15="http://schemas.microsoft.com/office/word/2012/wordml" xmlns:w16cex="http://schemas.microsoft.com/office/word/2018/wordml/cex" xmlns:w16cid="http://schemas.microsoft.com/office/word/2016/wordml/cid" xmlns:w16="http://schemas.microsoft.com/office/word/2018/wordml" xmlns:w16du="http://schemas.microsoft.com/office/word/2023/wordml/word16du" xmlns:w16sdtdh="http://schemas.microsoft.com/office/word/2020/wordml/sdtdatahash" xmlns:w16sdtfl="http://schemas.microsoft.com/office/word/2024/wordml/sdtformatlock" xmlns:w16se="http://schemas.microsoft.com/office/word/2015/wordml/symex" mc:Ignorable="w14 w15 w16se w16cid w16 w16cex w16sdtdh w16sdtfl w16du">
+<w:styles xmlns:mc="http://schemas.openxmlformats.org/markup-compatibility/2006" xmlns:r="http://schemas.openxmlformats.org/officeDocument/2006/relationships" xmlns:w="http://schemas.openxmlformats.org/wordprocessingml/2006/main" xmlns:w14="http://schemas.microsoft.com/office/word/2010/wordml" xmlns:w15="http://schemas.microsoft.com/office/word/2012/wordml" xmlns:w16cex="http://schemas.microsoft.com/office/word/2018/wordml/cex" xmlns:w16cid="http://schemas.microsoft.com/office/word/2016/wordml/cid" xmlns:w16="http://schemas.microsoft.com/office/word/2018/wordml" xmlns:w16sdtdh="http://schemas.microsoft.com/office/word/2020/wordml/sdtdatahash" xmlns:w16se="http://schemas.microsoft.com/office/word/2015/wordml/symex" mc:Ignorable="w14 w15 w16se w16cid w16 w16cex w16sdtdh">
   <w:docDefaults>
     <w:rPrDefault>
       <w:rPr>

</xml_diff>